<commit_message>
refactor: align full architecture, diagrams, and docs strictly with canonical operational blueprint
</commit_message>
<xml_diff>
--- a/ATHAR_Master_Software_Operational_Blueprint_AR_Updated.docx
+++ b/ATHAR_Master_Software_Operational_Blueprint_AR_Updated.docx
@@ -2038,38 +2038,9 @@
       </w:pPr>
       <w:r>
         <w:rPr>
-          <w:sz w:val="20"/>
           <w:rtl/>
         </w:rPr>
-        <w:t xml:space="preserve">الفرز عند المصدر مساران: عضوي وجاف. المرفوض وزن مستبعد، لا مسار فرز ثالث منتج للنقاط. الاعتماد النهائي للأوزان وحده ينشئ نقاطاً، وتعتمد المنظومة نمط المحاسبة المالية المزدوجة </w:t>
-      </w:r>
-      <w:r>
-        <w:rPr>
-          <w:noProof/>
-          <w:sz w:val="20"/>
-        </w:rPr>
-        <w:t>(Double‑Entry Points Accounting)</w:t>
-      </w:r>
-      <w:r>
-        <w:rPr>
-          <w:sz w:val="20"/>
-          <w:rtl/>
-        </w:rPr>
-        <w:t xml:space="preserve"> عبر قيود متوازنة </w:t>
-      </w:r>
-      <w:r>
-        <w:rPr>
-          <w:noProof/>
-          <w:sz w:val="20"/>
-        </w:rPr>
-        <w:t>(Debit/Credit)</w:t>
-      </w:r>
-      <w:r>
-        <w:rPr>
-          <w:sz w:val="20"/>
-          <w:rtl/>
-        </w:rPr>
-        <w:t xml:space="preserve"> بين حساب الإصدار وحساب المستفيد وحساب ضمان المتجر، والتصحيحات بقيود عكسية موثقة حصراً لمنع التضخم أو التزييف.</w:t>
+        <w:t>الفرز عند المصدر مساران: عضوي وجاف. المرفوض وزن مستبعد، لا مسار فرز ثالث منتج للنقاط. الاعتماد النهائي للأوزان وحده ينشئ نقاطاً، وتعتمد المنظومة نمط المحاسبة المالية المزدوجة (Double‑Entry Points Accounting) عبر قيود متوازنة (Debit/Credit) بين حساب الإصدار وحساب المستفيد ، والتصحيحات بقيود عكسية موثقة حصراً لمنع التضخم أو التزييف.</w:t>
       </w:r>
     </w:p>
     <w:p>
@@ -2079,94 +2050,9 @@
       </w:pPr>
       <w:r>
         <w:rPr>
-          <w:sz w:val="20"/>
           <w:rtl/>
         </w:rPr>
-        <w:t xml:space="preserve">تعتمد المنظومة نمط الاتصال المباشر بالشبكة كمسار أساسي </w:t>
-      </w:r>
-      <w:r>
-        <w:rPr>
-          <w:noProof/>
-          <w:sz w:val="20"/>
-        </w:rPr>
-        <w:t>(Online‑First Architecture)</w:t>
-      </w:r>
-      <w:r>
-        <w:rPr>
-          <w:sz w:val="20"/>
-          <w:rtl/>
-        </w:rPr>
-        <w:t xml:space="preserve"> مدعومة بمرونة العمل دون اتصال </w:t>
-      </w:r>
-      <w:r>
-        <w:rPr>
-          <w:noProof/>
-          <w:sz w:val="20"/>
-        </w:rPr>
-        <w:t>(Offline Resilience)</w:t>
-      </w:r>
-      <w:r>
-        <w:rPr>
-          <w:sz w:val="20"/>
-          <w:rtl/>
-        </w:rPr>
-        <w:t xml:space="preserve"> والتخزين المؤقت المشفر على العميل. تُحفظ مسودة استبيان الضم اختيارياً في التخزين المحلي للجهاز؛ بينما يتم الإرسال والاعتماد النهائي عبر الشبكة. وفي حالات ضعف أو انقطاع التغطية، يقوم تطبيق العامل بحفظ العمليات محلياً، لتتم مزامنتها تلقائياً عند استعادة الاتصال أو ترحيلها عبر مراجعة المشرف في نهاية الوردية </w:t>
-      </w:r>
-      <w:r>
-        <w:rPr>
-          <w:noProof/>
-          <w:sz w:val="20"/>
-        </w:rPr>
-        <w:t>(End‑of‑day Batch Import)</w:t>
-      </w:r>
-      <w:r>
-        <w:rPr>
-          <w:sz w:val="20"/>
-          <w:rtl/>
-        </w:rPr>
-        <w:t xml:space="preserve">. تُعالج كافة الإشعارات والرسائل النصية والمهام غير المتزامنة عبر نمط صندوق الصادر الموثوق </w:t>
-      </w:r>
-      <w:r>
-        <w:rPr>
-          <w:noProof/>
-          <w:sz w:val="20"/>
-        </w:rPr>
-        <w:t>(Transactional Outbox Pattern)</w:t>
-      </w:r>
-      <w:r>
-        <w:rPr>
-          <w:sz w:val="20"/>
-          <w:rtl/>
-        </w:rPr>
-        <w:t xml:space="preserve"> ومعالجات خلفية </w:t>
-      </w:r>
-      <w:r>
-        <w:rPr>
-          <w:noProof/>
-          <w:sz w:val="20"/>
-        </w:rPr>
-        <w:t>(TypeScript Workers)</w:t>
-      </w:r>
-      <w:r>
-        <w:rPr>
-          <w:sz w:val="20"/>
-          <w:rtl/>
-        </w:rPr>
-        <w:t xml:space="preserve"> مدعومة بـ </w:t>
-      </w:r>
-      <w:r>
-        <w:rPr>
-          <w:noProof/>
-          <w:sz w:val="20"/>
-        </w:rPr>
-        <w:t>(BullMQ / Pg‑Boss)</w:t>
-      </w:r>
-      <w:r>
-        <w:rPr>
-          <w:sz w:val="20"/>
-          <w:rtl/>
-        </w:rPr>
-        <w:t xml:space="preserve"> لضمان عدم ضياع أي مهمة أو إشعار، مع تسوية قيود النقاط خلال مهلة أقصاها 24 ساعة من اعتماد الأوزان.</w:t>
+        <w:t>تعتمد المنظومة نمط الاتصال المباشر بالشبكة كمسار أساسي (Online‑First Architecture) مدعومة بمرونة العمل دون اتصال (Offline Resilience) والتخزين المؤقت المشفر على العميل. تُحفظ مسودة استبيان الضم اختيارياً في التخزين المحلي للجهاز؛ بينما يتم الإرسال والاعتماد النهائي عبر الشبكة. وفي حالات ضعف أو انقطاع التغطية، يقوم تطبيق العامل بحفظ العمليات محلياً، لتتم مزامنتها تلقائياً عند استعادة الاتصال أو ترحيلها عبر مراجعة المشرف في نهاية الوردية (End‑of‑day Batch Import). تُعالج كافة الإشعارات والرسائل النصية والمهام غير المتزامنة عبر نمط طوابير المهام الخلفية الموثوق (Transactional Outbox Pattern) ومعالجات خلفية (TypeScript Workers) مدعومة بـ (BullMQ / Pg‑Boss) لضمان عدم ضياع أي مهمة أو إشعار، مع تسوية قيود النقاط خلال مهلة أقصاها 24 ساعة من اعتماد الأوزان.</w:t>
       </w:r>
     </w:p>
     <w:p>
@@ -3364,80 +3250,9 @@
       </w:pPr>
       <w:r>
         <w:rPr>
-          <w:sz w:val="20"/>
           <w:rtl/>
         </w:rPr>
-        <w:t xml:space="preserve">الوحدات تملك جداولها وعقودها وتنفذ المعاملات العابرة للوحدات داخل قاعدة واحدة. تُدار الرسائل والإشعارات الخارجية عبر نمط صندوق الصادر الموثوق </w:t>
-      </w:r>
-      <w:r>
-        <w:rPr>
-          <w:noProof/>
-          <w:sz w:val="20"/>
-        </w:rPr>
-        <w:t>(Transactional Outbox Pattern)</w:t>
-      </w:r>
-      <w:r>
-        <w:rPr>
-          <w:sz w:val="20"/>
-          <w:rtl/>
-        </w:rPr>
-        <w:t xml:space="preserve"> ومعالجات </w:t>
-      </w:r>
-      <w:r>
-        <w:rPr>
-          <w:noProof/>
-          <w:sz w:val="20"/>
-        </w:rPr>
-        <w:t>(TypeScript Workers)</w:t>
-      </w:r>
-      <w:r>
-        <w:rPr>
-          <w:sz w:val="20"/>
-          <w:rtl/>
-        </w:rPr>
-        <w:t xml:space="preserve">، ويُعتمد سجل </w:t>
-      </w:r>
-      <w:r>
-        <w:rPr>
-          <w:noProof/>
-          <w:sz w:val="20"/>
-        </w:rPr>
-        <w:t>(WorkerTaskDispatch)</w:t>
-      </w:r>
-      <w:r>
-        <w:rPr>
-          <w:sz w:val="20"/>
-          <w:rtl/>
-        </w:rPr>
-        <w:t xml:space="preserve"> لمهلة العامل ومتابعة حالات الإرسال. فشل </w:t>
-      </w:r>
-      <w:r>
-        <w:rPr>
-          <w:noProof/>
-          <w:sz w:val="20"/>
-        </w:rPr>
-        <w:t>(SMS)</w:t>
-      </w:r>
-      <w:r>
-        <w:rPr>
-          <w:sz w:val="20"/>
-          <w:rtl/>
-        </w:rPr>
-        <w:t xml:space="preserve"> أو </w:t>
-      </w:r>
-      <w:r>
-        <w:rPr>
-          <w:noProof/>
-          <w:sz w:val="20"/>
-        </w:rPr>
-        <w:t>(Push)</w:t>
-      </w:r>
-      <w:r>
-        <w:rPr>
-          <w:sz w:val="20"/>
-          <w:rtl/>
-        </w:rPr>
-        <w:t xml:space="preserve"> لا يعكس إسناد المهمة لكنه يطلق إعادة محاولة غير متزامنة وتنبيهاً للمشرف.</w:t>
+        <w:t>الوحدات تملك جداولها وعقودها وتنفذ المعاملات العابرة للوحدات داخل قاعدة واحدة. تُدار الرسائل والإشعارات الخارجية عبر نمط طوابير المهام الخلفية الموثوق (Transactional Outbox Pattern) ومعالجات (TypeScript Workers)، ويُعتمد سجل (WorkerTaskDispatch) لمهلة العامل ومتابعة حالات الإرسال. فشل (SMS) أو (Push) لا يعكس إسناد المهمة لكنه يطلق إعادة محاولة غير متزامنة وتنبيهاً للمشرف.</w:t>
       </w:r>
     </w:p>
     <w:p>
@@ -3467,7 +3282,7 @@
     <w:p>
       <w:pPr>
         <w:bidi/>
-        <w:jc w:val="right"/>
+        <w:jc w:val="center"/>
       </w:pPr>
       <w:r>
         <w:rPr>
@@ -3475,10 +3290,10 @@
           <w:rtl/>
         </w:rPr>
         <w:drawing>
-          <wp:inline distT="0" distB="0" distL="0" distR="0" wp14:anchorId="2D637CDA" wp14:editId="5CB98DE3">
-            <wp:extent cx="5943600" cy="935126"/>
+          <wp:inline distT="0" distB="0" distL="0" distR="0" wp14:anchorId="073A474C" wp14:editId="61CDE348">
+            <wp:extent cx="5943600" cy="10167518"/>
             <wp:effectExtent l="0" t="0" r="0" b="0"/>
-            <wp:docPr id="6" name="Picture 6"/>
+            <wp:docPr id="13" name="Picture 13"/>
             <wp:cNvGraphicFramePr>
               <a:graphicFrameLocks xmlns:a="http://schemas.openxmlformats.org/drawingml/2006/main" noChangeAspect="1"/>
             </wp:cNvGraphicFramePr>
@@ -3486,7 +3301,7 @@
               <a:graphicData uri="http://schemas.openxmlformats.org/drawingml/2006/picture">
                 <pic:pic xmlns:pic="http://schemas.openxmlformats.org/drawingml/2006/picture">
                   <pic:nvPicPr>
-                    <pic:cNvPr id="0" name="mermaid-diagram1.png"/>
+                    <pic:cNvPr id="0" name="image.png"/>
                     <pic:cNvPicPr/>
                   </pic:nvPicPr>
                   <pic:blipFill>
@@ -3498,7 +3313,7 @@
                   <pic:spPr>
                     <a:xfrm>
                       <a:off x="0" y="0"/>
-                      <a:ext cx="5943600" cy="935126"/>
+                      <a:ext cx="5943600" cy="10167518"/>
                     </a:xfrm>
                     <a:prstGeom prst="rect">
                       <a:avLst/>
@@ -3701,14 +3516,7 @@
         <w:rPr>
           <w:rtl/>
         </w:rPr>
-        <w:t xml:space="preserve"> والنسخة الجغرافية والسبب، دون </w:t>
-      </w:r>
-      <w:r>
-        <w:rPr>
-          <w:rtl/>
-        </w:rPr>
-        <w:lastRenderedPageBreak/>
-        <w:t xml:space="preserve">إسناد أو حجز؛ تعرض رسالة «الخدمة غير متوفرة بعد في هذا النطاق، ستتوفر قريباً»، ويمكن طلب الانضمام إلى </w:t>
+        <w:t xml:space="preserve"> والنسخة الجغرافية والسبب، دون إسناد أو حجز؛ تعرض رسالة «الخدمة غير متوفرة بعد في هذا النطاق، ستتوفر قريباً»، ويمكن طلب الانضمام إلى </w:t>
       </w:r>
       <w:r>
         <w:rPr>
@@ -3900,7 +3708,7 @@
     <w:p>
       <w:pPr>
         <w:bidi/>
-        <w:jc w:val="right"/>
+        <w:jc w:val="center"/>
       </w:pPr>
       <w:r>
         <w:rPr>
@@ -3908,10 +3716,10 @@
           <w:rtl/>
         </w:rPr>
         <w:drawing>
-          <wp:inline distT="0" distB="0" distL="0" distR="0" wp14:anchorId="55851D5F" wp14:editId="6EC4B288">
-            <wp:extent cx="5486400" cy="2340864"/>
+          <wp:inline distT="0" distB="0" distL="0" distR="0" wp14:anchorId="32953599" wp14:editId="2135EC66">
+            <wp:extent cx="5943600" cy="4223918"/>
             <wp:effectExtent l="0" t="0" r="0" b="0"/>
-            <wp:docPr id="7" name="Picture 7"/>
+            <wp:docPr id="14" name="Picture 14"/>
             <wp:cNvGraphicFramePr>
               <a:graphicFrameLocks xmlns:a="http://schemas.openxmlformats.org/drawingml/2006/main" noChangeAspect="1"/>
             </wp:cNvGraphicFramePr>
@@ -3919,7 +3727,7 @@
               <a:graphicData uri="http://schemas.openxmlformats.org/drawingml/2006/picture">
                 <pic:pic xmlns:pic="http://schemas.openxmlformats.org/drawingml/2006/picture">
                   <pic:nvPicPr>
-                    <pic:cNvPr id="0" name="mermaid-diagram3.png"/>
+                    <pic:cNvPr id="0" name="image.png"/>
                     <pic:cNvPicPr/>
                   </pic:nvPicPr>
                   <pic:blipFill>
@@ -3931,7 +3739,7 @@
                   <pic:spPr>
                     <a:xfrm>
                       <a:off x="0" y="0"/>
-                      <a:ext cx="5486400" cy="2340864"/>
+                      <a:ext cx="5943600" cy="4223918"/>
                     </a:xfrm>
                     <a:prstGeom prst="rect">
                       <a:avLst/>
@@ -3951,27 +3759,9 @@
       </w:pPr>
       <w:r>
         <w:rPr>
-          <w:i/>
-          <w:color w:val="505A69"/>
           <w:rtl/>
         </w:rPr>
-        <w:t xml:space="preserve">شكل (2): دورة حياة استلام النفايات والوزن الميداني المقترن بالبلوتوث وتوليد قيود القيد المزدوج للنقاط وإشعار المواطن فورياً عبر معالج المهام الخلفية </w:t>
-      </w:r>
-      <w:r>
-        <w:rPr>
-          <w:i/>
-          <w:noProof/>
-          <w:color w:val="505A69"/>
-        </w:rPr>
-        <w:t>(BullMQ)</w:t>
-      </w:r>
-      <w:r>
-        <w:rPr>
-          <w:i/>
-          <w:color w:val="505A69"/>
-          <w:rtl/>
-        </w:rPr>
-        <w:t>.</w:t>
+        <w:t>شكل (2): دورة حياة استلام النفايات والوزن الميداني وتسجيل مرجع الميزان يدوياً وتوليد قيود القيد المزدوج للنقاط وإشعار المواطن فورياً عبر معالج المهام الخلفية (BullMQ).</w:t>
       </w:r>
     </w:p>
     <w:p>
@@ -4034,14 +3824,7 @@
         <w:rPr>
           <w:rtl/>
         </w:rPr>
-        <w:t xml:space="preserve">. يختار وسيلة تحويل مالية معتمدة (مثل خدمة حاسب، المحافظ الإلكترونية، أو الحوالات المصرفية)، ثم يرفق صورة إيصال التحويل والرقم المرجعي للعملية. تعرض البوابة المبلغ الصافي والمهلة الزمنية </w:t>
-      </w:r>
-      <w:r>
-        <w:rPr>
-          <w:rtl/>
-        </w:rPr>
-        <w:lastRenderedPageBreak/>
-        <w:t xml:space="preserve">وتعليمات الحساب المستفيد قبل التحويل. عند إرسال الطلب، يتم حجز كميات المخزون ذرياً </w:t>
+        <w:t xml:space="preserve">. يختار وسيلة تحويل مالية معتمدة (مثل خدمة حاسب، المحافظ الإلكترونية، أو الحوالات المصرفية)، ثم يرفق صورة إيصال التحويل والرقم المرجعي للعملية. تعرض البوابة المبلغ الصافي والمهلة الزمنية وتعليمات الحساب المستفيد قبل التحويل. عند إرسال الطلب، يتم حجز كميات المخزون ذرياً </w:t>
       </w:r>
       <w:r>
         <w:rPr>
@@ -4129,604 +3912,51 @@
       </w:pPr>
       <w:r>
         <w:rPr>
-          <w:sz w:val="20"/>
           <w:rtl/>
         </w:rPr>
-        <w:t>تتكامل بوابة الإدارة والعمليات المركزية (</w:t>
-      </w:r>
-      <w:r>
-        <w:rPr>
-          <w:noProof/>
-          <w:sz w:val="20"/>
-        </w:rPr>
-        <w:t>Back</w:t>
-      </w:r>
-      <w:r>
-        <w:rPr>
-          <w:sz w:val="20"/>
+        <w:t>تتكامل بوابة الإدارة والعمليات المركزية (Back‑Office Web Portal) مع خادم (Node.js) لتمكين الموظفين من إدارة ستة مسارات تشغيلية حاسمة تضمن انضباط العمل الميداني:</w:t>
+      </w:r>
+      <w:r>
+        <w:rPr>
           <w:rtl/>
         </w:rPr>
-        <w:t>‑</w:t>
-      </w:r>
-      <w:r>
-        <w:rPr>
-          <w:noProof/>
-          <w:sz w:val="20"/>
-        </w:rPr>
-        <w:t>Office</w:t>
-      </w:r>
-      <w:r>
-        <w:rPr>
-          <w:sz w:val="20"/>
+        <w:br/>
+        <w:t>1. غرفة المراقبة الميدانية والإسناد الحي (Dispatch Cockpit): تعرض خريطة تفاعلية لمديرية المنصورة مسارات العمال ونقاط الجمع والطلبات المعلقة؛ وتتيح للمشرف إعادة إسناد المهمة يدوياً لعامل بديل في حال تعطل العامل أو انقضاء مهلة الاستجابة (10 دقائق) مع تدوين السبب الإداري إجبارياً في سجل التدقيق.</w:t>
+      </w:r>
+      <w:r>
+        <w:rPr>
           <w:rtl/>
         </w:rPr>
-        <w:t> </w:t>
-      </w:r>
-      <w:r>
-        <w:rPr>
-          <w:noProof/>
-          <w:sz w:val="20"/>
-        </w:rPr>
-        <w:t>Web</w:t>
-      </w:r>
-      <w:r>
-        <w:rPr>
-          <w:sz w:val="20"/>
+        <w:br/>
+        <w:t>2. مركز خدمة العملاء والشكاوى (Customer Service &amp; CRM): توفر شاشة «ملف المستفيد الشامل (Citizen 360 View)» عبر الهاتف الموثق أو الرمز الحسابي (entity_code)، مع إدارة دورة حياة البلاغات الميدانية (IncidentReport) ومراجعة استثناءات الأوزان لبلاغات عدم الحضور أو النزاع على الأوزان، وإمكانية إبطال بطاقة (QR) المفقودة وإصدار بطاقة بديلة فورياً دون المساس بالحساب أو السجل التاريخي.</w:t>
+      </w:r>
+      <w:r>
+        <w:rPr>
           <w:rtl/>
         </w:rPr>
-        <w:t> </w:t>
-      </w:r>
-      <w:r>
-        <w:rPr>
-          <w:noProof/>
-          <w:sz w:val="20"/>
-        </w:rPr>
-        <w:t>Portal</w:t>
-      </w:r>
-      <w:r>
-        <w:rPr>
-          <w:sz w:val="20"/>
+        <w:br/>
+        <w:t>3. إدارة كتالوج المتجر والمستودعات (Store &amp; Inventory Management): تتيح لمسؤول المتجر تسعير السلع بالنقاط وتحديد سقوف الاستبدال، ومراقبة المخزون الفعلي، وفحص إيصالات التحويل البنكي المرفقة للطلبات واعتمادها لإصدار أمر الصرف (Release Order) ومحضر التسليم.</w:t>
+      </w:r>
+      <w:r>
+        <w:rPr>
           <w:rtl/>
         </w:rPr>
-        <w:t xml:space="preserve">) مع خادم </w:t>
-      </w:r>
-      <w:r>
-        <w:rPr>
-          <w:noProof/>
-          <w:sz w:val="20"/>
-        </w:rPr>
-        <w:t>(Node.js)</w:t>
-      </w:r>
-      <w:r>
-        <w:rPr>
-          <w:sz w:val="20"/>
+        <w:br/>
+        <w:t>4. التسويات المالية والرقابة على النقاط (Finance &amp; Reconciliation): مراجعة مطابقة قيود دفتر النقاط المزدوج (Double‑Entry Ledger Audit)، ومراجعة إيرادات مبيعات المتجر وتسليمات المواد للشركاء (PartnerDelivery)، واعتماد ترحيل دفعات نهاية اليوم للعمليات غير المتصلة (FieldBatchImport).</w:t>
+      </w:r>
+      <w:r>
+        <w:rPr>
           <w:rtl/>
         </w:rPr>
-        <w:t xml:space="preserve"> لتمكين الموظفين من إدارة ستة مسارات تشغيلية حاسمة تضمن انضباط العمل الميداني:</w:t>
-      </w:r>
-      <w:r>
-        <w:rPr>
-          <w:sz w:val="20"/>
+        <w:br/>
+        <w:t>5. محرر النطاقات الجغرافية والسياسات (GIS &amp; Policy Management): رسم وتحديث حدود النطاق الجغرافي لمديرية المنصورة وإصدار نسخ جغرافية مؤرخة جديدة (Versioned Geofences)، وتحليل خريطة الطلبات المرفوضة خارج النطاق لتحديد أولويات التوسع.</w:t>
+      </w:r>
+      <w:r>
+        <w:rPr>
           <w:rtl/>
         </w:rPr>
         <w:br/>
-        <w:t>1. غرفة المراقبة الميدانية والإسناد الحي (</w:t>
-      </w:r>
-      <w:r>
-        <w:rPr>
-          <w:noProof/>
-          <w:sz w:val="20"/>
-        </w:rPr>
-        <w:t>Dispatch</w:t>
-      </w:r>
-      <w:r>
-        <w:rPr>
-          <w:sz w:val="20"/>
-          <w:rtl/>
-        </w:rPr>
-        <w:t> </w:t>
-      </w:r>
-      <w:r>
-        <w:rPr>
-          <w:noProof/>
-          <w:sz w:val="20"/>
-        </w:rPr>
-        <w:t>Cockpit</w:t>
-      </w:r>
-      <w:r>
-        <w:rPr>
-          <w:sz w:val="20"/>
-          <w:rtl/>
-        </w:rPr>
-        <w:t>): تعرض خريطة تفاعلية لمديرية المنصورة مسارات العمال ونقاط الجمع والطلبات المعلقة؛ وتتيح للمشرف إعادة إسناد المهمة يدوياً لعامل بديل في حال تعطل العامل أو انقضاء مهلة الاستجابة (10 دقائق) مع تدوين السبب الإداري إجبارياً في سجل التدقيق.</w:t>
-      </w:r>
-      <w:r>
-        <w:rPr>
-          <w:sz w:val="20"/>
-          <w:rtl/>
-        </w:rPr>
-        <w:br/>
-        <w:t>2. مركز خدمة العملاء والشكاوى (</w:t>
-      </w:r>
-      <w:r>
-        <w:rPr>
-          <w:noProof/>
-          <w:sz w:val="20"/>
-        </w:rPr>
-        <w:t>Customer</w:t>
-      </w:r>
-      <w:r>
-        <w:rPr>
-          <w:sz w:val="20"/>
-          <w:rtl/>
-        </w:rPr>
-        <w:t xml:space="preserve"> </w:t>
-      </w:r>
-      <w:r>
-        <w:rPr>
-          <w:noProof/>
-          <w:sz w:val="20"/>
-        </w:rPr>
-        <w:t>Service</w:t>
-      </w:r>
-      <w:r>
-        <w:rPr>
-          <w:sz w:val="20"/>
-          <w:rtl/>
-        </w:rPr>
-        <w:t xml:space="preserve"> &amp; </w:t>
-      </w:r>
-      <w:r>
-        <w:rPr>
-          <w:noProof/>
-          <w:sz w:val="20"/>
-        </w:rPr>
-        <w:t>CRM</w:t>
-      </w:r>
-      <w:r>
-        <w:rPr>
-          <w:sz w:val="20"/>
-          <w:rtl/>
-        </w:rPr>
-        <w:t>): توفر شاشة «ملف المستفيد الشامل (</w:t>
-      </w:r>
-      <w:r>
-        <w:rPr>
-          <w:noProof/>
-          <w:sz w:val="20"/>
-        </w:rPr>
-        <w:t>Citizen</w:t>
-      </w:r>
-      <w:r>
-        <w:rPr>
-          <w:sz w:val="20"/>
-          <w:rtl/>
-        </w:rPr>
-        <w:t> 360 </w:t>
-      </w:r>
-      <w:r>
-        <w:rPr>
-          <w:noProof/>
-          <w:sz w:val="20"/>
-        </w:rPr>
-        <w:t>View</w:t>
-      </w:r>
-      <w:r>
-        <w:rPr>
-          <w:sz w:val="20"/>
-          <w:rtl/>
-        </w:rPr>
-        <w:t xml:space="preserve">)» عبر الهاتف الموثق أو الرمز الحسابي </w:t>
-      </w:r>
-      <w:r>
-        <w:rPr>
-          <w:noProof/>
-          <w:sz w:val="20"/>
-        </w:rPr>
-        <w:t>(entity_code)</w:t>
-      </w:r>
-      <w:r>
-        <w:rPr>
-          <w:sz w:val="20"/>
-          <w:rtl/>
-        </w:rPr>
-        <w:t xml:space="preserve">، مع إدارة دورة حياة تذاكر الشكاوى </w:t>
-      </w:r>
-      <w:r>
-        <w:rPr>
-          <w:noProof/>
-          <w:sz w:val="20"/>
-        </w:rPr>
-        <w:t>(SupportTicket)</w:t>
-      </w:r>
-      <w:r>
-        <w:rPr>
-          <w:sz w:val="20"/>
-          <w:rtl/>
-        </w:rPr>
-        <w:t xml:space="preserve"> لبلاغات عدم الحضور أو النزاع على الأوزان، وإمكانية إبطال بطاقة </w:t>
-      </w:r>
-      <w:r>
-        <w:rPr>
-          <w:noProof/>
-          <w:sz w:val="20"/>
-        </w:rPr>
-        <w:t>(QR)</w:t>
-      </w:r>
-      <w:r>
-        <w:rPr>
-          <w:sz w:val="20"/>
-          <w:rtl/>
-        </w:rPr>
-        <w:t xml:space="preserve"> المفقودة وإصدار بطاقة بديلة فورياً دون المساس بالحساب أو السجل التاريخي.</w:t>
-      </w:r>
-      <w:r>
-        <w:rPr>
-          <w:sz w:val="20"/>
-          <w:rtl/>
-        </w:rPr>
-        <w:br/>
-        <w:t>3. إدارة كتالوج المتجر والمستودعات (</w:t>
-      </w:r>
-      <w:r>
-        <w:rPr>
-          <w:noProof/>
-          <w:sz w:val="20"/>
-        </w:rPr>
-        <w:t>Store</w:t>
-      </w:r>
-      <w:r>
-        <w:rPr>
-          <w:sz w:val="20"/>
-          <w:rtl/>
-        </w:rPr>
-        <w:t xml:space="preserve"> &amp; </w:t>
-      </w:r>
-      <w:r>
-        <w:rPr>
-          <w:noProof/>
-          <w:sz w:val="20"/>
-        </w:rPr>
-        <w:t>Inventory</w:t>
-      </w:r>
-      <w:r>
-        <w:rPr>
-          <w:sz w:val="20"/>
-          <w:rtl/>
-        </w:rPr>
-        <w:t xml:space="preserve"> </w:t>
-      </w:r>
-      <w:r>
-        <w:rPr>
-          <w:noProof/>
-          <w:sz w:val="20"/>
-        </w:rPr>
-        <w:t>Management</w:t>
-      </w:r>
-      <w:r>
-        <w:rPr>
-          <w:sz w:val="20"/>
-          <w:rtl/>
-        </w:rPr>
-        <w:t>): تتيح لمسؤول المتجر تسعير السلع بالنقاط وتحديد سقوف الاستبدال، ومراقبة المخزون الفعلي، وفحص إيصالات التحويل البنكي المرفقة للطلبات واعتمادها لإصدار أمر الصرف (</w:t>
-      </w:r>
-      <w:r>
-        <w:rPr>
-          <w:noProof/>
-          <w:sz w:val="20"/>
-        </w:rPr>
-        <w:t>Release</w:t>
-      </w:r>
-      <w:r>
-        <w:rPr>
-          <w:sz w:val="20"/>
-          <w:rtl/>
-        </w:rPr>
-        <w:t> </w:t>
-      </w:r>
-      <w:r>
-        <w:rPr>
-          <w:noProof/>
-          <w:sz w:val="20"/>
-        </w:rPr>
-        <w:t>Order</w:t>
-      </w:r>
-      <w:r>
-        <w:rPr>
-          <w:sz w:val="20"/>
-          <w:rtl/>
-        </w:rPr>
-        <w:t>) ومحضر التسليم.</w:t>
-      </w:r>
-      <w:r>
-        <w:rPr>
-          <w:sz w:val="20"/>
-          <w:rtl/>
-        </w:rPr>
-        <w:br/>
-        <w:t>4. التسويات المالية والرقابة على النقاط (</w:t>
-      </w:r>
-      <w:r>
-        <w:rPr>
-          <w:noProof/>
-          <w:sz w:val="20"/>
-        </w:rPr>
-        <w:t>Finance</w:t>
-      </w:r>
-      <w:r>
-        <w:rPr>
-          <w:sz w:val="20"/>
-          <w:rtl/>
-        </w:rPr>
-        <w:t xml:space="preserve"> &amp; </w:t>
-      </w:r>
-      <w:r>
-        <w:rPr>
-          <w:noProof/>
-          <w:sz w:val="20"/>
-        </w:rPr>
-        <w:t>Reconciliation</w:t>
-      </w:r>
-      <w:r>
-        <w:rPr>
-          <w:sz w:val="20"/>
-          <w:rtl/>
-        </w:rPr>
-        <w:t>): مراجعة مطابقة قيود دفتر النقاط المزدوج (</w:t>
-      </w:r>
-      <w:r>
-        <w:rPr>
-          <w:noProof/>
-          <w:sz w:val="20"/>
-        </w:rPr>
-        <w:t>Double</w:t>
-      </w:r>
-      <w:r>
-        <w:rPr>
-          <w:sz w:val="20"/>
-          <w:rtl/>
-        </w:rPr>
-        <w:t>‑</w:t>
-      </w:r>
-      <w:r>
-        <w:rPr>
-          <w:noProof/>
-          <w:sz w:val="20"/>
-        </w:rPr>
-        <w:t>Entry</w:t>
-      </w:r>
-      <w:r>
-        <w:rPr>
-          <w:sz w:val="20"/>
-          <w:rtl/>
-        </w:rPr>
-        <w:t> </w:t>
-      </w:r>
-      <w:r>
-        <w:rPr>
-          <w:noProof/>
-          <w:sz w:val="20"/>
-        </w:rPr>
-        <w:t>Ledger</w:t>
-      </w:r>
-      <w:r>
-        <w:rPr>
-          <w:sz w:val="20"/>
-          <w:rtl/>
-        </w:rPr>
-        <w:t> </w:t>
-      </w:r>
-      <w:r>
-        <w:rPr>
-          <w:noProof/>
-          <w:sz w:val="20"/>
-        </w:rPr>
-        <w:t>Audit</w:t>
-      </w:r>
-      <w:r>
-        <w:rPr>
-          <w:sz w:val="20"/>
-          <w:rtl/>
-        </w:rPr>
-        <w:t xml:space="preserve">)، وتصفية مستحقات المتاجر الشريكة دورياً، واعتماد ترحيل دفعات نهاية اليوم للعمليات غير المتصلة </w:t>
-      </w:r>
-      <w:r>
-        <w:rPr>
-          <w:noProof/>
-          <w:sz w:val="20"/>
-        </w:rPr>
-        <w:t>(FieldBatchImport)</w:t>
-      </w:r>
-      <w:r>
-        <w:rPr>
-          <w:sz w:val="20"/>
-          <w:rtl/>
-        </w:rPr>
-        <w:t>.</w:t>
-      </w:r>
-      <w:r>
-        <w:rPr>
-          <w:sz w:val="20"/>
-          <w:rtl/>
-        </w:rPr>
-        <w:br/>
-        <w:t>5. محرر النطاقات الجغرافية والسياسات (</w:t>
-      </w:r>
-      <w:r>
-        <w:rPr>
-          <w:noProof/>
-          <w:sz w:val="20"/>
-        </w:rPr>
-        <w:t>GIS</w:t>
-      </w:r>
-      <w:r>
-        <w:rPr>
-          <w:sz w:val="20"/>
-          <w:rtl/>
-        </w:rPr>
-        <w:t xml:space="preserve"> &amp; </w:t>
-      </w:r>
-      <w:r>
-        <w:rPr>
-          <w:noProof/>
-          <w:sz w:val="20"/>
-        </w:rPr>
-        <w:t>Policy</w:t>
-      </w:r>
-      <w:r>
-        <w:rPr>
-          <w:sz w:val="20"/>
-          <w:rtl/>
-        </w:rPr>
-        <w:t xml:space="preserve"> </w:t>
-      </w:r>
-      <w:r>
-        <w:rPr>
-          <w:noProof/>
-          <w:sz w:val="20"/>
-        </w:rPr>
-        <w:t>Management</w:t>
-      </w:r>
-      <w:r>
-        <w:rPr>
-          <w:sz w:val="20"/>
-          <w:rtl/>
-        </w:rPr>
-        <w:t>): رسم وتحديث حدود النطاق الجغرافي لمديرية المنصورة وإصدار نسخ جغرافية مؤرخة جديدة (</w:t>
-      </w:r>
-      <w:r>
-        <w:rPr>
-          <w:noProof/>
-          <w:sz w:val="20"/>
-        </w:rPr>
-        <w:t>Versioned</w:t>
-      </w:r>
-      <w:r>
-        <w:rPr>
-          <w:sz w:val="20"/>
-          <w:rtl/>
-        </w:rPr>
-        <w:t> </w:t>
-      </w:r>
-      <w:r>
-        <w:rPr>
-          <w:noProof/>
-          <w:sz w:val="20"/>
-        </w:rPr>
-        <w:t>Geofences</w:t>
-      </w:r>
-      <w:r>
-        <w:rPr>
-          <w:sz w:val="20"/>
-          <w:rtl/>
-        </w:rPr>
-        <w:t>)، وتحليل خريطة الطلبات المرفوضة خارج النطاق لتحديد أولويات التوسع.</w:t>
-      </w:r>
-      <w:r>
-        <w:rPr>
-          <w:sz w:val="20"/>
-          <w:rtl/>
-        </w:rPr>
-        <w:br/>
-        <w:t>6. قبة الرقابة والتدقيق والأمان (</w:t>
-      </w:r>
-      <w:r>
-        <w:rPr>
-          <w:noProof/>
-          <w:sz w:val="20"/>
-        </w:rPr>
-        <w:t>Security</w:t>
-      </w:r>
-      <w:r>
-        <w:rPr>
-          <w:sz w:val="20"/>
-          <w:rtl/>
-        </w:rPr>
-        <w:t xml:space="preserve"> &amp; </w:t>
-      </w:r>
-      <w:r>
-        <w:rPr>
-          <w:noProof/>
-          <w:sz w:val="20"/>
-        </w:rPr>
-        <w:t>Audit</w:t>
-      </w:r>
-      <w:r>
-        <w:rPr>
-          <w:sz w:val="20"/>
-          <w:rtl/>
-        </w:rPr>
-        <w:t xml:space="preserve"> </w:t>
-      </w:r>
-      <w:r>
-        <w:rPr>
-          <w:noProof/>
-          <w:sz w:val="20"/>
-        </w:rPr>
-        <w:t>Cockpit</w:t>
-      </w:r>
-      <w:r>
-        <w:rPr>
-          <w:sz w:val="20"/>
-          <w:rtl/>
-        </w:rPr>
-        <w:t>): استعراض سجل التدقيق غير القابل للتعديل (</w:t>
-      </w:r>
-      <w:r>
-        <w:rPr>
-          <w:noProof/>
-          <w:sz w:val="20"/>
-        </w:rPr>
-        <w:t>Immutable</w:t>
-      </w:r>
-      <w:r>
-        <w:rPr>
-          <w:sz w:val="20"/>
-          <w:rtl/>
-        </w:rPr>
-        <w:t> </w:t>
-      </w:r>
-      <w:r>
-        <w:rPr>
-          <w:noProof/>
-          <w:sz w:val="20"/>
-        </w:rPr>
-        <w:t>AuditLog</w:t>
-      </w:r>
-      <w:r>
-        <w:rPr>
-          <w:sz w:val="20"/>
-          <w:rtl/>
-        </w:rPr>
-        <w:t xml:space="preserve">) لكافة إجراءات الموظفين، وإدارة الصلاحيات الدقيقة </w:t>
-      </w:r>
-      <w:r>
-        <w:rPr>
-          <w:noProof/>
-          <w:sz w:val="20"/>
-        </w:rPr>
-        <w:t>(RBAC)</w:t>
-      </w:r>
-      <w:r>
-        <w:rPr>
-          <w:sz w:val="20"/>
-          <w:rtl/>
-        </w:rPr>
-        <w:t xml:space="preserve">، وتفعيل المصادقة الثنائية </w:t>
-      </w:r>
-      <w:r>
-        <w:rPr>
-          <w:noProof/>
-          <w:sz w:val="20"/>
-        </w:rPr>
-        <w:t>(2FA)</w:t>
-      </w:r>
-      <w:r>
-        <w:rPr>
-          <w:sz w:val="20"/>
-          <w:rtl/>
-        </w:rPr>
-        <w:t xml:space="preserve"> لموظفي الإدارة.</w:t>
+        <w:t>6. قبة الرقابة والتدقيق والأمان (Security &amp; Audit Cockpit): استعراض سجل التدقيق غير القابل للتعديل (Immutable AuditLog) لكافة إجراءات الموظفين، وإدارة الصلاحيات الدقيقة (RBAC)، وتفعيل المصادقة الثنائية (2FA) لموظفي الإدارة.</w:t>
       </w:r>
     </w:p>
     <w:p>
@@ -5419,15 +4649,7 @@
                 <w:sz w:val="18"/>
                 <w:rtl/>
               </w:rPr>
-              <w:t xml:space="preserve">لا نقاط على التسجيل أو التوظيف أو إيصال </w:t>
-            </w:r>
-            <w:r>
-              <w:rPr>
-                <w:sz w:val="18"/>
-                <w:rtl/>
-              </w:rPr>
-              <w:lastRenderedPageBreak/>
-              <w:t>دفع غير متحقق.</w:t>
+              <w:t>لا نقاط على التسجيل أو التوظيف أو إيصال دفع غير متحقق.</w:t>
             </w:r>
           </w:p>
         </w:tc>
@@ -5460,7 +4682,6 @@
                 <w:sz w:val="18"/>
                 <w:rtl/>
               </w:rPr>
-              <w:lastRenderedPageBreak/>
               <w:t>استحقاق على وزن معتمد</w:t>
             </w:r>
           </w:p>
@@ -5760,7 +4981,7 @@
     <w:p>
       <w:pPr>
         <w:bidi/>
-        <w:jc w:val="right"/>
+        <w:jc w:val="center"/>
       </w:pPr>
       <w:r>
         <w:rPr>
@@ -5768,10 +4989,10 @@
           <w:rtl/>
         </w:rPr>
         <w:drawing>
-          <wp:inline distT="0" distB="0" distL="0" distR="0" wp14:anchorId="0B01F043" wp14:editId="646B00B2">
-            <wp:extent cx="5943600" cy="1965350"/>
+          <wp:inline distT="0" distB="0" distL="0" distR="0" wp14:anchorId="2CBAD947" wp14:editId="172E3291">
+            <wp:extent cx="5943600" cy="2559710"/>
             <wp:effectExtent l="0" t="0" r="0" b="0"/>
-            <wp:docPr id="8" name="Picture 8"/>
+            <wp:docPr id="15" name="Picture 15"/>
             <wp:cNvGraphicFramePr>
               <a:graphicFrameLocks xmlns:a="http://schemas.openxmlformats.org/drawingml/2006/main" noChangeAspect="1"/>
             </wp:cNvGraphicFramePr>
@@ -5779,7 +5000,7 @@
               <a:graphicData uri="http://schemas.openxmlformats.org/drawingml/2006/picture">
                 <pic:pic xmlns:pic="http://schemas.openxmlformats.org/drawingml/2006/picture">
                   <pic:nvPicPr>
-                    <pic:cNvPr id="0" name="mermaid-diagram2.png"/>
+                    <pic:cNvPr id="0" name="image.png"/>
                     <pic:cNvPicPr/>
                   </pic:nvPicPr>
                   <pic:blipFill>
@@ -5791,7 +5012,7 @@
                   <pic:spPr>
                     <a:xfrm>
                       <a:off x="0" y="0"/>
-                      <a:ext cx="5943600" cy="1965350"/>
+                      <a:ext cx="5943600" cy="2559710"/>
                     </a:xfrm>
                     <a:prstGeom prst="rect">
                       <a:avLst/>
@@ -5857,269 +5078,9 @@
       </w:pPr>
       <w:r>
         <w:rPr>
-          <w:color w:val="24292F"/>
           <w:rtl/>
         </w:rPr>
-        <w:t xml:space="preserve">تتوزع قاعدة بيانات المنظومة على سياقات نطاق وظيفية محكمة </w:t>
-      </w:r>
-      <w:r>
-        <w:rPr>
-          <w:noProof/>
-          <w:color w:val="24292F"/>
-        </w:rPr>
-        <w:t>(Bounded Contexts)</w:t>
-      </w:r>
-      <w:r>
-        <w:rPr>
-          <w:color w:val="24292F"/>
-          <w:rtl/>
-        </w:rPr>
-        <w:t xml:space="preserve"> تشمل: (1) الهوية والمصادقة وجلسات المستخدمين، (2) النطاقات الجغرافية والمربعات السكنية عبر </w:t>
-      </w:r>
-      <w:r>
-        <w:rPr>
-          <w:noProof/>
-          <w:color w:val="24292F"/>
-        </w:rPr>
-        <w:t>PostGIS</w:t>
-      </w:r>
-      <w:r>
-        <w:rPr>
-          <w:color w:val="24292F"/>
-          <w:rtl/>
-        </w:rPr>
-        <w:t xml:space="preserve">، (3) العمليات الميدانية وتصنيفات النفايات والموازين الذكية، (4) نظام القيد المزدوج المتوازن لحسابات النقاط الخضراء </w:t>
-      </w:r>
-      <w:r>
-        <w:rPr>
-          <w:noProof/>
-          <w:color w:val="24292F"/>
-        </w:rPr>
-        <w:t>(Green Points Ledger)</w:t>
-      </w:r>
-      <w:r>
-        <w:rPr>
-          <w:color w:val="24292F"/>
-          <w:rtl/>
-        </w:rPr>
-        <w:t>، (5) منتجات متجر أثر وطلبات الشراء الرقمي بخطوتين مع إثباتات الدفع بالريال اليمني والنقاط (</w:t>
-      </w:r>
-      <w:r>
-        <w:rPr>
-          <w:noProof/>
-          <w:color w:val="24292F"/>
-        </w:rPr>
-        <w:t>Store</w:t>
-      </w:r>
-      <w:r>
-        <w:rPr>
-          <w:color w:val="24292F"/>
-          <w:rtl/>
-        </w:rPr>
-        <w:t xml:space="preserve"> </w:t>
-      </w:r>
-      <w:r>
-        <w:rPr>
-          <w:noProof/>
-          <w:color w:val="24292F"/>
-        </w:rPr>
-        <w:t>Products</w:t>
-      </w:r>
-      <w:r>
-        <w:rPr>
-          <w:color w:val="24292F"/>
-          <w:rtl/>
-        </w:rPr>
-        <w:t xml:space="preserve"> &amp; 2‑</w:t>
-      </w:r>
-      <w:r>
-        <w:rPr>
-          <w:noProof/>
-          <w:color w:val="24292F"/>
-        </w:rPr>
-        <w:t>Step</w:t>
-      </w:r>
-      <w:r>
-        <w:rPr>
-          <w:color w:val="24292F"/>
-          <w:rtl/>
-        </w:rPr>
-        <w:t xml:space="preserve"> </w:t>
-      </w:r>
-      <w:r>
-        <w:rPr>
-          <w:noProof/>
-          <w:color w:val="24292F"/>
-        </w:rPr>
-        <w:t>Orders</w:t>
-      </w:r>
-      <w:r>
-        <w:rPr>
-          <w:color w:val="24292F"/>
-          <w:rtl/>
-        </w:rPr>
-        <w:t xml:space="preserve">)، (6) خدمة العملاء وتذاكر الشكاوى </w:t>
-      </w:r>
-      <w:r>
-        <w:rPr>
-          <w:noProof/>
-          <w:color w:val="24292F"/>
-        </w:rPr>
-        <w:t>(Support Tickets)</w:t>
-      </w:r>
-      <w:r>
-        <w:rPr>
-          <w:color w:val="24292F"/>
-          <w:rtl/>
-        </w:rPr>
-        <w:t xml:space="preserve">، (7) الرقابة وسجلات التدقيق الصارمة غير القابلة للتعديل </w:t>
-      </w:r>
-      <w:r>
-        <w:rPr>
-          <w:noProof/>
-          <w:color w:val="24292F"/>
-        </w:rPr>
-        <w:t>(Audit Logs)</w:t>
-      </w:r>
-      <w:r>
-        <w:rPr>
-          <w:color w:val="24292F"/>
-          <w:rtl/>
-        </w:rPr>
-        <w:t>، (8) معالجة المهام الخلفية غير المتزامنة ومزامنة الدفعات الميدانية (</w:t>
-      </w:r>
-      <w:r>
-        <w:rPr>
-          <w:noProof/>
-          <w:color w:val="24292F"/>
-        </w:rPr>
-        <w:t>Async</w:t>
-      </w:r>
-      <w:r>
-        <w:rPr>
-          <w:color w:val="24292F"/>
-          <w:rtl/>
-        </w:rPr>
-        <w:t xml:space="preserve"> </w:t>
-      </w:r>
-      <w:r>
-        <w:rPr>
-          <w:noProof/>
-          <w:color w:val="24292F"/>
-        </w:rPr>
-        <w:t>Queue</w:t>
-      </w:r>
-      <w:r>
-        <w:rPr>
-          <w:color w:val="24292F"/>
-          <w:rtl/>
-        </w:rPr>
-        <w:t xml:space="preserve"> </w:t>
-      </w:r>
-      <w:r>
-        <w:rPr>
-          <w:noProof/>
-          <w:color w:val="24292F"/>
-        </w:rPr>
-        <w:t>Workers</w:t>
-      </w:r>
-      <w:r>
-        <w:rPr>
-          <w:color w:val="24292F"/>
-          <w:rtl/>
-        </w:rPr>
-        <w:t xml:space="preserve"> &amp; </w:t>
-      </w:r>
-      <w:r>
-        <w:rPr>
-          <w:noProof/>
-          <w:color w:val="24292F"/>
-        </w:rPr>
-        <w:t>Field</w:t>
-      </w:r>
-      <w:r>
-        <w:rPr>
-          <w:color w:val="24292F"/>
-          <w:rtl/>
-        </w:rPr>
-        <w:t xml:space="preserve"> </w:t>
-      </w:r>
-      <w:r>
-        <w:rPr>
-          <w:noProof/>
-          <w:color w:val="24292F"/>
-        </w:rPr>
-        <w:t>Batch</w:t>
-      </w:r>
-      <w:r>
-        <w:rPr>
-          <w:color w:val="24292F"/>
-          <w:rtl/>
-        </w:rPr>
-        <w:t xml:space="preserve"> </w:t>
-      </w:r>
-      <w:r>
-        <w:rPr>
-          <w:noProof/>
-          <w:color w:val="24292F"/>
-        </w:rPr>
-        <w:t>Imports</w:t>
-      </w:r>
-      <w:r>
-        <w:rPr>
-          <w:color w:val="24292F"/>
-          <w:rtl/>
-        </w:rPr>
-        <w:t xml:space="preserve">). يتوفر القاموس التفصيلي الكامل لكافة الجداول والحقول والقيود الفنية على الرابط المباشر في </w:t>
-      </w:r>
-      <w:r>
-        <w:rPr>
-          <w:noProof/>
-          <w:color w:val="24292F"/>
-        </w:rPr>
-        <w:t>GitHub</w:t>
-      </w:r>
-      <w:r>
-        <w:rPr>
-          <w:color w:val="24292F"/>
-          <w:rtl/>
-        </w:rPr>
-        <w:t xml:space="preserve">: </w:t>
-      </w:r>
-      <w:r>
-        <w:rPr>
-          <w:noProof/>
-          <w:color w:val="24292F"/>
-        </w:rPr>
-        <w:t>docs/02</w:t>
-      </w:r>
-      <w:r>
-        <w:rPr>
-          <w:color w:val="24292F"/>
-          <w:rtl/>
-        </w:rPr>
-        <w:t>‑</w:t>
-      </w:r>
-      <w:r>
-        <w:rPr>
-          <w:noProof/>
-          <w:color w:val="24292F"/>
-        </w:rPr>
-        <w:t>database/data</w:t>
-      </w:r>
-      <w:r>
-        <w:rPr>
-          <w:color w:val="24292F"/>
-          <w:rtl/>
-        </w:rPr>
-        <w:t>‑</w:t>
-      </w:r>
-      <w:r>
-        <w:rPr>
-          <w:noProof/>
-          <w:color w:val="24292F"/>
-        </w:rPr>
-        <w:t>dictionary.md.</w:t>
+        <w:t>تتوزع قاعدة بيانات المنظومة على سياقات نطاق وظيفية محكمة (Bounded Contexts) تشمل: (1) الهوية والمصادقة وجلسات المستخدمين، (2) النطاقات الجغرافية والمربعات السكنية عبر PostGIS، (3) العمليات الميدانية وتصنيفات النفايات والزيارات وبنود الأوزان (عضوي، جاف، مرفوض)، (4) نظام القيد المزدوج المتوازن لحسابات النقاط الخضراء (Green Points Ledger)، (5) منتجات متجر أثر وطلبات الشراء الرقمي بخطوتين مع إثباتات الدفع بالريال اليمني والنقاط (Store Products &amp; 2‑Step Orders)، (6) البلاغات الميدانية وإدارة الاستثناءات (Support Tickets)، (7) الرقابة وسجلات التدقيق الصارمة غير القابلة للتعديل (Audit Logs)، (8) معالجة المهام الخلفية غير المتزامنة ومزامنة الدفعات الميدانية (Async Queue Workers &amp; Field Batch Imports). يتوفر القاموس التفصيلي الكامل لكافة الجداول والحقول والقيود الفنية على الرابط المباشر في GitHub: docs/02‑database/data‑dictionary.md.</w:t>
       </w:r>
     </w:p>
     <w:p>
@@ -6197,7 +5158,6 @@
                 <w:sz w:val="19"/>
                 <w:rtl/>
               </w:rPr>
-              <w:lastRenderedPageBreak/>
               <w:t>النتيجة</w:t>
             </w:r>
           </w:p>
@@ -8236,15 +7196,13 @@
           <w:p>
             <w:pPr>
               <w:bidi/>
-              <w:spacing w:after="0" w:line="252" w:lineRule="auto"/>
-              <w:jc w:val="right"/>
-            </w:pPr>
-            <w:r>
-              <w:rPr>
-                <w:sz w:val="18"/>
-                <w:rtl/>
-              </w:rPr>
-              <w:t>قائمة تذاكر الشكاوى وبيانات المواطن المرتبطة</w:t>
+              <w:jc w:val="right"/>
+            </w:pPr>
+            <w:r>
+              <w:rPr>
+                <w:rtl/>
+              </w:rPr>
+              <w:t>قائمة البلاغات الميدانية واستثناءات الأوزان وبيانات المواطن المرتبطة</w:t>
             </w:r>
           </w:p>
         </w:tc>
@@ -8269,15 +7227,19 @@
           <w:p>
             <w:pPr>
               <w:bidi/>
-              <w:spacing w:after="0" w:line="252" w:lineRule="auto"/>
-              <w:jc w:val="right"/>
-            </w:pPr>
-            <w:r>
-              <w:rPr>
-                <w:sz w:val="18"/>
-                <w:rtl/>
-              </w:rPr>
-              <w:t>حالة التذكرة والفئة والتاريخ</w:t>
+              <w:jc w:val="right"/>
+            </w:pPr>
+            <w:r>
+              <w:rPr>
+                <w:rtl/>
+              </w:rPr>
+              <w:t xml:space="preserve">حالة البلاغ </w:t>
+            </w:r>
+            <w:r>
+              <w:rPr>
+                <w:rtl/>
+              </w:rPr>
+              <w:t>والفئة والتاريخ</w:t>
             </w:r>
           </w:p>
         </w:tc>
@@ -8335,29 +7297,13 @@
           <w:p>
             <w:pPr>
               <w:bidi/>
-              <w:spacing w:after="0" w:line="252" w:lineRule="auto"/>
               <w:jc w:val="right"/>
             </w:pPr>
             <w:r>
               <w:rPr>
                 <w:noProof/>
-                <w:sz w:val="18"/>
-              </w:rPr>
-              <w:t>GET</w:t>
-            </w:r>
-            <w:r>
-              <w:rPr>
-                <w:sz w:val="18"/>
-                <w:rtl/>
-              </w:rPr>
-              <w:t xml:space="preserve"> </w:t>
-            </w:r>
-            <w:r>
-              <w:rPr>
-                <w:noProof/>
-                <w:sz w:val="18"/>
-              </w:rPr>
-              <w:t>/v1/admin/tickets</w:t>
+              </w:rPr>
+              <w:t>GET /v1/admin/incidents</w:t>
             </w:r>
           </w:p>
         </w:tc>
@@ -8387,15 +7333,13 @@
           <w:p>
             <w:pPr>
               <w:bidi/>
-              <w:spacing w:after="0" w:line="252" w:lineRule="auto"/>
-              <w:jc w:val="right"/>
-            </w:pPr>
-            <w:r>
-              <w:rPr>
-                <w:sz w:val="18"/>
-                <w:rtl/>
-              </w:rPr>
-              <w:t>إغلاق التذكرة وتدوين المعالجة وإشعار المواطن</w:t>
+              <w:jc w:val="right"/>
+            </w:pPr>
+            <w:r>
+              <w:rPr>
+                <w:rtl/>
+              </w:rPr>
+              <w:t>إغلاق البلاغ وتدوين المعالجة وإشعار المواطن</w:t>
             </w:r>
           </w:p>
         </w:tc>
@@ -8486,57 +7430,13 @@
           <w:p>
             <w:pPr>
               <w:bidi/>
-              <w:spacing w:after="0" w:line="252" w:lineRule="auto"/>
               <w:jc w:val="right"/>
             </w:pPr>
             <w:r>
               <w:rPr>
                 <w:noProof/>
-                <w:sz w:val="18"/>
-              </w:rPr>
-              <w:t>PATCH</w:t>
-            </w:r>
-            <w:r>
-              <w:rPr>
-                <w:sz w:val="18"/>
-                <w:rtl/>
-              </w:rPr>
-              <w:t xml:space="preserve"> </w:t>
-            </w:r>
-            <w:r>
-              <w:rPr>
-                <w:noProof/>
-                <w:sz w:val="18"/>
-              </w:rPr>
-              <w:t>/v1/admin/tickets/</w:t>
-            </w:r>
-            <w:r>
-              <w:rPr>
-                <w:sz w:val="18"/>
-                <w:rtl/>
-              </w:rPr>
-              <w:t>{</w:t>
-            </w:r>
-            <w:r>
-              <w:rPr>
-                <w:noProof/>
-                <w:sz w:val="18"/>
-              </w:rPr>
-              <w:t>id</w:t>
-            </w:r>
-            <w:r>
-              <w:rPr>
-                <w:sz w:val="18"/>
-                <w:rtl/>
-              </w:rPr>
-              <w:t>}</w:t>
-            </w:r>
-            <w:r>
-              <w:rPr>
-                <w:noProof/>
-                <w:sz w:val="18"/>
-              </w:rPr>
-              <w:t>/resolve</w:t>
+              </w:rPr>
+              <w:t>PATCH /v1/admin/incidents/{id}/resolve</w:t>
             </w:r>
           </w:p>
         </w:tc>
@@ -9075,15 +7975,13 @@
           <w:p>
             <w:pPr>
               <w:bidi/>
-              <w:spacing w:after="0" w:line="252" w:lineRule="auto"/>
-              <w:jc w:val="right"/>
-            </w:pPr>
-            <w:r>
-              <w:rPr>
-                <w:sz w:val="18"/>
-                <w:rtl/>
-              </w:rPr>
-              <w:t>تقرير تصفية النقاط ومستحقات المتاجر الشريكة</w:t>
+              <w:jc w:val="right"/>
+            </w:pPr>
+            <w:r>
+              <w:rPr>
+                <w:rtl/>
+              </w:rPr>
+              <w:t>تقرير تصفية النقاط ومستحقات شركاء الاسترداد ومبيعات المتجر</w:t>
             </w:r>
           </w:p>
         </w:tc>
@@ -9495,7 +8393,6 @@
         <w:rPr>
           <w:rtl/>
         </w:rPr>
-        <w:lastRenderedPageBreak/>
         <w:t>7 الأمان والخصوصية والرقابة التشغيلية</w:t>
       </w:r>
     </w:p>
@@ -9769,9 +8666,8 @@
           <w:noProof/>
           <w:rtl/>
         </w:rPr>
-        <w:lastRenderedPageBreak/>
         <w:drawing>
-          <wp:inline distT="0" distB="0" distL="0" distR="0" wp14:anchorId="78069C01" wp14:editId="309BCF6B">
+          <wp:inline distT="0" distB="0" distL="0" distR="0" wp14:anchorId="625699E0" wp14:editId="2F59FEDE">
             <wp:extent cx="4389120" cy="6941384"/>
             <wp:effectExtent l="0" t="0" r="0" b="0"/>
             <wp:docPr id="4" name="Picture 4"/>
@@ -10137,15 +9033,7 @@
                 <w:sz w:val="18"/>
                 <w:rtl/>
               </w:rPr>
-              <w:t xml:space="preserve"> المكانية الصارمة عبر </w:t>
-            </w:r>
-            <w:r>
-              <w:rPr>
-                <w:sz w:val="18"/>
-                <w:rtl/>
-              </w:rPr>
-              <w:lastRenderedPageBreak/>
-              <w:t xml:space="preserve">فهارس </w:t>
+              <w:t xml:space="preserve"> المكانية الصارمة عبر فهارس </w:t>
             </w:r>
             <w:r>
               <w:rPr>
@@ -10185,7 +9073,6 @@
                 <w:sz w:val="18"/>
                 <w:rtl/>
               </w:rPr>
-              <w:lastRenderedPageBreak/>
               <w:t>معالجة استعلام النقطة داخل النطاق خلال أقل من 50 مللي ثانية</w:t>
             </w:r>
           </w:p>
@@ -11816,7 +10703,6 @@
         <w:rPr>
           <w:rtl/>
         </w:rPr>
-        <w:lastRenderedPageBreak/>
         <w:t>10 الملاحق التنفيذية</w:t>
       </w:r>
     </w:p>
@@ -12612,7 +11498,7 @@
     <w:p>
       <w:pPr>
         <w:bidi/>
-        <w:jc w:val="right"/>
+        <w:jc w:val="center"/>
       </w:pPr>
       <w:r>
         <w:rPr>
@@ -12620,10 +11506,10 @@
           <w:rtl/>
         </w:rPr>
         <w:drawing>
-          <wp:inline distT="0" distB="0" distL="0" distR="0" wp14:anchorId="64711BDA" wp14:editId="62466E2F">
-            <wp:extent cx="4754880" cy="3090356"/>
+          <wp:inline distT="0" distB="0" distL="0" distR="0" wp14:anchorId="2A9351FB" wp14:editId="70BCE106">
+            <wp:extent cx="5943600" cy="2932176"/>
             <wp:effectExtent l="0" t="0" r="0" b="0"/>
-            <wp:docPr id="5" name="Picture 5"/>
+            <wp:docPr id="16" name="Picture 16"/>
             <wp:cNvGraphicFramePr>
               <a:graphicFrameLocks xmlns:a="http://schemas.openxmlformats.org/drawingml/2006/main" noChangeAspect="1"/>
             </wp:cNvGraphicFramePr>
@@ -12631,7 +11517,7 @@
               <a:graphicData uri="http://schemas.openxmlformats.org/drawingml/2006/picture">
                 <pic:pic xmlns:pic="http://schemas.openxmlformats.org/drawingml/2006/picture">
                   <pic:nvPicPr>
-                    <pic:cNvPr id="0" name="mermaid-diagram4.png"/>
+                    <pic:cNvPr id="0" name="image.png"/>
                     <pic:cNvPicPr/>
                   </pic:nvPicPr>
                   <pic:blipFill>
@@ -12643,7 +11529,7 @@
                   <pic:spPr>
                     <a:xfrm>
                       <a:off x="0" y="0"/>
-                      <a:ext cx="4754880" cy="3090356"/>
+                      <a:ext cx="5943600" cy="2932176"/>
                     </a:xfrm>
                     <a:prstGeom prst="rect">
                       <a:avLst/>
@@ -12721,7 +11607,6 @@
         <w:rPr>
           <w:rtl/>
         </w:rPr>
-        <w:lastRenderedPageBreak/>
         <w:t>10 3 منع التكرار والتزامن</w:t>
       </w:r>
     </w:p>
@@ -13120,7 +12005,7 @@
                 <w:noProof/>
                 <w:sz w:val="16"/>
               </w:rPr>
-              <w:t>task_id + visit_reference</w:t>
+              <w:t>task_id + visit_reference</w:t>
             </w:r>
           </w:p>
         </w:tc>
@@ -13328,7 +12213,7 @@
                 <w:noProof/>
                 <w:sz w:val="16"/>
               </w:rPr>
-              <w:t>buyer_id + idempotency_key</w:t>
+              <w:t>buyer_id + idempotency_key</w:t>
             </w:r>
           </w:p>
         </w:tc>
@@ -13432,7 +12317,7 @@
                 <w:noProof/>
                 <w:sz w:val="16"/>
               </w:rPr>
-              <w:t>provider + transfer_ref + amount</w:t>
+              <w:t>provider + transfer_ref + amount</w:t>
             </w:r>
           </w:p>
         </w:tc>
@@ -13536,7 +12421,7 @@
                 <w:noProof/>
                 <w:sz w:val="16"/>
               </w:rPr>
-              <w:t>order_id + release_revision</w:t>
+              <w:t>order_id + release_revision</w:t>
             </w:r>
           </w:p>
         </w:tc>

</xml_diff>

<commit_message>
fix: complete canonical remediation, 25-entity data dictionary, Contabo hosting & storage, and API contracts alignment
</commit_message>
<xml_diff>
--- a/ATHAR_Master_Software_Operational_Blueprint_AR_Updated.docx
+++ b/ATHAR_Master_Software_Operational_Blueprint_AR_Updated.docx
@@ -10,7 +10,6 @@
       </w:pPr>
       <w:r>
         <w:rPr>
-          <w:rFonts w:ascii="Arial" w:hAnsi="Arial"/>
           <w:color w:val="102C57"/>
           <w:sz w:val="36"/>
           <w:rtl/>
@@ -85,7 +84,43 @@
           <w:color w:val="203A43"/>
           <w:sz w:val="22"/>
         </w:rPr>
-        <w:t>https://github.com/A‑S‑Y/Athar</w:t>
+        <w:t>https://github.com/A</w:t>
+      </w:r>
+      <w:r>
+        <w:rPr>
+          <w:b/>
+          <w:color w:val="203A43"/>
+          <w:sz w:val="22"/>
+          <w:rtl/>
+        </w:rPr>
+        <w:t>‑</w:t>
+      </w:r>
+      <w:r>
+        <w:rPr>
+          <w:b/>
+          <w:noProof/>
+          <w:color w:val="203A43"/>
+          <w:sz w:val="22"/>
+        </w:rPr>
+        <w:t>S</w:t>
+      </w:r>
+      <w:r>
+        <w:rPr>
+          <w:b/>
+          <w:color w:val="203A43"/>
+          <w:sz w:val="22"/>
+          <w:rtl/>
+        </w:rPr>
+        <w:t>‑</w:t>
+      </w:r>
+      <w:r>
+        <w:rPr>
+          <w:b/>
+          <w:noProof/>
+          <w:color w:val="203A43"/>
+          <w:sz w:val="22"/>
+        </w:rPr>
+        <w:t>Y/Athar</w:t>
       </w:r>
       <w:r>
         <w:rPr>
@@ -228,7 +263,25 @@
           <w:color w:val="203A43"/>
           <w:sz w:val="24"/>
         </w:rPr>
-        <w:t>(Documentation Index)</w:t>
+        <w:t>(Documentation</w:t>
+      </w:r>
+      <w:r>
+        <w:rPr>
+          <w:b/>
+          <w:color w:val="203A43"/>
+          <w:sz w:val="24"/>
+          <w:rtl/>
+        </w:rPr>
+        <w:t> </w:t>
+      </w:r>
+      <w:r>
+        <w:rPr>
+          <w:b/>
+          <w:noProof/>
+          <w:color w:val="203A43"/>
+          <w:sz w:val="24"/>
+        </w:rPr>
+        <w:t>Index)</w:t>
       </w:r>
     </w:p>
     <w:tbl>
@@ -353,8 +406,6 @@
             </w:pPr>
             <w:r>
               <w:rPr>
-                <w:color w:val="24292F"/>
-                <w:sz w:val="19"/>
                 <w:rtl/>
               </w:rPr>
               <w:t xml:space="preserve">مخططات </w:t>
@@ -362,15 +413,11 @@
             <w:r>
               <w:rPr>
                 <w:noProof/>
-                <w:color w:val="24292F"/>
-                <w:sz w:val="19"/>
               </w:rPr>
               <w:t>C4</w:t>
             </w:r>
             <w:r>
               <w:rPr>
-                <w:color w:val="24292F"/>
-                <w:sz w:val="19"/>
                 <w:rtl/>
               </w:rPr>
               <w:t xml:space="preserve"> </w:t>
@@ -378,40 +425,18 @@
             <w:r>
               <w:rPr>
                 <w:noProof/>
-                <w:color w:val="24292F"/>
-                <w:sz w:val="19"/>
               </w:rPr>
               <w:t>Model</w:t>
             </w:r>
             <w:r>
               <w:rPr>
-                <w:color w:val="24292F"/>
-                <w:sz w:val="19"/>
-                <w:rtl/>
-              </w:rPr>
-              <w:t xml:space="preserve"> ونمط </w:t>
+                <w:rtl/>
+              </w:rPr>
+              <w:t xml:space="preserve"> ومعالجة المهام الخلفية ومواصفات </w:t>
             </w:r>
             <w:r>
               <w:rPr>
                 <w:noProof/>
-                <w:color w:val="24292F"/>
-                <w:sz w:val="19"/>
-              </w:rPr>
-              <w:t>Outbox</w:t>
-            </w:r>
-            <w:r>
-              <w:rPr>
-                <w:color w:val="24292F"/>
-                <w:sz w:val="19"/>
-                <w:rtl/>
-              </w:rPr>
-              <w:t xml:space="preserve"> ومواصفات </w:t>
-            </w:r>
-            <w:r>
-              <w:rPr>
-                <w:noProof/>
-                <w:color w:val="24292F"/>
-                <w:sz w:val="19"/>
               </w:rPr>
               <w:t>SLOs</w:t>
             </w:r>
@@ -773,8 +798,6 @@
             </w:pPr>
             <w:r>
               <w:rPr>
-                <w:color w:val="24292F"/>
-                <w:sz w:val="19"/>
                 <w:rtl/>
               </w:rPr>
               <w:t xml:space="preserve">تسلسلات </w:t>
@@ -782,18 +805,26 @@
             <w:r>
               <w:rPr>
                 <w:noProof/>
-                <w:color w:val="24292F"/>
-                <w:sz w:val="19"/>
               </w:rPr>
               <w:t>OTP</w:t>
             </w:r>
             <w:r>
               <w:rPr>
-                <w:color w:val="24292F"/>
-                <w:sz w:val="19"/>
-                <w:rtl/>
-              </w:rPr>
-              <w:t xml:space="preserve"> والجمع الميداني والقسائم وصندوق الصادر</w:t>
+                <w:rtl/>
+              </w:rPr>
+              <w:t xml:space="preserve"> والجمع الميداني ومسح بطاقة </w:t>
+            </w:r>
+            <w:r>
+              <w:rPr>
+                <w:noProof/>
+              </w:rPr>
+              <w:t>QR</w:t>
+            </w:r>
+            <w:r>
+              <w:rPr>
+                <w:rtl/>
+              </w:rPr>
+              <w:t xml:space="preserve"> والشراء بخطوتين</w:t>
             </w:r>
           </w:p>
         </w:tc>
@@ -1527,7 +1558,6 @@
       </w:pPr>
       <w:r>
         <w:rPr>
-          <w:sz w:val="20"/>
           <w:rtl/>
         </w:rPr>
         <w:t xml:space="preserve">تحدد هذه الوثيقة المعمارية المرجعية للنسخة التشغيلية الأولى لمنظومة «أثر»، ونموذج البيانات، وعقود واجهات برمجة التطبيقات </w:t>
@@ -1535,27 +1565,42 @@
       <w:r>
         <w:rPr>
           <w:noProof/>
-          <w:sz w:val="20"/>
-        </w:rPr>
-        <w:t>(API Contracts)</w:t>
-      </w:r>
-      <w:r>
-        <w:rPr>
-          <w:sz w:val="20"/>
-          <w:rtl/>
-        </w:rPr>
-        <w:t xml:space="preserve">، ومسارات المستخدمين (المواطن، العامل الميداني، المشرف، موظفو الإدارة وخدمة العملاء، الشريك، المتجر). يعتمد التنفيذ البرمجي مكدساً تقنياً حديثاً وموحداً قائماً على </w:t>
-      </w:r>
-      <w:r>
-        <w:rPr>
-          <w:noProof/>
-          <w:sz w:val="20"/>
+        </w:rPr>
+        <w:t>(API</w:t>
+      </w:r>
+      <w:r>
+        <w:rPr>
+          <w:rtl/>
+        </w:rPr>
+        <w:t xml:space="preserve"> </w:t>
+      </w:r>
+      <w:r>
+        <w:rPr>
+          <w:noProof/>
+        </w:rPr>
+        <w:t>Contracts)</w:t>
+      </w:r>
+      <w:r>
+        <w:rPr>
+          <w:rtl/>
+        </w:rPr>
+        <w:t xml:space="preserve">، ومسارات المستخدمين (المواطن، العامل الميداني، المشرف، موظفو الإدارة وخدمة العملاء، الشريك، المتجر). يعتمد التنفيذ </w:t>
+      </w:r>
+      <w:r>
+        <w:rPr>
+          <w:rtl/>
+        </w:rPr>
+        <w:lastRenderedPageBreak/>
+        <w:t xml:space="preserve">البرمجي مكدساً تقنياً حديثاً وموحداً قائماً على </w:t>
+      </w:r>
+      <w:r>
+        <w:rPr>
+          <w:noProof/>
         </w:rPr>
         <w:t>(Node.js)</w:t>
       </w:r>
       <w:r>
         <w:rPr>
-          <w:sz w:val="20"/>
           <w:rtl/>
         </w:rPr>
         <w:t xml:space="preserve"> مع </w:t>
@@ -1563,13 +1608,11 @@
       <w:r>
         <w:rPr>
           <w:noProof/>
-          <w:sz w:val="20"/>
         </w:rPr>
         <w:t>(TypeScript)</w:t>
       </w:r>
       <w:r>
         <w:rPr>
-          <w:sz w:val="20"/>
           <w:rtl/>
         </w:rPr>
         <w:t xml:space="preserve"> للخادم الأساسي ومعالجات المهام الخلفية </w:t>
@@ -1577,13 +1620,23 @@
       <w:r>
         <w:rPr>
           <w:noProof/>
-          <w:sz w:val="20"/>
-        </w:rPr>
-        <w:t>(Background Workers)</w:t>
-      </w:r>
-      <w:r>
-        <w:rPr>
-          <w:sz w:val="20"/>
+        </w:rPr>
+        <w:t>(Background</w:t>
+      </w:r>
+      <w:r>
+        <w:rPr>
+          <w:rtl/>
+        </w:rPr>
+        <w:t xml:space="preserve"> </w:t>
+      </w:r>
+      <w:r>
+        <w:rPr>
+          <w:noProof/>
+        </w:rPr>
+        <w:t>Workers)</w:t>
+      </w:r>
+      <w:r>
+        <w:rPr>
           <w:rtl/>
         </w:rPr>
         <w:t xml:space="preserve"> بنمط المونوليث النمطي </w:t>
@@ -1591,13 +1644,23 @@
       <w:r>
         <w:rPr>
           <w:noProof/>
-          <w:sz w:val="20"/>
-        </w:rPr>
-        <w:t>(Modular Monolith)</w:t>
-      </w:r>
-      <w:r>
-        <w:rPr>
-          <w:sz w:val="20"/>
+        </w:rPr>
+        <w:t>(Modular</w:t>
+      </w:r>
+      <w:r>
+        <w:rPr>
+          <w:rtl/>
+        </w:rPr>
+        <w:t xml:space="preserve"> </w:t>
+      </w:r>
+      <w:r>
+        <w:rPr>
+          <w:noProof/>
+        </w:rPr>
+        <w:t>Monolith)</w:t>
+      </w:r>
+      <w:r>
+        <w:rPr>
           <w:rtl/>
         </w:rPr>
         <w:t xml:space="preserve"> وإطار عمل </w:t>
@@ -1605,49 +1668,35 @@
       <w:r>
         <w:rPr>
           <w:noProof/>
-          <w:sz w:val="20"/>
         </w:rPr>
         <w:t>(Fastify)</w:t>
       </w:r>
       <w:r>
         <w:rPr>
-          <w:sz w:val="20"/>
           <w:rtl/>
         </w:rPr>
         <w:t xml:space="preserve">، مدعومة بقاعدة بيانات </w:t>
       </w:r>
       <w:r>
         <w:rPr>
-          <w:sz w:val="20"/>
-          <w:rtl/>
-        </w:rPr>
-        <w:lastRenderedPageBreak/>
-        <w:t>(</w:t>
-      </w:r>
-      <w:r>
-        <w:rPr>
-          <w:noProof/>
-          <w:sz w:val="20"/>
-        </w:rPr>
-        <w:t>PostgreSQL</w:t>
-      </w:r>
-      <w:r>
-        <w:rPr>
-          <w:sz w:val="20"/>
-          <w:rtl/>
-        </w:rPr>
-        <w:t xml:space="preserve"> 16+) مع امتداد (</w:t>
-      </w:r>
-      <w:r>
-        <w:rPr>
-          <w:noProof/>
-          <w:sz w:val="20"/>
-        </w:rPr>
-        <w:t>PostGIS</w:t>
-      </w:r>
-      <w:r>
-        <w:rPr>
-          <w:sz w:val="20"/>
+          <w:noProof/>
+        </w:rPr>
+        <w:t>(PostgreSQL</w:t>
+      </w:r>
+      <w:r>
+        <w:rPr>
+          <w:rtl/>
+        </w:rPr>
+        <w:t xml:space="preserve"> 16+) مع امتداد </w:t>
+      </w:r>
+      <w:r>
+        <w:rPr>
+          <w:noProof/>
+        </w:rPr>
+        <w:t>(PostGIS</w:t>
+      </w:r>
+      <w:r>
+        <w:rPr>
           <w:rtl/>
         </w:rPr>
         <w:t xml:space="preserve"> 3.4+). ترتبط بالخادم ثلاثة مسارات واجهات رئيسية: تطبيق الميدان والمواطن الموحد </w:t>
@@ -1655,13 +1704,23 @@
       <w:r>
         <w:rPr>
           <w:noProof/>
-          <w:sz w:val="20"/>
-        </w:rPr>
-        <w:t>(Flutter Android)</w:t>
-      </w:r>
-      <w:r>
-        <w:rPr>
-          <w:sz w:val="20"/>
+        </w:rPr>
+        <w:t>(Flutter</w:t>
+      </w:r>
+      <w:r>
+        <w:rPr>
+          <w:rtl/>
+        </w:rPr>
+        <w:t xml:space="preserve"> </w:t>
+      </w:r>
+      <w:r>
+        <w:rPr>
+          <w:noProof/>
+        </w:rPr>
+        <w:t>Android)</w:t>
+      </w:r>
+      <w:r>
+        <w:rPr>
           <w:rtl/>
         </w:rPr>
         <w:t xml:space="preserve">، وبوابة المتجر والمواطن الخفيفة </w:t>
@@ -1669,13 +1728,23 @@
       <w:r>
         <w:rPr>
           <w:noProof/>
-          <w:sz w:val="20"/>
-        </w:rPr>
-        <w:t>(Flutter Web)</w:t>
-      </w:r>
-      <w:r>
-        <w:rPr>
-          <w:sz w:val="20"/>
+        </w:rPr>
+        <w:t>(Flutter</w:t>
+      </w:r>
+      <w:r>
+        <w:rPr>
+          <w:rtl/>
+        </w:rPr>
+        <w:t xml:space="preserve"> </w:t>
+      </w:r>
+      <w:r>
+        <w:rPr>
+          <w:noProof/>
+        </w:rPr>
+        <w:t>Web)</w:t>
+      </w:r>
+      <w:r>
+        <w:rPr>
           <w:rtl/>
         </w:rPr>
         <w:t xml:space="preserve">، وبوابة الإدارة والعمليات المركزية </w:t>
@@ -1683,13 +1752,35 @@
       <w:r>
         <w:rPr>
           <w:noProof/>
-          <w:sz w:val="20"/>
-        </w:rPr>
-        <w:t>(Back‑Office Web Portal)</w:t>
-      </w:r>
-      <w:r>
-        <w:rPr>
-          <w:sz w:val="20"/>
+        </w:rPr>
+        <w:t>(Back‑Office</w:t>
+      </w:r>
+      <w:r>
+        <w:rPr>
+          <w:rtl/>
+        </w:rPr>
+        <w:t xml:space="preserve"> </w:t>
+      </w:r>
+      <w:r>
+        <w:rPr>
+          <w:noProof/>
+        </w:rPr>
+        <w:t>Web</w:t>
+      </w:r>
+      <w:r>
+        <w:rPr>
+          <w:rtl/>
+        </w:rPr>
+        <w:t xml:space="preserve"> </w:t>
+      </w:r>
+      <w:r>
+        <w:rPr>
+          <w:noProof/>
+        </w:rPr>
+        <w:t>Portal)</w:t>
+      </w:r>
+      <w:r>
+        <w:rPr>
           <w:rtl/>
         </w:rPr>
         <w:t xml:space="preserve"> المبنية بـ </w:t>
@@ -1697,27 +1788,59 @@
       <w:r>
         <w:rPr>
           <w:noProof/>
-          <w:sz w:val="20"/>
-        </w:rPr>
-        <w:t>(React / TypeScript)</w:t>
-      </w:r>
-      <w:r>
-        <w:rPr>
-          <w:sz w:val="20"/>
-          <w:rtl/>
-        </w:rPr>
-        <w:t xml:space="preserve">. كل معاملة تشغيلية أو مالية تُحسم حصراً من الخادم </w:t>
-      </w:r>
-      <w:r>
-        <w:rPr>
-          <w:noProof/>
-          <w:sz w:val="20"/>
+        </w:rPr>
+        <w:t>(React</w:t>
+      </w:r>
+      <w:r>
+        <w:rPr>
+          <w:rtl/>
+        </w:rPr>
+        <w:t xml:space="preserve"> / </w:t>
+      </w:r>
+      <w:r>
+        <w:rPr>
+          <w:noProof/>
+        </w:rPr>
+        <w:t>TypeScript).</w:t>
+      </w:r>
+      <w:r>
+        <w:rPr>
+          <w:rtl/>
+        </w:rPr>
+        <w:t xml:space="preserve"> تُستضاف المنظومة على خادم افتراضي خاص </w:t>
+      </w:r>
+      <w:r>
+        <w:rPr>
+          <w:noProof/>
+        </w:rPr>
+        <w:t>(VPS)</w:t>
+      </w:r>
+      <w:r>
+        <w:rPr>
+          <w:rtl/>
+        </w:rPr>
+        <w:t xml:space="preserve"> من مزود </w:t>
+      </w:r>
+      <w:r>
+        <w:rPr>
+          <w:noProof/>
+        </w:rPr>
+        <w:t>Contabo</w:t>
+      </w:r>
+      <w:r>
+        <w:rPr>
+          <w:rtl/>
+        </w:rPr>
+        <w:t xml:space="preserve"> مع اعتماد التخزين المحلي الخاص على نفس الخادم للملفات والمرفقات. كل معاملة تشغيلية أو مالية تُحسم حصراً من الخادم </w:t>
+      </w:r>
+      <w:r>
+        <w:rPr>
+          <w:noProof/>
         </w:rPr>
         <w:t>(Server‑Authoritative)</w:t>
       </w:r>
       <w:r>
         <w:rPr>
-          <w:sz w:val="20"/>
           <w:rtl/>
         </w:rPr>
         <w:t xml:space="preserve"> بعد التحقق من الصلاحيات والذرية </w:t>
@@ -1725,13 +1848,11 @@
       <w:r>
         <w:rPr>
           <w:noProof/>
-          <w:sz w:val="20"/>
         </w:rPr>
         <w:t>(Atomicity)</w:t>
       </w:r>
       <w:r>
         <w:rPr>
-          <w:sz w:val="20"/>
           <w:rtl/>
         </w:rPr>
         <w:t>؛ وتظل السياسات التنظيمية والتجارية المعتمدة محددة صراحة في ملاحق الوثيقة.</w:t>
@@ -1745,7 +1866,6 @@
       </w:pPr>
       <w:r>
         <w:rPr>
-          <w:rFonts w:ascii="Arial" w:hAnsi="Arial"/>
           <w:color w:val="102C57"/>
           <w:sz w:val="28"/>
           <w:rtl/>
@@ -1770,13 +1890,27 @@
           <w:noProof/>
           <w:sz w:val="20"/>
         </w:rPr>
-        <w:t>(Single Codebase)</w:t>
+        <w:t>(Single</w:t>
       </w:r>
       <w:r>
         <w:rPr>
           <w:sz w:val="20"/>
           <w:rtl/>
         </w:rPr>
+        <w:t> </w:t>
+      </w:r>
+      <w:r>
+        <w:rPr>
+          <w:noProof/>
+          <w:sz w:val="20"/>
+        </w:rPr>
+        <w:t>Codebase)</w:t>
+      </w:r>
+      <w:r>
+        <w:rPr>
+          <w:sz w:val="20"/>
+          <w:rtl/>
+        </w:rPr>
         <w:t xml:space="preserve"> مبنية بإطار عمل </w:t>
       </w:r>
       <w:r>
@@ -1798,13 +1932,27 @@
           <w:noProof/>
           <w:sz w:val="20"/>
         </w:rPr>
-        <w:t>(Android App)</w:t>
+        <w:t>(Android</w:t>
       </w:r>
       <w:r>
         <w:rPr>
           <w:sz w:val="20"/>
           <w:rtl/>
         </w:rPr>
+        <w:t> </w:t>
+      </w:r>
+      <w:r>
+        <w:rPr>
+          <w:noProof/>
+          <w:sz w:val="20"/>
+        </w:rPr>
+        <w:t>App)</w:t>
+      </w:r>
+      <w:r>
+        <w:rPr>
+          <w:sz w:val="20"/>
+          <w:rtl/>
+        </w:rPr>
         <w:t xml:space="preserve"> وتطبيق ويب </w:t>
       </w:r>
       <w:r>
@@ -1812,13 +1960,27 @@
           <w:noProof/>
           <w:sz w:val="20"/>
         </w:rPr>
-        <w:t>(Flutter Web)</w:t>
+        <w:t>(Flutter</w:t>
       </w:r>
       <w:r>
         <w:rPr>
           <w:sz w:val="20"/>
           <w:rtl/>
         </w:rPr>
+        <w:t> </w:t>
+      </w:r>
+      <w:r>
+        <w:rPr>
+          <w:noProof/>
+          <w:sz w:val="20"/>
+        </w:rPr>
+        <w:t>Web)</w:t>
+      </w:r>
+      <w:r>
+        <w:rPr>
+          <w:sz w:val="20"/>
+          <w:rtl/>
+        </w:rPr>
         <w:t>، مع مسار مخصص لبوابة المتجر الإلكتروني بتجربة شراء مبسطة وسريعة. يتاح الوصول عبر متصفحات الجوال (</w:t>
       </w:r>
       <w:r>
@@ -1882,13 +2044,27 @@
           <w:noProof/>
           <w:sz w:val="20"/>
         </w:rPr>
-        <w:t>(Deep/Direct Links)</w:t>
+        <w:t>(Deep/Direct</w:t>
       </w:r>
       <w:r>
         <w:rPr>
           <w:sz w:val="20"/>
           <w:rtl/>
         </w:rPr>
+        <w:t> </w:t>
+      </w:r>
+      <w:r>
+        <w:rPr>
+          <w:noProof/>
+          <w:sz w:val="20"/>
+        </w:rPr>
+        <w:t>Links)</w:t>
+      </w:r>
+      <w:r>
+        <w:rPr>
+          <w:sz w:val="20"/>
+          <w:rtl/>
+        </w:rPr>
         <w:t xml:space="preserve"> دون إلزام المستخدم بتثبيت التطبيق، مع التعامل التدريجي والآمن مع غياب بعض قدرات النظام الأصلية </w:t>
       </w:r>
       <w:r>
@@ -1896,13 +2072,27 @@
           <w:noProof/>
           <w:sz w:val="20"/>
         </w:rPr>
-        <w:t>(Graceful Degradation)</w:t>
+        <w:t>(Graceful</w:t>
       </w:r>
       <w:r>
         <w:rPr>
           <w:sz w:val="20"/>
           <w:rtl/>
         </w:rPr>
+        <w:t> </w:t>
+      </w:r>
+      <w:r>
+        <w:rPr>
+          <w:noProof/>
+          <w:sz w:val="20"/>
+        </w:rPr>
+        <w:t>Degradation)</w:t>
+      </w:r>
+      <w:r>
+        <w:rPr>
+          <w:sz w:val="20"/>
+          <w:rtl/>
+        </w:rPr>
         <w:t xml:space="preserve">. وإلى جانب ذلك، تُعتمد بوابة الإدارة والعمليات المركزية </w:t>
       </w:r>
       <w:r>
@@ -1910,13 +2100,55 @@
           <w:noProof/>
           <w:sz w:val="20"/>
         </w:rPr>
-        <w:t>(Back‑Office Web Portal)</w:t>
+        <w:t>(Back</w:t>
       </w:r>
       <w:r>
         <w:rPr>
           <w:sz w:val="20"/>
           <w:rtl/>
         </w:rPr>
+        <w:t>‑</w:t>
+      </w:r>
+      <w:r>
+        <w:rPr>
+          <w:noProof/>
+          <w:sz w:val="20"/>
+        </w:rPr>
+        <w:t>Office</w:t>
+      </w:r>
+      <w:r>
+        <w:rPr>
+          <w:sz w:val="20"/>
+          <w:rtl/>
+        </w:rPr>
+        <w:t> </w:t>
+      </w:r>
+      <w:r>
+        <w:rPr>
+          <w:noProof/>
+          <w:sz w:val="20"/>
+        </w:rPr>
+        <w:t>Web</w:t>
+      </w:r>
+      <w:r>
+        <w:rPr>
+          <w:sz w:val="20"/>
+          <w:rtl/>
+        </w:rPr>
+        <w:t> </w:t>
+      </w:r>
+      <w:r>
+        <w:rPr>
+          <w:noProof/>
+          <w:sz w:val="20"/>
+        </w:rPr>
+        <w:t>Portal)</w:t>
+      </w:r>
+      <w:r>
+        <w:rPr>
+          <w:sz w:val="20"/>
+          <w:rtl/>
+        </w:rPr>
         <w:t xml:space="preserve"> كتطبيق ويب مكتبي متكامل </w:t>
       </w:r>
       <w:r>
@@ -1924,13 +2156,41 @@
           <w:noProof/>
           <w:sz w:val="20"/>
         </w:rPr>
-        <w:t>(Desktop Web SPA)</w:t>
+        <w:t>(Desktop</w:t>
       </w:r>
       <w:r>
         <w:rPr>
           <w:sz w:val="20"/>
           <w:rtl/>
         </w:rPr>
+        <w:t> </w:t>
+      </w:r>
+      <w:r>
+        <w:rPr>
+          <w:noProof/>
+          <w:sz w:val="20"/>
+        </w:rPr>
+        <w:t>Web</w:t>
+      </w:r>
+      <w:r>
+        <w:rPr>
+          <w:sz w:val="20"/>
+          <w:rtl/>
+        </w:rPr>
+        <w:t> </w:t>
+      </w:r>
+      <w:r>
+        <w:rPr>
+          <w:noProof/>
+          <w:sz w:val="20"/>
+        </w:rPr>
+        <w:t>SPA)</w:t>
+      </w:r>
+      <w:r>
+        <w:rPr>
+          <w:sz w:val="20"/>
+          <w:rtl/>
+        </w:rPr>
         <w:t xml:space="preserve"> مبني بـ </w:t>
       </w:r>
       <w:r>
@@ -1938,7 +2198,21 @@
           <w:noProof/>
           <w:sz w:val="20"/>
         </w:rPr>
-        <w:t>(React / TypeScript)</w:t>
+        <w:t>(React</w:t>
+      </w:r>
+      <w:r>
+        <w:rPr>
+          <w:sz w:val="20"/>
+          <w:rtl/>
+        </w:rPr>
+        <w:t> / </w:t>
+      </w:r>
+      <w:r>
+        <w:rPr>
+          <w:noProof/>
+          <w:sz w:val="20"/>
+        </w:rPr>
+        <w:t>TypeScript)</w:t>
       </w:r>
       <w:r>
         <w:rPr>
@@ -1979,7 +2253,21 @@
           <w:noProof/>
           <w:sz w:val="20"/>
         </w:rPr>
-        <w:t>(Geofence Polygon)</w:t>
+        <w:t>(Geofence</w:t>
+      </w:r>
+      <w:r>
+        <w:rPr>
+          <w:sz w:val="20"/>
+          <w:rtl/>
+        </w:rPr>
+        <w:t> </w:t>
+      </w:r>
+      <w:r>
+        <w:rPr>
+          <w:noProof/>
+          <w:sz w:val="20"/>
+        </w:rPr>
+        <w:t>Polygon)</w:t>
       </w:r>
       <w:r>
         <w:rPr>
@@ -2040,7 +2328,67 @@
         <w:rPr>
           <w:rtl/>
         </w:rPr>
-        <w:t>الفرز عند المصدر مساران: عضوي وجاف. المرفوض وزن مستبعد، لا مسار فرز ثالث منتج للنقاط. الاعتماد النهائي للأوزان وحده ينشئ نقاطاً، وتعتمد المنظومة نمط المحاسبة المالية المزدوجة (Double‑Entry Points Accounting) عبر قيود متوازنة (Debit/Credit) بين حساب الإصدار وحساب المستفيد ، والتصحيحات بقيود عكسية موثقة حصراً لمنع التضخم أو التزييف.</w:t>
+        <w:t xml:space="preserve">الفرز عند المصدر مساران: عضوي وجاف. المرفوض وزن مستبعد، لا مسار فرز ثالث منتج للنقاط. الاعتماد النهائي للأوزان وحده ينشئ نقاطاً، وتعتمد المنظومة نمط المحاسبة المالية المزدوجة </w:t>
+      </w:r>
+      <w:r>
+        <w:rPr>
+          <w:noProof/>
+        </w:rPr>
+        <w:t>(Double</w:t>
+      </w:r>
+      <w:r>
+        <w:rPr>
+          <w:rtl/>
+        </w:rPr>
+        <w:t>‑</w:t>
+      </w:r>
+      <w:r>
+        <w:rPr>
+          <w:noProof/>
+        </w:rPr>
+        <w:t>Entry</w:t>
+      </w:r>
+      <w:r>
+        <w:rPr>
+          <w:rtl/>
+        </w:rPr>
+        <w:t> </w:t>
+      </w:r>
+      <w:r>
+        <w:rPr>
+          <w:noProof/>
+        </w:rPr>
+        <w:t>Points</w:t>
+      </w:r>
+      <w:r>
+        <w:rPr>
+          <w:rtl/>
+        </w:rPr>
+        <w:t> </w:t>
+      </w:r>
+      <w:r>
+        <w:rPr>
+          <w:noProof/>
+        </w:rPr>
+        <w:t>Accounting)</w:t>
+      </w:r>
+      <w:r>
+        <w:rPr>
+          <w:rtl/>
+        </w:rPr>
+        <w:t xml:space="preserve"> عبر قيود متوازنة </w:t>
+      </w:r>
+      <w:r>
+        <w:rPr>
+          <w:noProof/>
+        </w:rPr>
+        <w:t>(Debit/Credit)</w:t>
+      </w:r>
+      <w:r>
+        <w:rPr>
+          <w:rtl/>
+        </w:rPr>
+        <w:t xml:space="preserve"> بين حساب الإصدار وحساب المستفيد ، والتصحيحات بقيود عكسية موثقة حصراً لمنع التضخم أو التزييف.</w:t>
       </w:r>
     </w:p>
     <w:p>
@@ -2052,7 +2400,151 @@
         <w:rPr>
           <w:rtl/>
         </w:rPr>
-        <w:t>تعتمد المنظومة نمط الاتصال المباشر بالشبكة كمسار أساسي (Online‑First Architecture) مدعومة بمرونة العمل دون اتصال (Offline Resilience) والتخزين المؤقت المشفر على العميل. تُحفظ مسودة استبيان الضم اختيارياً في التخزين المحلي للجهاز؛ بينما يتم الإرسال والاعتماد النهائي عبر الشبكة. وفي حالات ضعف أو انقطاع التغطية، يقوم تطبيق العامل بحفظ العمليات محلياً، لتتم مزامنتها تلقائياً عند استعادة الاتصال أو ترحيلها عبر مراجعة المشرف في نهاية الوردية (End‑of‑day Batch Import). تُعالج كافة الإشعارات والرسائل النصية والمهام غير المتزامنة عبر نمط طوابير المهام الخلفية الموثوق (Transactional Outbox Pattern) ومعالجات خلفية (TypeScript Workers) مدعومة بـ (BullMQ / Pg‑Boss) لضمان عدم ضياع أي مهمة أو إشعار، مع تسوية قيود النقاط خلال مهلة أقصاها 24 ساعة من اعتماد الأوزان.</w:t>
+        <w:t xml:space="preserve">تعتمد المنظومة نمط الاتصال المباشر بالشبكة كمسار أساسي </w:t>
+      </w:r>
+      <w:r>
+        <w:rPr>
+          <w:noProof/>
+        </w:rPr>
+        <w:t>(Online‑First</w:t>
+      </w:r>
+      <w:r>
+        <w:rPr>
+          <w:rtl/>
+        </w:rPr>
+        <w:t xml:space="preserve"> </w:t>
+      </w:r>
+      <w:r>
+        <w:rPr>
+          <w:noProof/>
+        </w:rPr>
+        <w:t>Architecture)</w:t>
+      </w:r>
+      <w:r>
+        <w:rPr>
+          <w:rtl/>
+        </w:rPr>
+        <w:t xml:space="preserve"> مدعومة بمرونة العمل دون اتصال </w:t>
+      </w:r>
+      <w:r>
+        <w:rPr>
+          <w:noProof/>
+        </w:rPr>
+        <w:t>(Offline</w:t>
+      </w:r>
+      <w:r>
+        <w:rPr>
+          <w:rtl/>
+        </w:rPr>
+        <w:t xml:space="preserve"> </w:t>
+      </w:r>
+      <w:r>
+        <w:rPr>
+          <w:noProof/>
+        </w:rPr>
+        <w:t>Resilience)</w:t>
+      </w:r>
+      <w:r>
+        <w:rPr>
+          <w:rtl/>
+        </w:rPr>
+        <w:t xml:space="preserve"> والتخزين المؤقت المشفر على العميل. تُحفظ مسودة استبيان الضم اختيارياً في التخزين المحلي للجهاز؛ بينما يتم الإرسال والاعتماد النهائي عبر الشبكة. وفي حالات ضعف أو انقطاع التغطية، يقوم تطبيق العامل بحفظ العمليات محلياً، لتتم مزامنتها تلقائياً عند استعادة الاتصال أو ترحيلها عبر مراجعة المشرف في نهاية الوردية </w:t>
+      </w:r>
+      <w:r>
+        <w:rPr>
+          <w:noProof/>
+        </w:rPr>
+        <w:t>(End‑of‑day</w:t>
+      </w:r>
+      <w:r>
+        <w:rPr>
+          <w:rtl/>
+        </w:rPr>
+        <w:t xml:space="preserve"> </w:t>
+      </w:r>
+      <w:r>
+        <w:rPr>
+          <w:noProof/>
+        </w:rPr>
+        <w:t>Batch</w:t>
+      </w:r>
+      <w:r>
+        <w:rPr>
+          <w:rtl/>
+        </w:rPr>
+        <w:t xml:space="preserve"> </w:t>
+      </w:r>
+      <w:r>
+        <w:rPr>
+          <w:noProof/>
+        </w:rPr>
+        <w:t>Import).</w:t>
+      </w:r>
+      <w:r>
+        <w:rPr>
+          <w:rtl/>
+        </w:rPr>
+        <w:t xml:space="preserve"> تُعالج كافة الإشعارات والرسائل النصية والمهام غير المتزامنة عبر معالجات خلفية </w:t>
+      </w:r>
+      <w:r>
+        <w:rPr>
+          <w:noProof/>
+        </w:rPr>
+        <w:t>(TypeScript</w:t>
+      </w:r>
+      <w:r>
+        <w:rPr>
+          <w:rtl/>
+        </w:rPr>
+        <w:t xml:space="preserve"> </w:t>
+      </w:r>
+      <w:r>
+        <w:rPr>
+          <w:noProof/>
+        </w:rPr>
+        <w:t>Workers)</w:t>
+      </w:r>
+      <w:r>
+        <w:rPr>
+          <w:rtl/>
+        </w:rPr>
+        <w:t xml:space="preserve"> مدعومة بـ </w:t>
+      </w:r>
+      <w:r>
+        <w:rPr>
+          <w:noProof/>
+        </w:rPr>
+        <w:t>(BullMQ</w:t>
+      </w:r>
+      <w:r>
+        <w:rPr>
+          <w:rtl/>
+        </w:rPr>
+        <w:t xml:space="preserve"> / </w:t>
+      </w:r>
+      <w:r>
+        <w:rPr>
+          <w:noProof/>
+        </w:rPr>
+        <w:t>Pg‑Boss)</w:t>
+      </w:r>
+      <w:r>
+        <w:rPr>
+          <w:rtl/>
+        </w:rPr>
+        <w:t xml:space="preserve"> لضمان عدم ضياع أي مهمة أو إشعار، مع حفظ الرسائل في سجل إسناد المهام القائم </w:t>
+      </w:r>
+      <w:r>
+        <w:rPr>
+          <w:noProof/>
+        </w:rPr>
+        <w:t>(WorkerTaskDispatch)</w:t>
+      </w:r>
+      <w:r>
+        <w:rPr>
+          <w:rtl/>
+        </w:rPr>
+        <w:t xml:space="preserve"> لمتابعة مهلة العامل، وتسوية قيود النقاط خلال مهلة أقصاها 24 ساعة من اعتماد الأوزان.</w:t>
       </w:r>
     </w:p>
     <w:p>
@@ -2063,7 +2555,6 @@
       </w:pPr>
       <w:r>
         <w:rPr>
-          <w:rFonts w:ascii="Arial" w:hAnsi="Arial"/>
           <w:color w:val="102C57"/>
           <w:sz w:val="28"/>
           <w:rtl/>
@@ -2492,7 +2983,15 @@
                 <w:sz w:val="18"/>
                 <w:rtl/>
               </w:rPr>
-              <w:t>لوحة تحكم مكتبية شاملة للموظفين والإدارة: غرفة المراقبة والإسناد الحي، خدمة العملاء والشكاوى، إدارة المتجر والمستودعات، التسويات المالية، ومحرر النطاقات والتدقيق.</w:t>
+              <w:t xml:space="preserve">لوحة تحكم مكتبية شاملة للموظفين والإدارة: غرفة المراقبة والإسناد الحي، خدمة العملاء والشكاوى، إدارة المتجر والمستودعات، </w:t>
+            </w:r>
+            <w:r>
+              <w:rPr>
+                <w:sz w:val="18"/>
+                <w:rtl/>
+              </w:rPr>
+              <w:lastRenderedPageBreak/>
+              <w:t>التسويات المالية، ومحرر النطاقات والتدقيق.</w:t>
             </w:r>
           </w:p>
         </w:tc>
@@ -2525,6 +3024,7 @@
                 <w:sz w:val="18"/>
                 <w:rtl/>
               </w:rPr>
+              <w:lastRenderedPageBreak/>
               <w:t xml:space="preserve">بوابة الإدارة المركزية </w:t>
             </w:r>
             <w:r>
@@ -2631,15 +3131,7 @@
                 <w:sz w:val="18"/>
                 <w:rtl/>
               </w:rPr>
-              <w:t xml:space="preserve">؛ وحدات الهوية </w:t>
-            </w:r>
-            <w:r>
-              <w:rPr>
-                <w:sz w:val="18"/>
-                <w:rtl/>
-              </w:rPr>
-              <w:lastRenderedPageBreak/>
-              <w:t xml:space="preserve">والجغرافيا والجمع والنقاط والمتجر؛ تدقيق صارم للمخططات عبر </w:t>
+              <w:t xml:space="preserve">؛ وحدات الهوية والجغرافيا والجمع والنقاط والمتجر؛ تدقيق صارم للمخططات عبر </w:t>
             </w:r>
             <w:r>
               <w:rPr>
@@ -2700,7 +3192,6 @@
                 <w:sz w:val="18"/>
                 <w:rtl/>
               </w:rPr>
-              <w:lastRenderedPageBreak/>
               <w:t xml:space="preserve">خادم التطبيقات </w:t>
             </w:r>
             <w:r>
@@ -2771,40 +3262,34 @@
           <w:p>
             <w:pPr>
               <w:bidi/>
-              <w:spacing w:after="0" w:line="252" w:lineRule="auto"/>
               <w:jc w:val="right"/>
             </w:pPr>
             <w:r>
               <w:rPr>
-                <w:sz w:val="18"/>
-                <w:rtl/>
-              </w:rPr>
-              <w:t xml:space="preserve">محرك مهام خلفية قائم على نمط صندوق الصادر </w:t>
+                <w:rtl/>
+              </w:rPr>
+              <w:t xml:space="preserve">معالجات المهام الخلفية المباشرة </w:t>
             </w:r>
             <w:r>
               <w:rPr>
                 <w:noProof/>
-                <w:sz w:val="18"/>
-              </w:rPr>
-              <w:t>(Transactional Outbox)</w:t>
-            </w:r>
-            <w:r>
-              <w:rPr>
-                <w:sz w:val="18"/>
-                <w:rtl/>
-              </w:rPr>
-              <w:t xml:space="preserve"> و </w:t>
+              </w:rPr>
+              <w:t>(BullMQ</w:t>
+            </w:r>
+            <w:r>
+              <w:rPr>
+                <w:rtl/>
+              </w:rPr>
+              <w:t xml:space="preserve"> / </w:t>
             </w:r>
             <w:r>
               <w:rPr>
                 <w:noProof/>
-                <w:sz w:val="18"/>
-              </w:rPr>
-              <w:t>(BullMQ / Pg‑Boss)</w:t>
-            </w:r>
-            <w:r>
-              <w:rPr>
-                <w:sz w:val="18"/>
+              </w:rPr>
+              <w:t>Pg‑Boss)</w:t>
+            </w:r>
+            <w:r>
+              <w:rPr>
                 <w:rtl/>
               </w:rPr>
               <w:t xml:space="preserve"> لإرسال </w:t>
@@ -2812,16 +3297,14 @@
             <w:r>
               <w:rPr>
                 <w:noProof/>
-                <w:sz w:val="18"/>
               </w:rPr>
               <w:t>(SMS/Push/OTP)</w:t>
             </w:r>
             <w:r>
               <w:rPr>
-                <w:sz w:val="18"/>
-                <w:rtl/>
-              </w:rPr>
-              <w:t>، ومراقبة مهل العمال، وتصفية دفعات نهاية الوردية.</w:t>
+                <w:rtl/>
+              </w:rPr>
+              <w:t>، ومراقبة مهل العمال (10 دقائق)، وتصفية دفعات نهاية الوردية.</w:t>
             </w:r>
           </w:p>
         </w:tc>
@@ -3067,7 +3550,6 @@
             </w:pPr>
             <w:r>
               <w:rPr>
-                <w:sz w:val="18"/>
                 <w:rtl/>
               </w:rPr>
               <w:t xml:space="preserve">بوابات الرسائل النصية القصيرة </w:t>
@@ -3075,13 +3557,23 @@
             <w:r>
               <w:rPr>
                 <w:noProof/>
-                <w:sz w:val="18"/>
-              </w:rPr>
-              <w:t>(SMS Gateway)</w:t>
-            </w:r>
-            <w:r>
-              <w:rPr>
-                <w:sz w:val="18"/>
+              </w:rPr>
+              <w:t>(SMS</w:t>
+            </w:r>
+            <w:r>
+              <w:rPr>
+                <w:rtl/>
+              </w:rPr>
+              <w:t xml:space="preserve"> </w:t>
+            </w:r>
+            <w:r>
+              <w:rPr>
+                <w:noProof/>
+              </w:rPr>
+              <w:t>Gateway)</w:t>
+            </w:r>
+            <w:r>
+              <w:rPr>
                 <w:rtl/>
               </w:rPr>
               <w:t xml:space="preserve">، وخدمات الإشعارات </w:t>
@@ -3089,30 +3581,44 @@
             <w:r>
               <w:rPr>
                 <w:noProof/>
-                <w:sz w:val="18"/>
-              </w:rPr>
-              <w:t>(Firebase Cloud Messaging)</w:t>
-            </w:r>
-            <w:r>
-              <w:rPr>
-                <w:sz w:val="18"/>
-                <w:rtl/>
-              </w:rPr>
-              <w:t xml:space="preserve">، والتخزين السحابي للصور والمرفقات </w:t>
+              </w:rPr>
+              <w:t>(Firebase</w:t>
+            </w:r>
+            <w:r>
+              <w:rPr>
+                <w:rtl/>
+              </w:rPr>
+              <w:t xml:space="preserve"> </w:t>
             </w:r>
             <w:r>
               <w:rPr>
                 <w:noProof/>
-                <w:sz w:val="18"/>
-              </w:rPr>
-              <w:t>(S3‑Compatible Storage)</w:t>
-            </w:r>
-            <w:r>
-              <w:rPr>
-                <w:sz w:val="18"/>
-                <w:rtl/>
-              </w:rPr>
-              <w:t>.</w:t>
+              </w:rPr>
+              <w:t>Cloud</w:t>
+            </w:r>
+            <w:r>
+              <w:rPr>
+                <w:rtl/>
+              </w:rPr>
+              <w:t xml:space="preserve"> </w:t>
+            </w:r>
+            <w:r>
+              <w:rPr>
+                <w:noProof/>
+              </w:rPr>
+              <w:t>Messaging)</w:t>
+            </w:r>
+            <w:r>
+              <w:rPr>
+                <w:rtl/>
+              </w:rPr>
+              <w:t xml:space="preserve">، والتخزين المحلي الخاص للملفات والمرفقات على خادم </w:t>
+            </w:r>
+            <w:r>
+              <w:rPr>
+                <w:noProof/>
+              </w:rPr>
+              <w:t>Contabo.</w:t>
             </w:r>
           </w:p>
         </w:tc>
@@ -3191,13 +3697,55 @@
           <w:noProof/>
           <w:sz w:val="20"/>
         </w:rPr>
-        <w:t>(Client‑side Form Validation)</w:t>
+        <w:t>(Client</w:t>
       </w:r>
       <w:r>
         <w:rPr>
           <w:sz w:val="20"/>
           <w:rtl/>
         </w:rPr>
+        <w:t>‑</w:t>
+      </w:r>
+      <w:r>
+        <w:rPr>
+          <w:noProof/>
+          <w:sz w:val="20"/>
+        </w:rPr>
+        <w:t>side</w:t>
+      </w:r>
+      <w:r>
+        <w:rPr>
+          <w:sz w:val="20"/>
+          <w:rtl/>
+        </w:rPr>
+        <w:t> </w:t>
+      </w:r>
+      <w:r>
+        <w:rPr>
+          <w:noProof/>
+          <w:sz w:val="20"/>
+        </w:rPr>
+        <w:t>Form</w:t>
+      </w:r>
+      <w:r>
+        <w:rPr>
+          <w:sz w:val="20"/>
+          <w:rtl/>
+        </w:rPr>
+        <w:t> </w:t>
+      </w:r>
+      <w:r>
+        <w:rPr>
+          <w:noProof/>
+          <w:sz w:val="20"/>
+        </w:rPr>
+        <w:t>Validation)</w:t>
+      </w:r>
+      <w:r>
+        <w:rPr>
+          <w:sz w:val="20"/>
+          <w:rtl/>
+        </w:rPr>
         <w:t xml:space="preserve">؛ وتُستخدم قدرات الجهاز عبر طبقة تجريد المنصات وقنوات الاتصال بالنظام </w:t>
       </w:r>
       <w:r>
@@ -3205,13 +3753,55 @@
           <w:noProof/>
           <w:sz w:val="20"/>
         </w:rPr>
-        <w:t>(Platform Channels / Abstraction Layer)</w:t>
+        <w:t>(Platform</w:t>
       </w:r>
       <w:r>
         <w:rPr>
           <w:sz w:val="20"/>
           <w:rtl/>
         </w:rPr>
+        <w:t> </w:t>
+      </w:r>
+      <w:r>
+        <w:rPr>
+          <w:noProof/>
+          <w:sz w:val="20"/>
+        </w:rPr>
+        <w:t>Channels</w:t>
+      </w:r>
+      <w:r>
+        <w:rPr>
+          <w:sz w:val="20"/>
+          <w:rtl/>
+        </w:rPr>
+        <w:t> / </w:t>
+      </w:r>
+      <w:r>
+        <w:rPr>
+          <w:noProof/>
+          <w:sz w:val="20"/>
+        </w:rPr>
+        <w:t>Abstraction</w:t>
+      </w:r>
+      <w:r>
+        <w:rPr>
+          <w:sz w:val="20"/>
+          <w:rtl/>
+        </w:rPr>
+        <w:t> </w:t>
+      </w:r>
+      <w:r>
+        <w:rPr>
+          <w:noProof/>
+          <w:sz w:val="20"/>
+        </w:rPr>
+        <w:t>Layer)</w:t>
+      </w:r>
+      <w:r>
+        <w:rPr>
+          <w:sz w:val="20"/>
+          <w:rtl/>
+        </w:rPr>
         <w:t xml:space="preserve">. لا يُنسخ منطق الصلاحيات أو السعر أو النقاط إلى العميل. يحدد </w:t>
       </w:r>
       <w:r>
@@ -3219,7 +3809,35 @@
           <w:noProof/>
           <w:sz w:val="20"/>
         </w:rPr>
-        <w:t>(Feature Parity Matrix)</w:t>
+        <w:t>(Feature</w:t>
+      </w:r>
+      <w:r>
+        <w:rPr>
+          <w:sz w:val="20"/>
+          <w:rtl/>
+        </w:rPr>
+        <w:t> </w:t>
+      </w:r>
+      <w:r>
+        <w:rPr>
+          <w:noProof/>
+          <w:sz w:val="20"/>
+        </w:rPr>
+        <w:t>Parity</w:t>
+      </w:r>
+      <w:r>
+        <w:rPr>
+          <w:sz w:val="20"/>
+          <w:rtl/>
+        </w:rPr>
+        <w:t> </w:t>
+      </w:r>
+      <w:r>
+        <w:rPr>
+          <w:noProof/>
+          <w:sz w:val="20"/>
+        </w:rPr>
+        <w:t>Matrix)</w:t>
       </w:r>
       <w:r>
         <w:rPr>
@@ -3252,7 +3870,67 @@
         <w:rPr>
           <w:rtl/>
         </w:rPr>
-        <w:t>الوحدات تملك جداولها وعقودها وتنفذ المعاملات العابرة للوحدات داخل قاعدة واحدة. تُدار الرسائل والإشعارات الخارجية عبر نمط طوابير المهام الخلفية الموثوق (Transactional Outbox Pattern) ومعالجات (TypeScript Workers)، ويُعتمد سجل (WorkerTaskDispatch) لمهلة العامل ومتابعة حالات الإرسال. فشل (SMS) أو (Push) لا يعكس إسناد المهمة لكنه يطلق إعادة محاولة غير متزامنة وتنبيهاً للمشرف.</w:t>
+        <w:t xml:space="preserve">الوحدات تملك جداولها وعقودها وتنفذ المعاملات العابرة للوحدات داخل قاعدة واحدة. تُدار الرسائل والإشعارات الخارجية عبر معالجات المهام الخلفية </w:t>
+      </w:r>
+      <w:r>
+        <w:rPr>
+          <w:noProof/>
+        </w:rPr>
+        <w:t>(TypeScript</w:t>
+      </w:r>
+      <w:r>
+        <w:rPr>
+          <w:rtl/>
+        </w:rPr>
+        <w:t xml:space="preserve"> </w:t>
+      </w:r>
+      <w:r>
+        <w:rPr>
+          <w:noProof/>
+        </w:rPr>
+        <w:t>Workers)</w:t>
+      </w:r>
+      <w:r>
+        <w:rPr>
+          <w:rtl/>
+        </w:rPr>
+        <w:t xml:space="preserve">، ويُعتمد سجل </w:t>
+      </w:r>
+      <w:r>
+        <w:rPr>
+          <w:noProof/>
+        </w:rPr>
+        <w:t>(WorkerTaskDispatch)</w:t>
+      </w:r>
+      <w:r>
+        <w:rPr>
+          <w:rtl/>
+        </w:rPr>
+        <w:t xml:space="preserve"> لمهلة العامل ومتابعة حالات الإرسال دون إضافة كيان بيانات وسيط. فشل </w:t>
+      </w:r>
+      <w:r>
+        <w:rPr>
+          <w:noProof/>
+        </w:rPr>
+        <w:t>(SMS)</w:t>
+      </w:r>
+      <w:r>
+        <w:rPr>
+          <w:rtl/>
+        </w:rPr>
+        <w:t xml:space="preserve"> أو </w:t>
+      </w:r>
+      <w:r>
+        <w:rPr>
+          <w:noProof/>
+        </w:rPr>
+        <w:t>(Push)</w:t>
+      </w:r>
+      <w:r>
+        <w:rPr>
+          <w:rtl/>
+        </w:rPr>
+        <w:t xml:space="preserve"> لا يعكس إسناد المهمة لكنه يطلق إعادة محاولة غير متزامنة وتنبيهاً للمشرف.</w:t>
       </w:r>
     </w:p>
     <w:p>
@@ -3276,54 +3954,43 @@
           <w:color w:val="203A43"/>
           <w:sz w:val="24"/>
         </w:rPr>
-        <w:t>(System Architecture Diagram)</w:t>
-      </w:r>
-    </w:p>
-    <w:p>
-      <w:pPr>
-        <w:bidi/>
-        <w:jc w:val="center"/>
-      </w:pPr>
-      <w:r>
-        <w:rPr>
-          <w:noProof/>
-          <w:rtl/>
-        </w:rPr>
-        <w:drawing>
-          <wp:inline distT="0" distB="0" distL="0" distR="0" wp14:anchorId="073A474C" wp14:editId="61CDE348">
-            <wp:extent cx="5943600" cy="10167518"/>
-            <wp:effectExtent l="0" t="0" r="0" b="0"/>
-            <wp:docPr id="13" name="Picture 13"/>
-            <wp:cNvGraphicFramePr>
-              <a:graphicFrameLocks xmlns:a="http://schemas.openxmlformats.org/drawingml/2006/main" noChangeAspect="1"/>
-            </wp:cNvGraphicFramePr>
-            <a:graphic xmlns:a="http://schemas.openxmlformats.org/drawingml/2006/main">
-              <a:graphicData uri="http://schemas.openxmlformats.org/drawingml/2006/picture">
-                <pic:pic xmlns:pic="http://schemas.openxmlformats.org/drawingml/2006/picture">
-                  <pic:nvPicPr>
-                    <pic:cNvPr id="0" name="image.png"/>
-                    <pic:cNvPicPr/>
-                  </pic:nvPicPr>
-                  <pic:blipFill>
-                    <a:blip r:embed="rId19"/>
-                    <a:stretch>
-                      <a:fillRect/>
-                    </a:stretch>
-                  </pic:blipFill>
-                  <pic:spPr>
-                    <a:xfrm>
-                      <a:off x="0" y="0"/>
-                      <a:ext cx="5943600" cy="10167518"/>
-                    </a:xfrm>
-                    <a:prstGeom prst="rect">
-                      <a:avLst/>
-                    </a:prstGeom>
-                  </pic:spPr>
-                </pic:pic>
-              </a:graphicData>
-            </a:graphic>
-          </wp:inline>
-        </w:drawing>
+        <w:t>(System</w:t>
+      </w:r>
+      <w:r>
+        <w:rPr>
+          <w:b/>
+          <w:color w:val="203A43"/>
+          <w:sz w:val="24"/>
+          <w:rtl/>
+        </w:rPr>
+        <w:t> </w:t>
+      </w:r>
+      <w:r>
+        <w:rPr>
+          <w:b/>
+          <w:noProof/>
+          <w:color w:val="203A43"/>
+          <w:sz w:val="24"/>
+        </w:rPr>
+        <w:t>Architecture</w:t>
+      </w:r>
+      <w:r>
+        <w:rPr>
+          <w:b/>
+          <w:color w:val="203A43"/>
+          <w:sz w:val="24"/>
+          <w:rtl/>
+        </w:rPr>
+        <w:t> </w:t>
+      </w:r>
+      <w:r>
+        <w:rPr>
+          <w:b/>
+          <w:noProof/>
+          <w:color w:val="203A43"/>
+          <w:sz w:val="24"/>
+        </w:rPr>
+        <w:t>Diagram)</w:t>
       </w:r>
     </w:p>
     <w:p>
@@ -3331,6 +3998,12 @@
         <w:bidi/>
         <w:jc w:val="right"/>
       </w:pPr>
+    </w:p>
+    <w:p>
+      <w:pPr>
+        <w:bidi/>
+        <w:jc w:val="right"/>
+      </w:pPr>
       <w:r>
         <w:rPr>
           <w:i/>
@@ -3361,7 +4034,7 @@
           <w:noProof/>
           <w:color w:val="505A69"/>
         </w:rPr>
-        <w:t>(Fastify Modular Monolith)</w:t>
+        <w:t>(Fastify</w:t>
       </w:r>
       <w:r>
         <w:rPr>
@@ -3369,7 +4042,7 @@
           <w:color w:val="505A69"/>
           <w:rtl/>
         </w:rPr>
-        <w:t xml:space="preserve"> وطبقة التخزين وقواعد </w:t>
+        <w:t> </w:t>
       </w:r>
       <w:r>
         <w:rPr>
@@ -3377,7 +4050,7 @@
           <w:noProof/>
           <w:color w:val="505A69"/>
         </w:rPr>
-        <w:t>PostGIS</w:t>
+        <w:t>Modular</w:t>
       </w:r>
       <w:r>
         <w:rPr>
@@ -3385,6 +4058,38 @@
           <w:color w:val="505A69"/>
           <w:rtl/>
         </w:rPr>
+        <w:t> </w:t>
+      </w:r>
+      <w:r>
+        <w:rPr>
+          <w:i/>
+          <w:noProof/>
+          <w:color w:val="505A69"/>
+        </w:rPr>
+        <w:t>Monolith)</w:t>
+      </w:r>
+      <w:r>
+        <w:rPr>
+          <w:i/>
+          <w:color w:val="505A69"/>
+          <w:rtl/>
+        </w:rPr>
+        <w:t xml:space="preserve"> وطبقة التخزين وقواعد </w:t>
+      </w:r>
+      <w:r>
+        <w:rPr>
+          <w:i/>
+          <w:noProof/>
+          <w:color w:val="505A69"/>
+        </w:rPr>
+        <w:t>PostGIS</w:t>
+      </w:r>
+      <w:r>
+        <w:rPr>
+          <w:i/>
+          <w:color w:val="505A69"/>
+          <w:rtl/>
+        </w:rPr>
         <w:t xml:space="preserve"> ومعالجات المهام الخلفية غير المتزامنة </w:t>
       </w:r>
       <w:r>
@@ -3393,7 +4098,23 @@
           <w:noProof/>
           <w:color w:val="505A69"/>
         </w:rPr>
-        <w:t>(BullMQ Workers)</w:t>
+        <w:t>(BullMQ</w:t>
+      </w:r>
+      <w:r>
+        <w:rPr>
+          <w:i/>
+          <w:color w:val="505A69"/>
+          <w:rtl/>
+        </w:rPr>
+        <w:t> </w:t>
+      </w:r>
+      <w:r>
+        <w:rPr>
+          <w:i/>
+          <w:noProof/>
+          <w:color w:val="505A69"/>
+        </w:rPr>
+        <w:t>Workers)</w:t>
       </w:r>
       <w:r>
         <w:rPr>
@@ -3412,7 +4133,6 @@
       </w:pPr>
       <w:r>
         <w:rPr>
-          <w:rFonts w:ascii="Arial" w:hAnsi="Arial"/>
           <w:color w:val="102C57"/>
           <w:sz w:val="28"/>
           <w:rtl/>
@@ -3428,7 +4148,6 @@
       </w:pPr>
       <w:r>
         <w:rPr>
-          <w:rFonts w:ascii="Arial" w:hAnsi="Arial"/>
           <w:color w:val="203A43"/>
           <w:rtl/>
         </w:rPr>
@@ -3462,7 +4181,19 @@
         <w:rPr>
           <w:noProof/>
         </w:rPr>
-        <w:t>(Geofence Polygon)</w:t>
+        <w:t>(Geofence</w:t>
+      </w:r>
+      <w:r>
+        <w:rPr>
+          <w:rtl/>
+        </w:rPr>
+        <w:t> </w:t>
+      </w:r>
+      <w:r>
+        <w:rPr>
+          <w:noProof/>
+        </w:rPr>
+        <w:t>Polygon)</w:t>
       </w:r>
       <w:r>
         <w:rPr>
@@ -3486,7 +4217,19 @@
         <w:rPr>
           <w:noProof/>
         </w:rPr>
-        <w:t>(ST_Covers / ST_Contains)</w:t>
+        <w:t>(ST_Covers</w:t>
+      </w:r>
+      <w:r>
+        <w:rPr>
+          <w:rtl/>
+        </w:rPr>
+        <w:t> / </w:t>
+      </w:r>
+      <w:r>
+        <w:rPr>
+          <w:noProof/>
+        </w:rPr>
+        <w:t>ST_Contains)</w:t>
       </w:r>
       <w:r>
         <w:rPr>
@@ -3516,7 +4259,14 @@
         <w:rPr>
           <w:rtl/>
         </w:rPr>
-        <w:t xml:space="preserve"> والنسخة الجغرافية والسبب، دون إسناد أو حجز؛ تعرض رسالة «الخدمة غير متوفرة بعد في هذا النطاق، ستتوفر قريباً»، ويمكن طلب الانضمام إلى </w:t>
+        <w:t xml:space="preserve"> والنسخة الجغرافية والسبب، دون </w:t>
+      </w:r>
+      <w:r>
+        <w:rPr>
+          <w:rtl/>
+        </w:rPr>
+        <w:lastRenderedPageBreak/>
+        <w:t xml:space="preserve">إسناد أو حجز؛ تعرض رسالة «الخدمة غير متوفرة بعد في هذا النطاق، ستتوفر قريباً»، ويمكن طلب الانضمام إلى </w:t>
       </w:r>
       <w:r>
         <w:rPr>
@@ -3539,7 +4289,6 @@
       </w:pPr>
       <w:r>
         <w:rPr>
-          <w:rFonts w:ascii="Arial" w:hAnsi="Arial"/>
           <w:color w:val="203A43"/>
           <w:rtl/>
         </w:rPr>
@@ -3561,7 +4310,31 @@
         <w:rPr>
           <w:noProof/>
         </w:rPr>
-        <w:t>(Human‑Readable Entity Code)</w:t>
+        <w:t>(Human‑Readable</w:t>
+      </w:r>
+      <w:r>
+        <w:rPr>
+          <w:rtl/>
+        </w:rPr>
+        <w:t xml:space="preserve"> </w:t>
+      </w:r>
+      <w:r>
+        <w:rPr>
+          <w:noProof/>
+        </w:rPr>
+        <w:t>Entity</w:t>
+      </w:r>
+      <w:r>
+        <w:rPr>
+          <w:rtl/>
+        </w:rPr>
+        <w:t xml:space="preserve"> </w:t>
+      </w:r>
+      <w:r>
+        <w:rPr>
+          <w:noProof/>
+        </w:rPr>
+        <w:t>Code)</w:t>
       </w:r>
       <w:r>
         <w:rPr>
@@ -3579,31 +4352,43 @@
         <w:rPr>
           <w:rtl/>
         </w:rPr>
-        <w:t xml:space="preserve"> المطبوع على البطاقة رمز توثيق بصري مشفّر </w:t>
-      </w:r>
-      <w:r>
-        <w:rPr>
-          <w:noProof/>
-        </w:rPr>
-        <w:t>(Cryptographic Card Token)</w:t>
-      </w:r>
-      <w:r>
-        <w:rPr>
-          <w:rtl/>
-        </w:rPr>
-        <w:t xml:space="preserve"> مرتبطاً بالبطاقة الفيزيائية وليس بالمعرّف المحاسبي المجرد. يمسح العامل رمز البطاقة ليقوم الخادم بفك تشفيره والتحقق من سريانه وربطه بمهمة الجمع النشطة وحساب المستفيد، دون أن يحتوي الرمز على أي بيانات حساسة كالهاتف أو الاسم أو العنوان. يُطبع المعرّف القصير كنص واضح على البطاقة لاستخدامه في الإدخال اليدوي الطارئ من قِبل عامل موثق يمتلك مهمة نشطة. عند فقدان البطاقة، يتم إبطال الرمز البصري فوراً </w:t>
-      </w:r>
-      <w:r>
-        <w:rPr>
-          <w:noProof/>
-        </w:rPr>
-        <w:t>(Revoke Token)</w:t>
-      </w:r>
-      <w:r>
-        <w:rPr>
-          <w:rtl/>
-        </w:rPr>
-        <w:t xml:space="preserve"> في جدول </w:t>
+        <w:t xml:space="preserve"> المطبوع على البطاقة التمثيل البصري لهذا المعرّف المحاسبي </w:t>
+      </w:r>
+      <w:r>
+        <w:rPr>
+          <w:noProof/>
+        </w:rPr>
+        <w:t>(Unique</w:t>
+      </w:r>
+      <w:r>
+        <w:rPr>
+          <w:rtl/>
+        </w:rPr>
+        <w:t xml:space="preserve"> </w:t>
+      </w:r>
+      <w:r>
+        <w:rPr>
+          <w:noProof/>
+        </w:rPr>
+        <w:t>Entity</w:t>
+      </w:r>
+      <w:r>
+        <w:rPr>
+          <w:rtl/>
+        </w:rPr>
+        <w:t xml:space="preserve"> </w:t>
+      </w:r>
+      <w:r>
+        <w:rPr>
+          <w:noProof/>
+        </w:rPr>
+        <w:t>ID).</w:t>
+      </w:r>
+      <w:r>
+        <w:rPr>
+          <w:rtl/>
+        </w:rPr>
+        <w:t xml:space="preserve"> يمسح العامل رمز البطاقة بكاميرا تطبيقه ليقوم الخادم بمطابقة المعرّف والتحقق من سريانه وربطه بمهمة الجمع النشطة وحساب المستفيد، دون أن يحتوي الرمز على أي بيانات حساسة كالهاتف أو الاسم أو العنوان. يُطبع المعرّف القصير كنص واضح على البطاقة لاستخدامه في الإدخال اليدوي الطارئ من قِبل عامل موثق يمتلك مهمة نشطة. عند فقدان البطاقة، يتم تعليق البطاقة فوراً وإصدار بطاقة بديلة في جدول </w:t>
       </w:r>
       <w:r>
         <w:rPr>
@@ -3615,7 +4400,7 @@
         <w:rPr>
           <w:rtl/>
         </w:rPr>
-        <w:t xml:space="preserve"> وإصدار بطاقة برمز بصري جديد، مع بقاء المعرّف المحاسبي للأسرة وسجلاتها التاريخية ثابتاً دون انقطاع. في الويب، تستخدم الكاميرا عند منح الإذن أو إدخال المعرّف يدوياً بنفس الضوابط الصارمة.</w:t>
+        <w:t xml:space="preserve"> مع بقاء المعرّف المحاسبي للأسرة وسجلاتها التاريخية ثابتاً دون انقطاع. ولا يُعد الرمز بمفرده عاملاً للمصادقة أو سرّاً. في الويب، تستخدم الكاميرا عند منح الإذن أو إدخال المعرّف يدوياً بنفس الضوابط الصارمة.</w:t>
       </w:r>
     </w:p>
     <w:p>
@@ -3626,7 +4411,6 @@
       </w:pPr>
       <w:r>
         <w:rPr>
-          <w:rFonts w:ascii="Arial" w:hAnsi="Arial"/>
           <w:color w:val="203A43"/>
           <w:rtl/>
         </w:rPr>
@@ -3642,7 +4426,55 @@
         <w:rPr>
           <w:rtl/>
         </w:rPr>
-        <w:t>بعد إسناد مهمة، ينشئ السيرفر (WorkerTaskDispatch) بوقت استحقاق بعد 10 دقائق، ويرسل (Push). إذا لم يصل إقرار العامل أونلاين قبل المهلة، يرسل السيرفر تلقائياً (SMS) واحدة تحمل رقم المهمة والعنوان المختصر والإحداثيات النصية ورابط الخرائط. لا تعني رسالة (SMS) أن العامل أقر المهمة. إذا تأخر الإقرار 20 دقيقة ينبه المشرف؛ لا يبدل العامل تلقائياً. إقرار متزامن مع انتهاء المهلة يحسم بقفل وتوقيت السيرفر؛ لا تُرسل رسالة جديدة لمهمة أقرت قبل الاستحقاق.</w:t>
+        <w:t xml:space="preserve">بعد إسناد مهمة، ينشئ السيرفر </w:t>
+      </w:r>
+      <w:r>
+        <w:rPr>
+          <w:noProof/>
+        </w:rPr>
+        <w:t>(WorkerTaskDispatch)</w:t>
+      </w:r>
+      <w:r>
+        <w:rPr>
+          <w:rtl/>
+        </w:rPr>
+        <w:t xml:space="preserve"> بوقت استحقاق بعد 10 دقائق، ويرسل </w:t>
+      </w:r>
+      <w:r>
+        <w:rPr>
+          <w:noProof/>
+        </w:rPr>
+        <w:t>(Push).</w:t>
+      </w:r>
+      <w:r>
+        <w:rPr>
+          <w:rtl/>
+        </w:rPr>
+        <w:t xml:space="preserve"> إذا لم يصل إقرار العامل أونلاين قبل المهلة، يرسل السيرفر تلقائياً </w:t>
+      </w:r>
+      <w:r>
+        <w:rPr>
+          <w:noProof/>
+        </w:rPr>
+        <w:t>(SMS)</w:t>
+      </w:r>
+      <w:r>
+        <w:rPr>
+          <w:rtl/>
+        </w:rPr>
+        <w:t xml:space="preserve"> واحدة تحمل رقم المهمة والعنوان المختصر والإحداثيات النصية ورابط الخرائط. لا تعني رسالة </w:t>
+      </w:r>
+      <w:r>
+        <w:rPr>
+          <w:noProof/>
+        </w:rPr>
+        <w:t>(SMS)</w:t>
+      </w:r>
+      <w:r>
+        <w:rPr>
+          <w:rtl/>
+        </w:rPr>
+        <w:t xml:space="preserve"> أن العامل أقر المهمة. إذا تأخر الإقرار 20 دقيقة ينبه المشرف؛ لا يبدل العامل تلقائياً. إقرار متزامن مع انتهاء المهلة يحسم بقفل وتوقيت السيرفر؛ لا تُرسل رسالة جديدة لمهمة أقرت قبل الاستحقاق.</w:t>
       </w:r>
     </w:p>
     <w:p>
@@ -3660,7 +4492,31 @@
         <w:rPr>
           <w:noProof/>
         </w:rPr>
-        <w:t>(Append‑Only Ledger)</w:t>
+        <w:t>(Append</w:t>
+      </w:r>
+      <w:r>
+        <w:rPr>
+          <w:rtl/>
+        </w:rPr>
+        <w:t>‑</w:t>
+      </w:r>
+      <w:r>
+        <w:rPr>
+          <w:noProof/>
+        </w:rPr>
+        <w:t>Only</w:t>
+      </w:r>
+      <w:r>
+        <w:rPr>
+          <w:rtl/>
+        </w:rPr>
+        <w:t> </w:t>
+      </w:r>
+      <w:r>
+        <w:rPr>
+          <w:noProof/>
+        </w:rPr>
+        <w:t>Ledger)</w:t>
       </w:r>
       <w:r>
         <w:rPr>
@@ -3672,7 +4528,19 @@
         <w:rPr>
           <w:noProof/>
         </w:rPr>
-        <w:t>(Batch Payload)</w:t>
+        <w:t>(Batch</w:t>
+      </w:r>
+      <w:r>
+        <w:rPr>
+          <w:rtl/>
+        </w:rPr>
+        <w:t> </w:t>
+      </w:r>
+      <w:r>
+        <w:rPr>
+          <w:noProof/>
+        </w:rPr>
+        <w:t>Payload)</w:t>
       </w:r>
       <w:r>
         <w:rPr>
@@ -3688,68 +4556,27 @@
       </w:pPr>
       <w:r>
         <w:rPr>
-          <w:b/>
-          <w:color w:val="203A43"/>
-          <w:sz w:val="24"/>
-          <w:rtl/>
-        </w:rPr>
-        <w:t xml:space="preserve">3 3 1 مخطط التتابع الزمني للجمع الميداني والوزن الذكي وصرف النقاط </w:t>
-      </w:r>
-      <w:r>
-        <w:rPr>
-          <w:b/>
-          <w:noProof/>
-          <w:color w:val="203A43"/>
-          <w:sz w:val="24"/>
-        </w:rPr>
-        <w:t>(Sequence Flow)</w:t>
-      </w:r>
-    </w:p>
-    <w:p>
-      <w:pPr>
-        <w:bidi/>
-        <w:jc w:val="center"/>
-      </w:pPr>
-      <w:r>
-        <w:rPr>
-          <w:noProof/>
-          <w:rtl/>
-        </w:rPr>
-        <w:drawing>
-          <wp:inline distT="0" distB="0" distL="0" distR="0" wp14:anchorId="32953599" wp14:editId="2135EC66">
-            <wp:extent cx="5943600" cy="4223918"/>
-            <wp:effectExtent l="0" t="0" r="0" b="0"/>
-            <wp:docPr id="14" name="Picture 14"/>
-            <wp:cNvGraphicFramePr>
-              <a:graphicFrameLocks xmlns:a="http://schemas.openxmlformats.org/drawingml/2006/main" noChangeAspect="1"/>
-            </wp:cNvGraphicFramePr>
-            <a:graphic xmlns:a="http://schemas.openxmlformats.org/drawingml/2006/main">
-              <a:graphicData uri="http://schemas.openxmlformats.org/drawingml/2006/picture">
-                <pic:pic xmlns:pic="http://schemas.openxmlformats.org/drawingml/2006/picture">
-                  <pic:nvPicPr>
-                    <pic:cNvPr id="0" name="image.png"/>
-                    <pic:cNvPicPr/>
-                  </pic:nvPicPr>
-                  <pic:blipFill>
-                    <a:blip r:embed="rId20"/>
-                    <a:stretch>
-                      <a:fillRect/>
-                    </a:stretch>
-                  </pic:blipFill>
-                  <pic:spPr>
-                    <a:xfrm>
-                      <a:off x="0" y="0"/>
-                      <a:ext cx="5943600" cy="4223918"/>
-                    </a:xfrm>
-                    <a:prstGeom prst="rect">
-                      <a:avLst/>
-                    </a:prstGeom>
-                  </pic:spPr>
-                </pic:pic>
-              </a:graphicData>
-            </a:graphic>
-          </wp:inline>
-        </w:drawing>
+          <w:rtl/>
+        </w:rPr>
+        <w:t xml:space="preserve">3 3 1 مخطط التتابع الزمني للجمع الميداني وتسجيل الأوزان وصرف النقاط </w:t>
+      </w:r>
+      <w:r>
+        <w:rPr>
+          <w:noProof/>
+        </w:rPr>
+        <w:t>(Sequence</w:t>
+      </w:r>
+      <w:r>
+        <w:rPr>
+          <w:rtl/>
+        </w:rPr>
+        <w:t xml:space="preserve"> </w:t>
+      </w:r>
+      <w:r>
+        <w:rPr>
+          <w:noProof/>
+        </w:rPr>
+        <w:t>Flow)</w:t>
       </w:r>
     </w:p>
     <w:p>
@@ -3757,11 +4584,23 @@
         <w:bidi/>
         <w:jc w:val="right"/>
       </w:pPr>
-      <w:r>
-        <w:rPr>
-          <w:rtl/>
-        </w:rPr>
-        <w:t>شكل (2): دورة حياة استلام النفايات والوزن الميداني وتسجيل مرجع الميزان يدوياً وتوليد قيود القيد المزدوج للنقاط وإشعار المواطن فورياً عبر معالج المهام الخلفية (BullMQ).</w:t>
+    </w:p>
+    <w:p>
+      <w:pPr>
+        <w:bidi/>
+        <w:jc w:val="right"/>
+      </w:pPr>
+      <w:r>
+        <w:rPr>
+          <w:rtl/>
+        </w:rPr>
+        <w:t xml:space="preserve">شكل (2): دورة حياة استلام النفايات والوزن الميداني وتسجيل مرجع الميزان يدوياً وتوليد قيود القيد المزدوج للنقاط وإشعار المواطن فورياً عبر معالج المهام الخلفية </w:t>
+      </w:r>
+      <w:r>
+        <w:rPr>
+          <w:noProof/>
+        </w:rPr>
+        <w:t>(BullMQ).</w:t>
       </w:r>
     </w:p>
     <w:p>
@@ -3772,7 +4611,6 @@
       </w:pPr>
       <w:r>
         <w:rPr>
-          <w:rFonts w:ascii="Arial" w:hAnsi="Arial"/>
           <w:color w:val="203A43"/>
           <w:rtl/>
         </w:rPr>
@@ -3830,7 +4668,31 @@
         <w:rPr>
           <w:noProof/>
         </w:rPr>
-        <w:t>(Atomic Stock Reservation)</w:t>
+        <w:t>(Atomic</w:t>
+      </w:r>
+      <w:r>
+        <w:rPr>
+          <w:rtl/>
+        </w:rPr>
+        <w:t> </w:t>
+      </w:r>
+      <w:r>
+        <w:rPr>
+          <w:noProof/>
+        </w:rPr>
+        <w:t>Stock</w:t>
+      </w:r>
+      <w:r>
+        <w:rPr>
+          <w:rtl/>
+        </w:rPr>
+        <w:t> </w:t>
+      </w:r>
+      <w:r>
+        <w:rPr>
+          <w:noProof/>
+        </w:rPr>
+        <w:t>Reservation)</w:t>
       </w:r>
       <w:r>
         <w:rPr>
@@ -3854,7 +4716,19 @@
         <w:rPr>
           <w:noProof/>
         </w:rPr>
-        <w:t>(Release Order)</w:t>
+        <w:t>(Release</w:t>
+      </w:r>
+      <w:r>
+        <w:rPr>
+          <w:rtl/>
+        </w:rPr>
+        <w:t> </w:t>
+      </w:r>
+      <w:r>
+        <w:rPr>
+          <w:noProof/>
+        </w:rPr>
+        <w:t>Order)</w:t>
       </w:r>
       <w:r>
         <w:rPr>
@@ -3914,49 +4788,524 @@
         <w:rPr>
           <w:rtl/>
         </w:rPr>
-        <w:t>تتكامل بوابة الإدارة والعمليات المركزية (Back‑Office Web Portal) مع خادم (Node.js) لتمكين الموظفين من إدارة ستة مسارات تشغيلية حاسمة تضمن انضباط العمل الميداني:</w:t>
+        <w:lastRenderedPageBreak/>
+        <w:t xml:space="preserve">تتكامل بوابة الإدارة والعمليات المركزية </w:t>
+      </w:r>
+      <w:r>
+        <w:rPr>
+          <w:noProof/>
+        </w:rPr>
+        <w:t>(Back</w:t>
+      </w:r>
+      <w:r>
+        <w:rPr>
+          <w:rtl/>
+        </w:rPr>
+        <w:t>‑</w:t>
+      </w:r>
+      <w:r>
+        <w:rPr>
+          <w:noProof/>
+        </w:rPr>
+        <w:t>Office</w:t>
+      </w:r>
+      <w:r>
+        <w:rPr>
+          <w:rtl/>
+        </w:rPr>
+        <w:t> </w:t>
+      </w:r>
+      <w:r>
+        <w:rPr>
+          <w:noProof/>
+        </w:rPr>
+        <w:t>Web</w:t>
+      </w:r>
+      <w:r>
+        <w:rPr>
+          <w:rtl/>
+        </w:rPr>
+        <w:t> </w:t>
+      </w:r>
+      <w:r>
+        <w:rPr>
+          <w:noProof/>
+        </w:rPr>
+        <w:t>Portal)</w:t>
+      </w:r>
+      <w:r>
+        <w:rPr>
+          <w:rtl/>
+        </w:rPr>
+        <w:t xml:space="preserve"> مع خادم </w:t>
+      </w:r>
+      <w:r>
+        <w:rPr>
+          <w:noProof/>
+        </w:rPr>
+        <w:t>(Node.js)</w:t>
+      </w:r>
+      <w:r>
+        <w:rPr>
+          <w:rtl/>
+        </w:rPr>
+        <w:t xml:space="preserve"> لتمكين الموظفين من إدارة ستة مسارات تشغيلية حاسمة تضمن انضباط العمل الميداني:</w:t>
       </w:r>
       <w:r>
         <w:rPr>
           <w:rtl/>
         </w:rPr>
         <w:br/>
-        <w:t>1. غرفة المراقبة الميدانية والإسناد الحي (Dispatch Cockpit): تعرض خريطة تفاعلية لمديرية المنصورة مسارات العمال ونقاط الجمع والطلبات المعلقة؛ وتتيح للمشرف إعادة إسناد المهمة يدوياً لعامل بديل في حال تعطل العامل أو انقضاء مهلة الاستجابة (10 دقائق) مع تدوين السبب الإداري إجبارياً في سجل التدقيق.</w:t>
+        <w:t xml:space="preserve">1. غرفة المراقبة الميدانية والإسناد الحي </w:t>
+      </w:r>
+      <w:r>
+        <w:rPr>
+          <w:noProof/>
+        </w:rPr>
+        <w:t>(Dispatch</w:t>
+      </w:r>
+      <w:r>
+        <w:rPr>
+          <w:rtl/>
+        </w:rPr>
+        <w:t> </w:t>
+      </w:r>
+      <w:r>
+        <w:rPr>
+          <w:noProof/>
+        </w:rPr>
+        <w:t>Cockpit):</w:t>
+      </w:r>
+      <w:r>
+        <w:rPr>
+          <w:rtl/>
+        </w:rPr>
+        <w:t xml:space="preserve"> تعرض خريطة تفاعلية لمديرية المنصورة مسارات العمال ونقاط الجمع والطلبات المعلقة؛ وتتيح للمشرف إعادة إسناد المهمة يدوياً لعامل بديل في حال تعطل العامل أو انقضاء مهلة الاستجابة (10 دقائق) مع تدوين السبب الإداري إجبارياً في سجل التدقيق.</w:t>
       </w:r>
       <w:r>
         <w:rPr>
           <w:rtl/>
         </w:rPr>
         <w:br/>
-        <w:t>2. مركز خدمة العملاء والشكاوى (Customer Service &amp; CRM): توفر شاشة «ملف المستفيد الشامل (Citizen 360 View)» عبر الهاتف الموثق أو الرمز الحسابي (entity_code)، مع إدارة دورة حياة البلاغات الميدانية (IncidentReport) ومراجعة استثناءات الأوزان لبلاغات عدم الحضور أو النزاع على الأوزان، وإمكانية إبطال بطاقة (QR) المفقودة وإصدار بطاقة بديلة فورياً دون المساس بالحساب أو السجل التاريخي.</w:t>
+        <w:t xml:space="preserve">2. مركز خدمة العملاء والشكاوى </w:t>
+      </w:r>
+      <w:r>
+        <w:rPr>
+          <w:noProof/>
+        </w:rPr>
+        <w:t>(Customer</w:t>
+      </w:r>
+      <w:r>
+        <w:rPr>
+          <w:rtl/>
+        </w:rPr>
+        <w:t xml:space="preserve"> </w:t>
+      </w:r>
+      <w:r>
+        <w:rPr>
+          <w:noProof/>
+        </w:rPr>
+        <w:t>Service</w:t>
+      </w:r>
+      <w:r>
+        <w:rPr>
+          <w:rtl/>
+        </w:rPr>
+        <w:t xml:space="preserve"> &amp; </w:t>
+      </w:r>
+      <w:r>
+        <w:rPr>
+          <w:noProof/>
+        </w:rPr>
+        <w:t>CRM):</w:t>
+      </w:r>
+      <w:r>
+        <w:rPr>
+          <w:rtl/>
+        </w:rPr>
+        <w:t xml:space="preserve"> توفر شاشة «ملف المستفيد الشامل </w:t>
+      </w:r>
+      <w:r>
+        <w:rPr>
+          <w:noProof/>
+        </w:rPr>
+        <w:t>(Citizen</w:t>
+      </w:r>
+      <w:r>
+        <w:rPr>
+          <w:rtl/>
+        </w:rPr>
+        <w:t> 360 </w:t>
+      </w:r>
+      <w:r>
+        <w:rPr>
+          <w:noProof/>
+        </w:rPr>
+        <w:t>View)</w:t>
+      </w:r>
+      <w:r>
+        <w:rPr>
+          <w:rtl/>
+        </w:rPr>
+        <w:t xml:space="preserve">» عبر الهاتف الموثق أو الرمز الحسابي </w:t>
+      </w:r>
+      <w:r>
+        <w:rPr>
+          <w:noProof/>
+        </w:rPr>
+        <w:t>(entity_code)</w:t>
+      </w:r>
+      <w:r>
+        <w:rPr>
+          <w:rtl/>
+        </w:rPr>
+        <w:t xml:space="preserve">، مع إدارة دورة حياة البلاغات الميدانية </w:t>
+      </w:r>
+      <w:r>
+        <w:rPr>
+          <w:noProof/>
+        </w:rPr>
+        <w:t>(IncidentReport)</w:t>
+      </w:r>
+      <w:r>
+        <w:rPr>
+          <w:rtl/>
+        </w:rPr>
+        <w:t xml:space="preserve"> ومراجعة استثناءات الأوزان لبلاغات عدم الحضور أو النزاع على الأوزان، وإمكانية إبطال بطاقة </w:t>
+      </w:r>
+      <w:r>
+        <w:rPr>
+          <w:noProof/>
+        </w:rPr>
+        <w:t>(QR)</w:t>
+      </w:r>
+      <w:r>
+        <w:rPr>
+          <w:rtl/>
+        </w:rPr>
+        <w:t xml:space="preserve"> المفقودة وإصدار بطاقة بديلة فورياً دون المساس بالحساب أو السجل التاريخي.</w:t>
       </w:r>
       <w:r>
         <w:rPr>
           <w:rtl/>
         </w:rPr>
         <w:br/>
-        <w:t>3. إدارة كتالوج المتجر والمستودعات (Store &amp; Inventory Management): تتيح لمسؤول المتجر تسعير السلع بالنقاط وتحديد سقوف الاستبدال، ومراقبة المخزون الفعلي، وفحص إيصالات التحويل البنكي المرفقة للطلبات واعتمادها لإصدار أمر الصرف (Release Order) ومحضر التسليم.</w:t>
+        <w:t xml:space="preserve">3. إدارة كتالوج المتجر والمستودعات </w:t>
+      </w:r>
+      <w:r>
+        <w:rPr>
+          <w:noProof/>
+        </w:rPr>
+        <w:t>(Store</w:t>
+      </w:r>
+      <w:r>
+        <w:rPr>
+          <w:rtl/>
+        </w:rPr>
+        <w:t xml:space="preserve"> &amp; </w:t>
+      </w:r>
+      <w:r>
+        <w:rPr>
+          <w:noProof/>
+        </w:rPr>
+        <w:t>Inventory</w:t>
+      </w:r>
+      <w:r>
+        <w:rPr>
+          <w:rtl/>
+        </w:rPr>
+        <w:t xml:space="preserve"> </w:t>
+      </w:r>
+      <w:r>
+        <w:rPr>
+          <w:noProof/>
+        </w:rPr>
+        <w:t>Management):</w:t>
+      </w:r>
+      <w:r>
+        <w:rPr>
+          <w:rtl/>
+        </w:rPr>
+        <w:t xml:space="preserve"> تتيح لمسؤول المتجر تسعير السلع بالنقاط وتحديد سقوف الاستبدال، ومراقبة المخزون الفعلي، وفحص إيصالات التحويل البنكي المرفقة للطلبات واعتمادها لإصدار أمر الصرف </w:t>
+      </w:r>
+      <w:r>
+        <w:rPr>
+          <w:noProof/>
+        </w:rPr>
+        <w:t>(Release</w:t>
+      </w:r>
+      <w:r>
+        <w:rPr>
+          <w:rtl/>
+        </w:rPr>
+        <w:t> </w:t>
+      </w:r>
+      <w:r>
+        <w:rPr>
+          <w:noProof/>
+        </w:rPr>
+        <w:t>Order)</w:t>
+      </w:r>
+      <w:r>
+        <w:rPr>
+          <w:rtl/>
+        </w:rPr>
+        <w:t xml:space="preserve"> ومحضر التسليم.</w:t>
       </w:r>
       <w:r>
         <w:rPr>
           <w:rtl/>
         </w:rPr>
         <w:br/>
-        <w:t>4. التسويات المالية والرقابة على النقاط (Finance &amp; Reconciliation): مراجعة مطابقة قيود دفتر النقاط المزدوج (Double‑Entry Ledger Audit)، ومراجعة إيرادات مبيعات المتجر وتسليمات المواد للشركاء (PartnerDelivery)، واعتماد ترحيل دفعات نهاية اليوم للعمليات غير المتصلة (FieldBatchImport).</w:t>
+        <w:t xml:space="preserve">4. التسويات المالية والرقابة على النقاط </w:t>
+      </w:r>
+      <w:r>
+        <w:rPr>
+          <w:noProof/>
+        </w:rPr>
+        <w:t>(Finance</w:t>
+      </w:r>
+      <w:r>
+        <w:rPr>
+          <w:rtl/>
+        </w:rPr>
+        <w:t xml:space="preserve"> &amp; </w:t>
+      </w:r>
+      <w:r>
+        <w:rPr>
+          <w:noProof/>
+        </w:rPr>
+        <w:t>Reconciliation):</w:t>
+      </w:r>
+      <w:r>
+        <w:rPr>
+          <w:rtl/>
+        </w:rPr>
+        <w:t xml:space="preserve"> مراجعة مطابقة قيود دفتر النقاط المزدوج </w:t>
+      </w:r>
+      <w:r>
+        <w:rPr>
+          <w:noProof/>
+        </w:rPr>
+        <w:t>(Double</w:t>
+      </w:r>
+      <w:r>
+        <w:rPr>
+          <w:rtl/>
+        </w:rPr>
+        <w:t>‑</w:t>
+      </w:r>
+      <w:r>
+        <w:rPr>
+          <w:noProof/>
+        </w:rPr>
+        <w:t>Entry</w:t>
+      </w:r>
+      <w:r>
+        <w:rPr>
+          <w:rtl/>
+        </w:rPr>
+        <w:t> </w:t>
+      </w:r>
+      <w:r>
+        <w:rPr>
+          <w:noProof/>
+        </w:rPr>
+        <w:t>Ledger</w:t>
+      </w:r>
+      <w:r>
+        <w:rPr>
+          <w:rtl/>
+        </w:rPr>
+        <w:t> </w:t>
+      </w:r>
+      <w:r>
+        <w:rPr>
+          <w:noProof/>
+        </w:rPr>
+        <w:t>Audit)</w:t>
+      </w:r>
+      <w:r>
+        <w:rPr>
+          <w:rtl/>
+        </w:rPr>
+        <w:t xml:space="preserve">، ومراجعة إيرادات مبيعات المتجر وتسليمات المواد للشركاء </w:t>
+      </w:r>
+      <w:r>
+        <w:rPr>
+          <w:noProof/>
+        </w:rPr>
+        <w:t>(PartnerDelivery)</w:t>
+      </w:r>
+      <w:r>
+        <w:rPr>
+          <w:rtl/>
+        </w:rPr>
+        <w:t xml:space="preserve">، واعتماد ترحيل دفعات نهاية اليوم للعمليات غير المتصلة </w:t>
+      </w:r>
+      <w:r>
+        <w:rPr>
+          <w:noProof/>
+        </w:rPr>
+        <w:t>(FieldBatchImport).</w:t>
       </w:r>
       <w:r>
         <w:rPr>
           <w:rtl/>
         </w:rPr>
         <w:br/>
-        <w:t>5. محرر النطاقات الجغرافية والسياسات (GIS &amp; Policy Management): رسم وتحديث حدود النطاق الجغرافي لمديرية المنصورة وإصدار نسخ جغرافية مؤرخة جديدة (Versioned Geofences)، وتحليل خريطة الطلبات المرفوضة خارج النطاق لتحديد أولويات التوسع.</w:t>
+        <w:t xml:space="preserve">5. محرر النطاقات الجغرافية والسياسات </w:t>
+      </w:r>
+      <w:r>
+        <w:rPr>
+          <w:noProof/>
+        </w:rPr>
+        <w:t>(GIS</w:t>
+      </w:r>
+      <w:r>
+        <w:rPr>
+          <w:rtl/>
+        </w:rPr>
+        <w:t xml:space="preserve"> &amp; </w:t>
+      </w:r>
+      <w:r>
+        <w:rPr>
+          <w:noProof/>
+        </w:rPr>
+        <w:t>Policy</w:t>
+      </w:r>
+      <w:r>
+        <w:rPr>
+          <w:rtl/>
+        </w:rPr>
+        <w:t xml:space="preserve"> </w:t>
+      </w:r>
+      <w:r>
+        <w:rPr>
+          <w:noProof/>
+        </w:rPr>
+        <w:t>Management):</w:t>
+      </w:r>
+      <w:r>
+        <w:rPr>
+          <w:rtl/>
+        </w:rPr>
+        <w:t xml:space="preserve"> رسم وتحديث حدود النطاق الجغرافي لمديرية المنصورة وإصدار نسخ جغرافية مؤرخة جديدة </w:t>
+      </w:r>
+      <w:r>
+        <w:rPr>
+          <w:noProof/>
+        </w:rPr>
+        <w:t>(Versioned</w:t>
+      </w:r>
+      <w:r>
+        <w:rPr>
+          <w:rtl/>
+        </w:rPr>
+        <w:t> </w:t>
+      </w:r>
+      <w:r>
+        <w:rPr>
+          <w:noProof/>
+        </w:rPr>
+        <w:t>Geofences)</w:t>
+      </w:r>
+      <w:r>
+        <w:rPr>
+          <w:rtl/>
+        </w:rPr>
+        <w:t>، وتحليل خريطة الطلبات المرفوضة خارج النطاق لتحديد أولويات التوسع.</w:t>
       </w:r>
       <w:r>
         <w:rPr>
           <w:rtl/>
         </w:rPr>
         <w:br/>
-        <w:t>6. قبة الرقابة والتدقيق والأمان (Security &amp; Audit Cockpit): استعراض سجل التدقيق غير القابل للتعديل (Immutable AuditLog) لكافة إجراءات الموظفين، وإدارة الصلاحيات الدقيقة (RBAC)، وتفعيل المصادقة الثنائية (2FA) لموظفي الإدارة.</w:t>
+        <w:t xml:space="preserve">6. قبة الرقابة والتدقيق والأمان </w:t>
+      </w:r>
+      <w:r>
+        <w:rPr>
+          <w:noProof/>
+        </w:rPr>
+        <w:t>(Security</w:t>
+      </w:r>
+      <w:r>
+        <w:rPr>
+          <w:rtl/>
+        </w:rPr>
+        <w:t xml:space="preserve"> &amp; </w:t>
+      </w:r>
+      <w:r>
+        <w:rPr>
+          <w:noProof/>
+        </w:rPr>
+        <w:t>Audit</w:t>
+      </w:r>
+      <w:r>
+        <w:rPr>
+          <w:rtl/>
+        </w:rPr>
+        <w:t xml:space="preserve"> </w:t>
+      </w:r>
+      <w:r>
+        <w:rPr>
+          <w:noProof/>
+        </w:rPr>
+        <w:t>Cockpit):</w:t>
+      </w:r>
+      <w:r>
+        <w:rPr>
+          <w:rtl/>
+        </w:rPr>
+        <w:t xml:space="preserve"> استعراض سجل التدقيق غير القابل للتعديل </w:t>
+      </w:r>
+      <w:r>
+        <w:rPr>
+          <w:noProof/>
+        </w:rPr>
+        <w:t>(Immutable</w:t>
+      </w:r>
+      <w:r>
+        <w:rPr>
+          <w:rtl/>
+        </w:rPr>
+        <w:t> </w:t>
+      </w:r>
+      <w:r>
+        <w:rPr>
+          <w:noProof/>
+        </w:rPr>
+        <w:t>AuditLog)</w:t>
+      </w:r>
+      <w:r>
+        <w:rPr>
+          <w:rtl/>
+        </w:rPr>
+        <w:t xml:space="preserve"> لكافة إجراءات الموظفين، وإدارة الصلاحيات الدقيقة </w:t>
+      </w:r>
+      <w:r>
+        <w:rPr>
+          <w:noProof/>
+        </w:rPr>
+        <w:t>(RBAC)</w:t>
+      </w:r>
+      <w:r>
+        <w:rPr>
+          <w:rtl/>
+        </w:rPr>
+        <w:t xml:space="preserve">، وتفعيل المصادقة الثنائية </w:t>
+      </w:r>
+      <w:r>
+        <w:rPr>
+          <w:noProof/>
+        </w:rPr>
+        <w:t>(2FA)</w:t>
+      </w:r>
+      <w:r>
+        <w:rPr>
+          <w:rtl/>
+        </w:rPr>
+        <w:t xml:space="preserve"> لموظفي الإدارة.</w:t>
       </w:r>
     </w:p>
     <w:p>
@@ -4939,6 +6288,7 @@
         <w:rPr>
           <w:rtl/>
         </w:rPr>
+        <w:lastRenderedPageBreak/>
         <w:t>5 نموذج قواعد البيانات الموحد</w:t>
       </w:r>
     </w:p>
@@ -4951,7 +6301,139 @@
         <w:rPr>
           <w:rtl/>
         </w:rPr>
-        <w:t>الأنواع الإرشادية: (UUID) للمفاتيح الداخلية، و(TEXT) للمعرّفات والهواتف المشفرة، و(NUMERIC(12,3)) للكتلة، و(NUMERIC(14,2)) للنقد، و(TIMESTAMPTZ) للأوقات، و(GEOGRAPHY/GEOMETRY) للموقع. جميع الجداول التشغيلية تحمل (id)، و(created_at)، و(updated_at)، و(version) ما لم يذكر خلافه؛ تحفظ أوقات السيرفر بتوقيت (UTC). تفرض المفاتيح الأجنبية والقيود والفهارس داخل قاعدة البيانات، وتوثق قوائم الحالات بإصدارات. البنود التالية هي الكيانات الخمسة والعشرون المعتمدة حصراً.</w:t>
+        <w:t xml:space="preserve">الأنواع الإرشادية: </w:t>
+      </w:r>
+      <w:r>
+        <w:rPr>
+          <w:noProof/>
+        </w:rPr>
+        <w:t>(UUID)</w:t>
+      </w:r>
+      <w:r>
+        <w:rPr>
+          <w:rtl/>
+        </w:rPr>
+        <w:t xml:space="preserve"> للمفاتيح الداخلية، و</w:t>
+      </w:r>
+      <w:r>
+        <w:rPr>
+          <w:noProof/>
+        </w:rPr>
+        <w:t>(TEXT)</w:t>
+      </w:r>
+      <w:r>
+        <w:rPr>
+          <w:rtl/>
+        </w:rPr>
+        <w:t xml:space="preserve"> للمعرّفات والهواتف المشفرة، و</w:t>
+      </w:r>
+      <w:r>
+        <w:rPr>
+          <w:noProof/>
+        </w:rPr>
+        <w:t>(NUMERIC(12</w:t>
+      </w:r>
+      <w:r>
+        <w:rPr>
+          <w:rtl/>
+        </w:rPr>
+        <w:t>,3)) للكتلة، و</w:t>
+      </w:r>
+      <w:r>
+        <w:rPr>
+          <w:noProof/>
+        </w:rPr>
+        <w:t>(NUMERIC(14</w:t>
+      </w:r>
+      <w:r>
+        <w:rPr>
+          <w:rtl/>
+        </w:rPr>
+        <w:t>,2)) للنقد، و</w:t>
+      </w:r>
+      <w:r>
+        <w:rPr>
+          <w:noProof/>
+        </w:rPr>
+        <w:t>(TIMESTAMPTZ)</w:t>
+      </w:r>
+      <w:r>
+        <w:rPr>
+          <w:rtl/>
+        </w:rPr>
+        <w:t xml:space="preserve"> للأوقات، و</w:t>
+      </w:r>
+      <w:r>
+        <w:rPr>
+          <w:noProof/>
+        </w:rPr>
+        <w:t>(GEOGRAPHY/GEOMETRY)</w:t>
+      </w:r>
+      <w:r>
+        <w:rPr>
+          <w:rtl/>
+        </w:rPr>
+        <w:t xml:space="preserve"> للموقع. جميع الجداول التشغيلية تحمل </w:t>
+      </w:r>
+      <w:r>
+        <w:rPr>
+          <w:noProof/>
+        </w:rPr>
+        <w:t>(id)</w:t>
+      </w:r>
+      <w:r>
+        <w:rPr>
+          <w:rtl/>
+        </w:rPr>
+        <w:t>، و</w:t>
+      </w:r>
+      <w:r>
+        <w:rPr>
+          <w:noProof/>
+        </w:rPr>
+        <w:t>(created_at)</w:t>
+      </w:r>
+      <w:r>
+        <w:rPr>
+          <w:rtl/>
+        </w:rPr>
+        <w:t>، و</w:t>
+      </w:r>
+      <w:r>
+        <w:rPr>
+          <w:noProof/>
+        </w:rPr>
+        <w:t>(updated_at)</w:t>
+      </w:r>
+      <w:r>
+        <w:rPr>
+          <w:rtl/>
+        </w:rPr>
+        <w:t>، و</w:t>
+      </w:r>
+      <w:r>
+        <w:rPr>
+          <w:noProof/>
+        </w:rPr>
+        <w:t>(version)</w:t>
+      </w:r>
+      <w:r>
+        <w:rPr>
+          <w:rtl/>
+        </w:rPr>
+        <w:t xml:space="preserve"> ما لم يذكر خلافه؛ تحفظ أوقات السيرفر بتوقيت </w:t>
+      </w:r>
+      <w:r>
+        <w:rPr>
+          <w:noProof/>
+        </w:rPr>
+        <w:t>(UTC).</w:t>
+      </w:r>
+      <w:r>
+        <w:rPr>
+          <w:rtl/>
+        </w:rPr>
+        <w:t xml:space="preserve"> تفرض المفاتيح الأجنبية والقيود والفهارس داخل قاعدة البيانات، وتوثق قوائم الحالات بإصدارات. البنود التالية هي الكيانات الخمسة والعشرون المعتمدة حصراً.</w:t>
       </w:r>
     </w:p>
     <w:p>
@@ -4975,54 +6457,61 @@
           <w:color w:val="203A43"/>
           <w:sz w:val="24"/>
         </w:rPr>
-        <w:t>(Entity Relationship Diagram ‑ ERD)</w:t>
-      </w:r>
-    </w:p>
-    <w:p>
-      <w:pPr>
-        <w:bidi/>
-        <w:jc w:val="center"/>
-      </w:pPr>
-      <w:r>
-        <w:rPr>
-          <w:noProof/>
-          <w:rtl/>
-        </w:rPr>
-        <w:drawing>
-          <wp:inline distT="0" distB="0" distL="0" distR="0" wp14:anchorId="2CBAD947" wp14:editId="172E3291">
-            <wp:extent cx="5943600" cy="2559710"/>
-            <wp:effectExtent l="0" t="0" r="0" b="0"/>
-            <wp:docPr id="15" name="Picture 15"/>
-            <wp:cNvGraphicFramePr>
-              <a:graphicFrameLocks xmlns:a="http://schemas.openxmlformats.org/drawingml/2006/main" noChangeAspect="1"/>
-            </wp:cNvGraphicFramePr>
-            <a:graphic xmlns:a="http://schemas.openxmlformats.org/drawingml/2006/main">
-              <a:graphicData uri="http://schemas.openxmlformats.org/drawingml/2006/picture">
-                <pic:pic xmlns:pic="http://schemas.openxmlformats.org/drawingml/2006/picture">
-                  <pic:nvPicPr>
-                    <pic:cNvPr id="0" name="image.png"/>
-                    <pic:cNvPicPr/>
-                  </pic:nvPicPr>
-                  <pic:blipFill>
-                    <a:blip r:embed="rId21"/>
-                    <a:stretch>
-                      <a:fillRect/>
-                    </a:stretch>
-                  </pic:blipFill>
-                  <pic:spPr>
-                    <a:xfrm>
-                      <a:off x="0" y="0"/>
-                      <a:ext cx="5943600" cy="2559710"/>
-                    </a:xfrm>
-                    <a:prstGeom prst="rect">
-                      <a:avLst/>
-                    </a:prstGeom>
-                  </pic:spPr>
-                </pic:pic>
-              </a:graphicData>
-            </a:graphic>
-          </wp:inline>
-        </w:drawing>
+        <w:t>(Entity</w:t>
+      </w:r>
+      <w:r>
+        <w:rPr>
+          <w:b/>
+          <w:color w:val="203A43"/>
+          <w:sz w:val="24"/>
+          <w:rtl/>
+        </w:rPr>
+        <w:t> </w:t>
+      </w:r>
+      <w:r>
+        <w:rPr>
+          <w:b/>
+          <w:noProof/>
+          <w:color w:val="203A43"/>
+          <w:sz w:val="24"/>
+        </w:rPr>
+        <w:t>Relationship</w:t>
+      </w:r>
+      <w:r>
+        <w:rPr>
+          <w:b/>
+          <w:color w:val="203A43"/>
+          <w:sz w:val="24"/>
+          <w:rtl/>
+        </w:rPr>
+        <w:t> </w:t>
+      </w:r>
+      <w:r>
+        <w:rPr>
+          <w:b/>
+          <w:noProof/>
+          <w:color w:val="203A43"/>
+          <w:sz w:val="24"/>
+        </w:rPr>
+        <w:t>Diagram</w:t>
+      </w:r>
+      <w:r>
+        <w:rPr>
+          <w:b/>
+          <w:color w:val="203A43"/>
+          <w:sz w:val="24"/>
+          <w:rtl/>
+        </w:rPr>
+        <w:t> ‑ </w:t>
+      </w:r>
+      <w:r>
+        <w:rPr>
+          <w:b/>
+          <w:noProof/>
+          <w:color w:val="203A43"/>
+          <w:sz w:val="24"/>
+        </w:rPr>
+        <w:t>ERD)</w:t>
       </w:r>
     </w:p>
     <w:p>
@@ -5030,46 +6519,6 @@
         <w:bidi/>
         <w:jc w:val="right"/>
       </w:pPr>
-      <w:r>
-        <w:rPr>
-          <w:i/>
-          <w:color w:val="505A69"/>
-          <w:rtl/>
-        </w:rPr>
-        <w:t xml:space="preserve">شكل (3): مخطط العلاقات والكيانات </w:t>
-      </w:r>
-      <w:r>
-        <w:rPr>
-          <w:i/>
-          <w:noProof/>
-          <w:color w:val="505A69"/>
-        </w:rPr>
-        <w:t>(ERD)</w:t>
-      </w:r>
-      <w:r>
-        <w:rPr>
-          <w:i/>
-          <w:color w:val="505A69"/>
-          <w:rtl/>
-        </w:rPr>
-        <w:t xml:space="preserve"> لقاعدة بيانات «أثر» — يغطي الكيانات الرئيسية الموزعة على سياقات النطاق، مع تفصيل المفاتيح الأساسية والأجنبية وحسابات دفتر الأستاذ المتوازن وامتدادات </w:t>
-      </w:r>
-      <w:r>
-        <w:rPr>
-          <w:i/>
-          <w:noProof/>
-          <w:color w:val="505A69"/>
-        </w:rPr>
-        <w:t>PostGIS</w:t>
-      </w:r>
-      <w:r>
-        <w:rPr>
-          <w:i/>
-          <w:color w:val="505A69"/>
-          <w:rtl/>
-        </w:rPr>
-        <w:t xml:space="preserve"> المكانية ودورة منتجات المتجر والشراء بخطوتين.</w:t>
-      </w:r>
     </w:p>
     <w:p>
       <w:pPr>
@@ -5078,9 +6527,313 @@
       </w:pPr>
       <w:r>
         <w:rPr>
-          <w:rtl/>
-        </w:rPr>
-        <w:t>تتوزع قاعدة بيانات المنظومة على سياقات نطاق وظيفية محكمة (Bounded Contexts) تشمل: (1) الهوية والمصادقة وجلسات المستخدمين، (2) النطاقات الجغرافية والمربعات السكنية عبر PostGIS، (3) العمليات الميدانية وتصنيفات النفايات والزيارات وبنود الأوزان (عضوي، جاف، مرفوض)، (4) نظام القيد المزدوج المتوازن لحسابات النقاط الخضراء (Green Points Ledger)، (5) منتجات متجر أثر وطلبات الشراء الرقمي بخطوتين مع إثباتات الدفع بالريال اليمني والنقاط (Store Products &amp; 2‑Step Orders)، (6) البلاغات الميدانية وإدارة الاستثناءات (Support Tickets)، (7) الرقابة وسجلات التدقيق الصارمة غير القابلة للتعديل (Audit Logs)، (8) معالجة المهام الخلفية غير المتزامنة ومزامنة الدفعات الميدانية (Async Queue Workers &amp; Field Batch Imports). يتوفر القاموس التفصيلي الكامل لكافة الجداول والحقول والقيود الفنية على الرابط المباشر في GitHub: docs/02‑database/data‑dictionary.md.</w:t>
+          <w:i/>
+          <w:color w:val="505A69"/>
+          <w:rtl/>
+        </w:rPr>
+        <w:t xml:space="preserve">شكل (3): مخطط العلاقات والكيانات </w:t>
+      </w:r>
+      <w:r>
+        <w:rPr>
+          <w:i/>
+          <w:noProof/>
+          <w:color w:val="505A69"/>
+        </w:rPr>
+        <w:t>(ERD)</w:t>
+      </w:r>
+      <w:r>
+        <w:rPr>
+          <w:i/>
+          <w:color w:val="505A69"/>
+          <w:rtl/>
+        </w:rPr>
+        <w:t xml:space="preserve"> لقاعدة بيانات «أثر» — يغطي الكيانات الرئيسية الموزعة على سياقات النطاق، مع تفصيل المفاتيح الأساسية والأجنبية وحسابات دفتر الأستاذ المتوازن وامتدادات </w:t>
+      </w:r>
+      <w:r>
+        <w:rPr>
+          <w:i/>
+          <w:noProof/>
+          <w:color w:val="505A69"/>
+        </w:rPr>
+        <w:t>PostGIS</w:t>
+      </w:r>
+      <w:r>
+        <w:rPr>
+          <w:i/>
+          <w:color w:val="505A69"/>
+          <w:rtl/>
+        </w:rPr>
+        <w:t xml:space="preserve"> المكانية ودورة منتجات المتجر والشراء بخطوتين.</w:t>
+      </w:r>
+    </w:p>
+    <w:p>
+      <w:pPr>
+        <w:bidi/>
+        <w:jc w:val="right"/>
+      </w:pPr>
+      <w:r>
+        <w:rPr>
+          <w:rtl/>
+        </w:rPr>
+        <w:t xml:space="preserve">تتوزع قاعدة بيانات المنظومة على سياقات نطاق وظيفية محكمة </w:t>
+      </w:r>
+      <w:r>
+        <w:rPr>
+          <w:noProof/>
+        </w:rPr>
+        <w:t>(Bounded</w:t>
+      </w:r>
+      <w:r>
+        <w:rPr>
+          <w:rtl/>
+        </w:rPr>
+        <w:t xml:space="preserve"> </w:t>
+      </w:r>
+      <w:r>
+        <w:rPr>
+          <w:noProof/>
+        </w:rPr>
+        <w:t>Contexts)</w:t>
+      </w:r>
+      <w:r>
+        <w:rPr>
+          <w:rtl/>
+        </w:rPr>
+        <w:t xml:space="preserve"> تشمل: (1) الهوية والمصادقة وجلسات المستخدمين، (2) النطاقات الجغرافية والمربعات السكنية عبر </w:t>
+      </w:r>
+      <w:r>
+        <w:rPr>
+          <w:noProof/>
+        </w:rPr>
+        <w:t>PostGIS</w:t>
+      </w:r>
+      <w:r>
+        <w:rPr>
+          <w:rtl/>
+        </w:rPr>
+        <w:t xml:space="preserve">، (3) العمليات الميدانية وتصنيفات النفايات والزيارات وبنود الأوزان (عضوي، جاف، مرفوض)، (4) نظام القيد المزدوج المتوازن لحسابات النقاط الخضراء </w:t>
+      </w:r>
+      <w:r>
+        <w:rPr>
+          <w:noProof/>
+        </w:rPr>
+        <w:t>(Green</w:t>
+      </w:r>
+      <w:r>
+        <w:rPr>
+          <w:rtl/>
+        </w:rPr>
+        <w:t xml:space="preserve"> </w:t>
+      </w:r>
+      <w:r>
+        <w:rPr>
+          <w:noProof/>
+        </w:rPr>
+        <w:t>Points</w:t>
+      </w:r>
+      <w:r>
+        <w:rPr>
+          <w:rtl/>
+        </w:rPr>
+        <w:t xml:space="preserve"> </w:t>
+      </w:r>
+      <w:r>
+        <w:rPr>
+          <w:noProof/>
+        </w:rPr>
+        <w:t>Ledger)</w:t>
+      </w:r>
+      <w:r>
+        <w:rPr>
+          <w:rtl/>
+        </w:rPr>
+        <w:t xml:space="preserve">، (5) منتجات متجر أثر وطلبات الشراء الرقمي بخطوتين مع إثباتات الدفع بالريال اليمني والنقاط </w:t>
+      </w:r>
+      <w:r>
+        <w:rPr>
+          <w:noProof/>
+        </w:rPr>
+        <w:t>(Store</w:t>
+      </w:r>
+      <w:r>
+        <w:rPr>
+          <w:rtl/>
+        </w:rPr>
+        <w:t xml:space="preserve"> </w:t>
+      </w:r>
+      <w:r>
+        <w:rPr>
+          <w:noProof/>
+        </w:rPr>
+        <w:t>Products</w:t>
+      </w:r>
+      <w:r>
+        <w:rPr>
+          <w:rtl/>
+        </w:rPr>
+        <w:t xml:space="preserve"> &amp; </w:t>
+      </w:r>
+      <w:r>
+        <w:rPr>
+          <w:noProof/>
+        </w:rPr>
+        <w:t>2‑Step</w:t>
+      </w:r>
+      <w:r>
+        <w:rPr>
+          <w:rtl/>
+        </w:rPr>
+        <w:t xml:space="preserve"> </w:t>
+      </w:r>
+      <w:r>
+        <w:rPr>
+          <w:noProof/>
+        </w:rPr>
+        <w:t>Orders)</w:t>
+      </w:r>
+      <w:r>
+        <w:rPr>
+          <w:rtl/>
+        </w:rPr>
+        <w:t xml:space="preserve">، (6) البلاغات الميدانية وإدارة الاستثناءات والحوادث التشغيلية </w:t>
+      </w:r>
+      <w:r>
+        <w:rPr>
+          <w:noProof/>
+        </w:rPr>
+        <w:t>(Incident</w:t>
+      </w:r>
+      <w:r>
+        <w:rPr>
+          <w:rtl/>
+        </w:rPr>
+        <w:t xml:space="preserve"> </w:t>
+      </w:r>
+      <w:r>
+        <w:rPr>
+          <w:noProof/>
+        </w:rPr>
+        <w:t>Reports)</w:t>
+      </w:r>
+      <w:r>
+        <w:rPr>
+          <w:rtl/>
+        </w:rPr>
+        <w:t xml:space="preserve">، (7) الرقابة وسجلات التدقيق الصارمة غير القابلة للتعديل </w:t>
+      </w:r>
+      <w:r>
+        <w:rPr>
+          <w:noProof/>
+        </w:rPr>
+        <w:t>(Audit</w:t>
+      </w:r>
+      <w:r>
+        <w:rPr>
+          <w:rtl/>
+        </w:rPr>
+        <w:t xml:space="preserve"> </w:t>
+      </w:r>
+      <w:r>
+        <w:rPr>
+          <w:noProof/>
+        </w:rPr>
+        <w:t>Logs)</w:t>
+      </w:r>
+      <w:r>
+        <w:rPr>
+          <w:rtl/>
+        </w:rPr>
+        <w:t xml:space="preserve">، (8) معالجة المهام الخلفية غير المتزامنة ومزامنة الدفعات الميدانية </w:t>
+      </w:r>
+      <w:r>
+        <w:rPr>
+          <w:noProof/>
+        </w:rPr>
+        <w:t>(Async</w:t>
+      </w:r>
+      <w:r>
+        <w:rPr>
+          <w:rtl/>
+        </w:rPr>
+        <w:t xml:space="preserve"> </w:t>
+      </w:r>
+      <w:r>
+        <w:rPr>
+          <w:noProof/>
+        </w:rPr>
+        <w:t>Queue</w:t>
+      </w:r>
+      <w:r>
+        <w:rPr>
+          <w:rtl/>
+        </w:rPr>
+        <w:t xml:space="preserve"> </w:t>
+      </w:r>
+      <w:r>
+        <w:rPr>
+          <w:noProof/>
+        </w:rPr>
+        <w:t>Workers</w:t>
+      </w:r>
+      <w:r>
+        <w:rPr>
+          <w:rtl/>
+        </w:rPr>
+        <w:t xml:space="preserve"> &amp; </w:t>
+      </w:r>
+      <w:r>
+        <w:rPr>
+          <w:noProof/>
+        </w:rPr>
+        <w:t>Field</w:t>
+      </w:r>
+      <w:r>
+        <w:rPr>
+          <w:rtl/>
+        </w:rPr>
+        <w:t xml:space="preserve"> </w:t>
+      </w:r>
+      <w:r>
+        <w:rPr>
+          <w:noProof/>
+        </w:rPr>
+        <w:t>Batch</w:t>
+      </w:r>
+      <w:r>
+        <w:rPr>
+          <w:rtl/>
+        </w:rPr>
+        <w:t xml:space="preserve"> </w:t>
+      </w:r>
+      <w:r>
+        <w:rPr>
+          <w:noProof/>
+        </w:rPr>
+        <w:t>Imports).</w:t>
+      </w:r>
+      <w:r>
+        <w:rPr>
+          <w:rtl/>
+        </w:rPr>
+        <w:t xml:space="preserve"> يتوفر القاموس التفصيلي الكامل لكافة الجداول والحقول والقيود الفنية على الرابط المباشر في </w:t>
+      </w:r>
+      <w:r>
+        <w:rPr>
+          <w:noProof/>
+        </w:rPr>
+        <w:t>GitHub:</w:t>
+      </w:r>
+      <w:r>
+        <w:rPr>
+          <w:rtl/>
+        </w:rPr>
+        <w:t xml:space="preserve"> </w:t>
+      </w:r>
+      <w:r>
+        <w:rPr>
+          <w:noProof/>
+        </w:rPr>
+        <w:t>docs/02‑database/data‑dictionary.md.</w:t>
       </w:r>
     </w:p>
     <w:p>
@@ -5105,7 +6858,55 @@
         <w:rPr>
           <w:rtl/>
         </w:rPr>
-        <w:t>جميع المسارات تبدأ بـ (/v1)، وتستخدم (JSON) وتعيد رمز تعقب وأخطاء معيارية. تتطلب العمليات المغيرة (Idempotency-Key) ومراجعة النسخة (If-Match) حيث تنطبق؛ الرفع يتم بإذن مؤقت إلى مخزن خاص، والربط النهائي بعد فحص النوع والحجم. الأسماء أدناه عقود مقترحة يثبتها فريق التطوير قبل التنفيذ.</w:t>
+        <w:t xml:space="preserve">جميع المسارات تبدأ بـ </w:t>
+      </w:r>
+      <w:r>
+        <w:rPr>
+          <w:noProof/>
+        </w:rPr>
+        <w:t>(/v1)</w:t>
+      </w:r>
+      <w:r>
+        <w:rPr>
+          <w:rtl/>
+        </w:rPr>
+        <w:t xml:space="preserve">، وتستخدم </w:t>
+      </w:r>
+      <w:r>
+        <w:rPr>
+          <w:noProof/>
+        </w:rPr>
+        <w:t>(JSON)</w:t>
+      </w:r>
+      <w:r>
+        <w:rPr>
+          <w:rtl/>
+        </w:rPr>
+        <w:t xml:space="preserve"> وتعيد رمز تعقب وأخطاء معيارية. تتطلب العمليات المغيرة </w:t>
+      </w:r>
+      <w:r>
+        <w:rPr>
+          <w:noProof/>
+        </w:rPr>
+        <w:t>(Idempotency‑Key)</w:t>
+      </w:r>
+      <w:r>
+        <w:rPr>
+          <w:rtl/>
+        </w:rPr>
+        <w:t xml:space="preserve"> ومراجعة النسخة </w:t>
+      </w:r>
+      <w:r>
+        <w:rPr>
+          <w:noProof/>
+        </w:rPr>
+        <w:t>(If‑Match)</w:t>
+      </w:r>
+      <w:r>
+        <w:rPr>
+          <w:rtl/>
+        </w:rPr>
+        <w:t xml:space="preserve"> حيث تنطبق؛ الرفع يتم بإذن مؤقت إلى مخزن خاص، والربط النهائي بعد فحص النوع والحجم. الأسماء أدناه عقود مقترحة يثبتها فريق التطوير قبل التنفيذ.</w:t>
       </w:r>
     </w:p>
     <w:tbl>
@@ -6874,6 +8675,7 @@
                 <w:sz w:val="18"/>
                 <w:rtl/>
               </w:rPr>
+              <w:lastRenderedPageBreak/>
               <w:t>خريطة حية للمهام وعمال الميدان المعلقين</w:t>
             </w:r>
           </w:p>
@@ -7233,13 +9035,7 @@
               <w:rPr>
                 <w:rtl/>
               </w:rPr>
-              <w:t xml:space="preserve">حالة البلاغ </w:t>
-            </w:r>
-            <w:r>
-              <w:rPr>
-                <w:rtl/>
-              </w:rPr>
-              <w:t>والفئة والتاريخ</w:t>
+              <w:t>حالة البلاغ والفئة والتاريخ</w:t>
             </w:r>
           </w:p>
         </w:tc>
@@ -8403,94 +10199,117 @@
       </w:pPr>
       <w:r>
         <w:rPr>
-          <w:sz w:val="20"/>
-          <w:rtl/>
-        </w:rPr>
-        <w:t xml:space="preserve">تعتمد المنظومة معايير الأمان المتقدمة لمكدس </w:t>
-      </w:r>
-      <w:r>
-        <w:rPr>
-          <w:noProof/>
-          <w:sz w:val="20"/>
-        </w:rPr>
-        <w:t>(Node.js / TypeScript)</w:t>
-      </w:r>
-      <w:r>
-        <w:rPr>
-          <w:sz w:val="20"/>
-          <w:rtl/>
-        </w:rPr>
-        <w:t xml:space="preserve">: تأمين ترويسات الاستجابة عبر </w:t>
-      </w:r>
-      <w:r>
-        <w:rPr>
-          <w:noProof/>
-          <w:sz w:val="20"/>
-        </w:rPr>
-        <w:t>(Fastify Helmet)</w:t>
-      </w:r>
-      <w:r>
-        <w:rPr>
-          <w:sz w:val="20"/>
-          <w:rtl/>
-        </w:rPr>
-        <w:t xml:space="preserve">، وحظر هجمات حجب الخدمة ومحاولات التخمين بتطبيق تحديد معدل الطلبات عبر نافذة منزلقة </w:t>
-      </w:r>
-      <w:r>
-        <w:rPr>
-          <w:noProof/>
-          <w:sz w:val="20"/>
-        </w:rPr>
-        <w:t>(Sliding‑Window Rate Limiting)</w:t>
-      </w:r>
-      <w:r>
-        <w:rPr>
-          <w:sz w:val="20"/>
-          <w:rtl/>
-        </w:rPr>
-        <w:t xml:space="preserve"> مدعومة بـ </w:t>
-      </w:r>
-      <w:r>
-        <w:rPr>
-          <w:noProof/>
-          <w:sz w:val="20"/>
-        </w:rPr>
-        <w:t>(Redis / Memory)</w:t>
-      </w:r>
-      <w:r>
-        <w:rPr>
-          <w:sz w:val="20"/>
-          <w:rtl/>
-        </w:rPr>
-        <w:t xml:space="preserve">. تطبق بوابة الإدارة والعمليات المركزية المصادقة الثنائية الإلزامية </w:t>
-      </w:r>
-      <w:r>
-        <w:rPr>
-          <w:noProof/>
-          <w:sz w:val="20"/>
-        </w:rPr>
-        <w:t>(2FA / TOTP)</w:t>
-      </w:r>
-      <w:r>
-        <w:rPr>
-          <w:sz w:val="20"/>
-          <w:rtl/>
-        </w:rPr>
-        <w:t xml:space="preserve"> لكافة الموظفين، مع عزل واجهات وشبكة الإدارة عبر مسارات مقيدة وقصر تسجيل الدخول على نطاقات وعناوين موثوقة. يُطبق مبدأ فصل المهام المؤسسي الصارم </w:t>
-      </w:r>
-      <w:r>
-        <w:rPr>
-          <w:noProof/>
-          <w:sz w:val="20"/>
-        </w:rPr>
-        <w:t>(Separation of Duties)</w:t>
-      </w:r>
-      <w:r>
-        <w:rPr>
-          <w:sz w:val="20"/>
-          <w:rtl/>
-        </w:rPr>
-        <w:t>: عزل صلاحيات من يتحقق من إيصال المتجر عمن يصدر أمر الصرف، وعزل من يسجل الوزن الميداني عمن يعتمد الاستثناءات المالية.</w:t>
+          <w:rtl/>
+        </w:rPr>
+        <w:t xml:space="preserve">تعتمد المنظومة معايير أمان مشددة لمكدس </w:t>
+      </w:r>
+      <w:r>
+        <w:rPr>
+          <w:noProof/>
+        </w:rPr>
+        <w:t>(Node.js</w:t>
+      </w:r>
+      <w:r>
+        <w:rPr>
+          <w:rtl/>
+        </w:rPr>
+        <w:t xml:space="preserve"> / </w:t>
+      </w:r>
+      <w:r>
+        <w:rPr>
+          <w:noProof/>
+        </w:rPr>
+        <w:t>TypeScript):</w:t>
+      </w:r>
+      <w:r>
+        <w:rPr>
+          <w:rtl/>
+        </w:rPr>
+        <w:t xml:space="preserve"> تأمين ترويسات الاستجابة وحمايتها من الثغرات، وحظر هجمات حجب الخدمة ومحاولات التخمين بتطبيق تحديد معدل الطلبات </w:t>
+      </w:r>
+      <w:r>
+        <w:rPr>
+          <w:noProof/>
+        </w:rPr>
+        <w:t>(Rate</w:t>
+      </w:r>
+      <w:r>
+        <w:rPr>
+          <w:rtl/>
+        </w:rPr>
+        <w:t xml:space="preserve"> </w:t>
+      </w:r>
+      <w:r>
+        <w:rPr>
+          <w:noProof/>
+        </w:rPr>
+        <w:t>Limiting)</w:t>
+      </w:r>
+      <w:r>
+        <w:rPr>
+          <w:rtl/>
+        </w:rPr>
+        <w:t xml:space="preserve"> في طبقة الخادم والبوابة. تطبق بوابة الإدارة والعمليات المركزية حماية إضافية بالتحقق الثنائي </w:t>
+      </w:r>
+      <w:r>
+        <w:rPr>
+          <w:noProof/>
+        </w:rPr>
+        <w:t>(2FA</w:t>
+      </w:r>
+      <w:r>
+        <w:rPr>
+          <w:rtl/>
+        </w:rPr>
+        <w:t xml:space="preserve"> / </w:t>
+      </w:r>
+      <w:r>
+        <w:rPr>
+          <w:noProof/>
+        </w:rPr>
+        <w:t>OTP)</w:t>
+      </w:r>
+      <w:r>
+        <w:rPr>
+          <w:rtl/>
+        </w:rPr>
+        <w:t xml:space="preserve"> ومحددات النطاق الإداري، مع عزل واجهات وشبكة الإدارة عبر مسارات مقيدة وقصر تسجيل الدخول على مستخدمين موثوقين. يُطبق مبدأ فصل المهام المؤسسي الصارم </w:t>
+      </w:r>
+      <w:r>
+        <w:rPr>
+          <w:noProof/>
+        </w:rPr>
+        <w:t>(Separation</w:t>
+      </w:r>
+      <w:r>
+        <w:rPr>
+          <w:rtl/>
+        </w:rPr>
+        <w:t xml:space="preserve"> </w:t>
+      </w:r>
+      <w:r>
+        <w:rPr>
+          <w:noProof/>
+        </w:rPr>
+        <w:t>of</w:t>
+      </w:r>
+      <w:r>
+        <w:rPr>
+          <w:rtl/>
+        </w:rPr>
+        <w:t xml:space="preserve"> </w:t>
+      </w:r>
+      <w:r>
+        <w:rPr>
+          <w:noProof/>
+        </w:rPr>
+        <w:t>Duties):</w:t>
+      </w:r>
+      <w:r>
+        <w:rPr>
+          <w:rtl/>
+        </w:rPr>
+        <w:t xml:space="preserve"> عزل صلاحيات من يتحقق من إيصال المتجر عمن يصدر أمر الصرف، وعزل من يسجل الوزن الميداني عمن يعتمد الاستثناءات المالية.</w:t>
       </w:r>
     </w:p>
     <w:p>
@@ -8500,49 +10319,54 @@
       </w:pPr>
       <w:r>
         <w:rPr>
-          <w:sz w:val="20"/>
-          <w:rtl/>
-        </w:rPr>
-        <w:t xml:space="preserve">المعرّف الحسابي المكون من 5 إلى 6 خانات مخصص للاستدلال المحاسبي وقابل للتخمين، ويحظر استخدامه قطيعاً كمفتاح مرور أو وصول؛ بينما تُحمى بطاقات </w:t>
-      </w:r>
-      <w:r>
-        <w:rPr>
-          <w:noProof/>
-          <w:sz w:val="20"/>
+          <w:rtl/>
+        </w:rPr>
+        <w:t xml:space="preserve">المعرّف الحسابي المكون من 5 إلى 6 خانات مخصص للاستدلال المحاسبي وقابل للتخمين، ويحظر استخدامه قطيعاً كمفتاح مرور أو وصول؛ كما تقيّد استعلامات بطاقات </w:t>
+      </w:r>
+      <w:r>
+        <w:rPr>
+          <w:noProof/>
         </w:rPr>
         <w:t>(QR)</w:t>
       </w:r>
       <w:r>
         <w:rPr>
-          <w:sz w:val="20"/>
-          <w:rtl/>
-        </w:rPr>
-        <w:t xml:space="preserve"> برموز بصرية مشفرة </w:t>
-      </w:r>
-      <w:r>
-        <w:rPr>
-          <w:noProof/>
-          <w:sz w:val="20"/>
-        </w:rPr>
-        <w:t>(Cryptographic Card Tokens)</w:t>
-      </w:r>
-      <w:r>
-        <w:rPr>
-          <w:sz w:val="20"/>
-          <w:rtl/>
-        </w:rPr>
-        <w:t xml:space="preserve"> قابلة للإبطال الفوري. تُشفر أرقام الهواتف والبيانات الشخصية الحساسة أثناء السكون </w:t>
-      </w:r>
-      <w:r>
-        <w:rPr>
-          <w:noProof/>
-          <w:sz w:val="20"/>
-        </w:rPr>
-        <w:t>(Encryption at Rest)</w:t>
-      </w:r>
-      <w:r>
-        <w:rPr>
-          <w:sz w:val="20"/>
+          <w:rtl/>
+        </w:rPr>
+        <w:t xml:space="preserve"> بدور العامل والمهمة النشطة ومعدل الطلبات وتخضع لتدقيق السيرفر. تُشفر أرقام الهواتف والبيانات الشخصية الحساسة أثناء السكون </w:t>
+      </w:r>
+      <w:r>
+        <w:rPr>
+          <w:noProof/>
+        </w:rPr>
+        <w:t>(Encryption</w:t>
+      </w:r>
+      <w:r>
+        <w:rPr>
+          <w:rtl/>
+        </w:rPr>
+        <w:t xml:space="preserve"> </w:t>
+      </w:r>
+      <w:r>
+        <w:rPr>
+          <w:noProof/>
+        </w:rPr>
+        <w:t>at</w:t>
+      </w:r>
+      <w:r>
+        <w:rPr>
+          <w:rtl/>
+        </w:rPr>
+        <w:t xml:space="preserve"> </w:t>
+      </w:r>
+      <w:r>
+        <w:rPr>
+          <w:noProof/>
+        </w:rPr>
+        <w:t>Rest)</w:t>
+      </w:r>
+      <w:r>
+        <w:rPr>
           <w:rtl/>
         </w:rPr>
         <w:t xml:space="preserve"> وفق معيار </w:t>
@@ -8550,13 +10374,11 @@
       <w:r>
         <w:rPr>
           <w:noProof/>
-          <w:sz w:val="20"/>
         </w:rPr>
         <w:t>(AES‑256‑GCM)</w:t>
       </w:r>
       <w:r>
         <w:rPr>
-          <w:sz w:val="20"/>
           <w:rtl/>
         </w:rPr>
         <w:t xml:space="preserve"> مع فهرس معمي </w:t>
@@ -8564,13 +10386,35 @@
       <w:r>
         <w:rPr>
           <w:noProof/>
-          <w:sz w:val="20"/>
-        </w:rPr>
-        <w:t>(HMAC Blind Index)</w:t>
-      </w:r>
-      <w:r>
-        <w:rPr>
-          <w:sz w:val="20"/>
+        </w:rPr>
+        <w:t>(HMAC</w:t>
+      </w:r>
+      <w:r>
+        <w:rPr>
+          <w:rtl/>
+        </w:rPr>
+        <w:t xml:space="preserve"> </w:t>
+      </w:r>
+      <w:r>
+        <w:rPr>
+          <w:noProof/>
+        </w:rPr>
+        <w:t>Blind</w:t>
+      </w:r>
+      <w:r>
+        <w:rPr>
+          <w:rtl/>
+        </w:rPr>
+        <w:t xml:space="preserve"> </w:t>
+      </w:r>
+      <w:r>
+        <w:rPr>
+          <w:noProof/>
+        </w:rPr>
+        <w:t>Index)</w:t>
+      </w:r>
+      <w:r>
+        <w:rPr>
           <w:rtl/>
         </w:rPr>
         <w:t xml:space="preserve"> لتمكين البحث السريع دون فك التشفير. تفرض كافة العمليات الحساسة والمالية ترويسة منع تكرار العمليات </w:t>
@@ -8578,13 +10422,11 @@
       <w:r>
         <w:rPr>
           <w:noProof/>
-          <w:sz w:val="20"/>
         </w:rPr>
         <w:t>(Idempotency‑Key)</w:t>
       </w:r>
       <w:r>
         <w:rPr>
-          <w:sz w:val="20"/>
           <w:rtl/>
         </w:rPr>
         <w:t xml:space="preserve"> بصلاحية 24 ساعة. تُسجل كافة تحركات الموظفين في سجل تدقيق مؤسسي غير قابل للحذف </w:t>
@@ -8592,13 +10434,23 @@
       <w:r>
         <w:rPr>
           <w:noProof/>
-          <w:sz w:val="20"/>
-        </w:rPr>
-        <w:t>(Immutable AuditLog)</w:t>
-      </w:r>
-      <w:r>
-        <w:rPr>
-          <w:sz w:val="20"/>
+        </w:rPr>
+        <w:t>(Immutable</w:t>
+      </w:r>
+      <w:r>
+        <w:rPr>
+          <w:rtl/>
+        </w:rPr>
+        <w:t xml:space="preserve"> </w:t>
+      </w:r>
+      <w:r>
+        <w:rPr>
+          <w:noProof/>
+        </w:rPr>
+        <w:t>AuditLog)</w:t>
+      </w:r>
+      <w:r>
+        <w:rPr>
           <w:rtl/>
         </w:rPr>
         <w:t xml:space="preserve"> يتضمن المعرف والموقع وعنوان </w:t>
@@ -8606,13 +10458,11 @@
       <w:r>
         <w:rPr>
           <w:noProof/>
-          <w:sz w:val="20"/>
         </w:rPr>
         <w:t>(IP)</w:t>
       </w:r>
       <w:r>
         <w:rPr>
-          <w:sz w:val="20"/>
           <w:rtl/>
         </w:rPr>
         <w:t xml:space="preserve"> ومعرف الترابط </w:t>
@@ -8620,16 +10470,8 @@
       <w:r>
         <w:rPr>
           <w:noProof/>
-          <w:sz w:val="20"/>
-        </w:rPr>
-        <w:t>(Correlation‑ID)</w:t>
-      </w:r>
-      <w:r>
-        <w:rPr>
-          <w:sz w:val="20"/>
-          <w:rtl/>
-        </w:rPr>
-        <w:t>.</w:t>
+        </w:rPr>
+        <w:t>(Correlation‑ID).</w:t>
       </w:r>
     </w:p>
     <w:p>
@@ -8653,7 +10495,61 @@
           <w:color w:val="203A43"/>
           <w:sz w:val="24"/>
         </w:rPr>
-        <w:t>(Weight Anti‑Fraud Logic)</w:t>
+        <w:t>(Weight</w:t>
+      </w:r>
+      <w:r>
+        <w:rPr>
+          <w:b/>
+          <w:color w:val="203A43"/>
+          <w:sz w:val="24"/>
+          <w:rtl/>
+        </w:rPr>
+        <w:t> </w:t>
+      </w:r>
+      <w:r>
+        <w:rPr>
+          <w:b/>
+          <w:noProof/>
+          <w:color w:val="203A43"/>
+          <w:sz w:val="24"/>
+        </w:rPr>
+        <w:t>Anti</w:t>
+      </w:r>
+      <w:r>
+        <w:rPr>
+          <w:b/>
+          <w:color w:val="203A43"/>
+          <w:sz w:val="24"/>
+          <w:rtl/>
+        </w:rPr>
+        <w:t>‑</w:t>
+      </w:r>
+      <w:r>
+        <w:rPr>
+          <w:b/>
+          <w:noProof/>
+          <w:color w:val="203A43"/>
+          <w:sz w:val="24"/>
+        </w:rPr>
+        <w:t>Fraud</w:t>
+      </w:r>
+      <w:r>
+        <w:rPr>
+          <w:b/>
+          <w:color w:val="203A43"/>
+          <w:sz w:val="24"/>
+          <w:rtl/>
+        </w:rPr>
+        <w:t> </w:t>
+      </w:r>
+      <w:r>
+        <w:rPr>
+          <w:b/>
+          <w:noProof/>
+          <w:color w:val="203A43"/>
+          <w:sz w:val="24"/>
+        </w:rPr>
+        <w:t>Logic)</w:t>
       </w:r>
     </w:p>
     <w:p>
@@ -8661,47 +10557,6 @@
         <w:bidi/>
         <w:jc w:val="right"/>
       </w:pPr>
-      <w:r>
-        <w:rPr>
-          <w:noProof/>
-          <w:rtl/>
-        </w:rPr>
-        <w:drawing>
-          <wp:inline distT="0" distB="0" distL="0" distR="0" wp14:anchorId="625699E0" wp14:editId="2F59FEDE">
-            <wp:extent cx="4389120" cy="6941384"/>
-            <wp:effectExtent l="0" t="0" r="0" b="0"/>
-            <wp:docPr id="4" name="Picture 4"/>
-            <wp:cNvGraphicFramePr>
-              <a:graphicFrameLocks xmlns:a="http://schemas.openxmlformats.org/drawingml/2006/main" noChangeAspect="1"/>
-            </wp:cNvGraphicFramePr>
-            <a:graphic xmlns:a="http://schemas.openxmlformats.org/drawingml/2006/main">
-              <a:graphicData uri="http://schemas.openxmlformats.org/drawingml/2006/picture">
-                <pic:pic xmlns:pic="http://schemas.openxmlformats.org/drawingml/2006/picture">
-                  <pic:nvPicPr>
-                    <pic:cNvPr id="0" name="mermaid-diagram5.png"/>
-                    <pic:cNvPicPr/>
-                  </pic:nvPicPr>
-                  <pic:blipFill>
-                    <a:blip r:embed="rId22"/>
-                    <a:stretch>
-                      <a:fillRect/>
-                    </a:stretch>
-                  </pic:blipFill>
-                  <pic:spPr>
-                    <a:xfrm>
-                      <a:off x="0" y="0"/>
-                      <a:ext cx="4389120" cy="6941384"/>
-                    </a:xfrm>
-                    <a:prstGeom prst="rect">
-                      <a:avLst/>
-                    </a:prstGeom>
-                  </pic:spPr>
-                </pic:pic>
-              </a:graphicData>
-            </a:graphic>
-          </wp:inline>
-        </w:drawing>
-      </w:r>
     </w:p>
     <w:p>
       <w:pPr>
@@ -8714,6 +10569,7 @@
           <w:color w:val="505A69"/>
           <w:rtl/>
         </w:rPr>
+        <w:lastRenderedPageBreak/>
         <w:t>شكل (4): خوارزمية الفحص المزدوج للأوزان الميدانية — التحقق الصارم من السقف الأقصى للخامة، ومقارنة القفزات الإحصائية بمتوسط سجل الأسرة لتجميد النقاط المشبوهة وحماية الخزينة العامة.</w:t>
       </w:r>
     </w:p>
@@ -9691,21 +11547,18 @@
       </w:pPr>
       <w:r>
         <w:rPr>
-          <w:sz w:val="20"/>
-          <w:rtl/>
-        </w:rPr>
-        <w:t>تعتمد المنظومة معايير الرصدية والتشغيل العالمية (</w:t>
-      </w:r>
-      <w:r>
-        <w:rPr>
-          <w:noProof/>
-          <w:sz w:val="20"/>
-        </w:rPr>
-        <w:t>Observability</w:t>
-      </w:r>
-      <w:r>
-        <w:rPr>
-          <w:sz w:val="20"/>
+          <w:rtl/>
+        </w:rPr>
+        <w:t xml:space="preserve">تعتمد المنظومة معايير الرصدية والتشغيل الموحدة </w:t>
+      </w:r>
+      <w:r>
+        <w:rPr>
+          <w:noProof/>
+        </w:rPr>
+        <w:t>(Observability</w:t>
+      </w:r>
+      <w:r>
+        <w:rPr>
           <w:rtl/>
         </w:rPr>
         <w:t xml:space="preserve"> &amp; </w:t>
@@ -9713,83 +11566,59 @@
       <w:r>
         <w:rPr>
           <w:noProof/>
-          <w:sz w:val="20"/>
-        </w:rPr>
-        <w:t>Telemetry</w:t>
-      </w:r>
-      <w:r>
-        <w:rPr>
-          <w:sz w:val="20"/>
-          <w:rtl/>
-        </w:rPr>
-        <w:t xml:space="preserve">): تسجيل الأحداث بصيغة هيكلية </w:t>
-      </w:r>
-      <w:r>
-        <w:rPr>
-          <w:noProof/>
-          <w:sz w:val="20"/>
-        </w:rPr>
-        <w:t>(Structured JSON Logging)</w:t>
-      </w:r>
-      <w:r>
-        <w:rPr>
-          <w:sz w:val="20"/>
-          <w:rtl/>
-        </w:rPr>
-        <w:t xml:space="preserve"> عبر مكتبة </w:t>
-      </w:r>
-      <w:r>
-        <w:rPr>
-          <w:noProof/>
-          <w:sz w:val="20"/>
-        </w:rPr>
-        <w:t>(Pino)</w:t>
-      </w:r>
-      <w:r>
-        <w:rPr>
-          <w:sz w:val="20"/>
-          <w:rtl/>
-        </w:rPr>
-        <w:t xml:space="preserve"> المتوافقة مع </w:t>
-      </w:r>
-      <w:r>
-        <w:rPr>
-          <w:noProof/>
-          <w:sz w:val="20"/>
-        </w:rPr>
-        <w:t>(OpenTelemetry)</w:t>
-      </w:r>
-      <w:r>
-        <w:rPr>
-          <w:sz w:val="20"/>
-          <w:rtl/>
-        </w:rPr>
-        <w:t xml:space="preserve">، متضمنة معرف التتبع </w:t>
-      </w:r>
-      <w:r>
-        <w:rPr>
-          <w:noProof/>
-          <w:sz w:val="20"/>
-        </w:rPr>
-        <w:t>(Trace‑ID)</w:t>
-      </w:r>
-      <w:r>
-        <w:rPr>
-          <w:sz w:val="20"/>
-          <w:rtl/>
-        </w:rPr>
-        <w:t xml:space="preserve"> والدور والمسار وزمن المعالجة دون كشف بيانات حساسة. يتيح الخادم نقاط فحص الجاهزية التشغيلية (</w:t>
-      </w:r>
-      <w:r>
-        <w:rPr>
-          <w:noProof/>
-          <w:sz w:val="20"/>
-        </w:rPr>
-        <w:t>/health/live</w:t>
-      </w:r>
-      <w:r>
-        <w:rPr>
-          <w:sz w:val="20"/>
+        </w:rPr>
+        <w:t>Monitoring):</w:t>
+      </w:r>
+      <w:r>
+        <w:rPr>
+          <w:rtl/>
+        </w:rPr>
+        <w:t xml:space="preserve"> تسجيل الأحداث بصيغة هيكلية متسقة متضمنة معرف التتبع والترابط </w:t>
+      </w:r>
+      <w:r>
+        <w:rPr>
+          <w:noProof/>
+        </w:rPr>
+        <w:t>(Trace</w:t>
+      </w:r>
+      <w:r>
+        <w:rPr>
+          <w:rtl/>
+        </w:rPr>
+        <w:t xml:space="preserve"> / </w:t>
+      </w:r>
+      <w:r>
+        <w:rPr>
+          <w:noProof/>
+        </w:rPr>
+        <w:t>Correlation</w:t>
+      </w:r>
+      <w:r>
+        <w:rPr>
+          <w:rtl/>
+        </w:rPr>
+        <w:t xml:space="preserve"> </w:t>
+      </w:r>
+      <w:r>
+        <w:rPr>
+          <w:noProof/>
+        </w:rPr>
+        <w:t>ID)</w:t>
+      </w:r>
+      <w:r>
+        <w:rPr>
+          <w:rtl/>
+        </w:rPr>
+        <w:t xml:space="preserve"> والدور والمسار وزمن المعالجة دون كشف أي بيانات شخصية حساسة. يتيح الخادم نقاط فحص الجاهزية التشغيلية </w:t>
+      </w:r>
+      <w:r>
+        <w:rPr>
+          <w:noProof/>
+        </w:rPr>
+        <w:t>(/health/live</w:t>
+      </w:r>
+      <w:r>
+        <w:rPr>
           <w:rtl/>
         </w:rPr>
         <w:t xml:space="preserve"> و </w:t>
@@ -9797,27 +11626,23 @@
       <w:r>
         <w:rPr>
           <w:noProof/>
-          <w:sz w:val="20"/>
-        </w:rPr>
-        <w:t>/health/ready</w:t>
-      </w:r>
-      <w:r>
-        <w:rPr>
-          <w:sz w:val="20"/>
-          <w:rtl/>
-        </w:rPr>
-        <w:t xml:space="preserve">) لسلامة محرك </w:t>
-      </w:r>
-      <w:r>
-        <w:rPr>
-          <w:noProof/>
-          <w:sz w:val="20"/>
+        </w:rPr>
+        <w:t>/health/ready)</w:t>
+      </w:r>
+      <w:r>
+        <w:rPr>
+          <w:rtl/>
+        </w:rPr>
+        <w:t xml:space="preserve"> لسلامة محرك </w:t>
+      </w:r>
+      <w:r>
+        <w:rPr>
+          <w:noProof/>
         </w:rPr>
         <w:t>(Node.js)</w:t>
       </w:r>
       <w:r>
         <w:rPr>
-          <w:sz w:val="20"/>
           <w:rtl/>
         </w:rPr>
         <w:t xml:space="preserve"> والاتصال بقاعدة </w:t>
@@ -9825,13 +11650,11 @@
       <w:r>
         <w:rPr>
           <w:noProof/>
-          <w:sz w:val="20"/>
         </w:rPr>
         <w:t>(PostgreSQL)</w:t>
       </w:r>
       <w:r>
         <w:rPr>
-          <w:sz w:val="20"/>
           <w:rtl/>
         </w:rPr>
         <w:t xml:space="preserve"> ومخزن </w:t>
@@ -9839,27 +11662,71 @@
       <w:r>
         <w:rPr>
           <w:noProof/>
-          <w:sz w:val="20"/>
-        </w:rPr>
-        <w:t>(Redis)</w:t>
-      </w:r>
-      <w:r>
-        <w:rPr>
-          <w:sz w:val="20"/>
-          <w:rtl/>
-        </w:rPr>
-        <w:t xml:space="preserve">. تُنشر المنظومة عبر حاويات </w:t>
-      </w:r>
-      <w:r>
-        <w:rPr>
-          <w:noProof/>
-          <w:sz w:val="20"/>
-        </w:rPr>
-        <w:t>(Docker Multi‑Stage Build)</w:t>
-      </w:r>
-      <w:r>
-        <w:rPr>
-          <w:sz w:val="20"/>
+        </w:rPr>
+        <w:t>(Redis).</w:t>
+      </w:r>
+      <w:r>
+        <w:rPr>
+          <w:rtl/>
+        </w:rPr>
+        <w:t xml:space="preserve"> تُستضاف المنظومة على خادم افتراضي خاص </w:t>
+      </w:r>
+      <w:r>
+        <w:rPr>
+          <w:noProof/>
+        </w:rPr>
+        <w:t>(VPS)</w:t>
+      </w:r>
+      <w:r>
+        <w:rPr>
+          <w:rtl/>
+        </w:rPr>
+        <w:t xml:space="preserve"> من </w:t>
+      </w:r>
+      <w:r>
+        <w:rPr>
+          <w:noProof/>
+        </w:rPr>
+        <w:t>Contabo</w:t>
+      </w:r>
+      <w:r>
+        <w:rPr>
+          <w:rtl/>
+        </w:rPr>
+        <w:t xml:space="preserve"> مع تخزين محلي خاص للملفات، وتُنشر عبر حاويات </w:t>
+      </w:r>
+      <w:r>
+        <w:rPr>
+          <w:noProof/>
+        </w:rPr>
+        <w:t>(Docker</w:t>
+      </w:r>
+      <w:r>
+        <w:rPr>
+          <w:rtl/>
+        </w:rPr>
+        <w:t xml:space="preserve"> </w:t>
+      </w:r>
+      <w:r>
+        <w:rPr>
+          <w:noProof/>
+        </w:rPr>
+        <w:t>Multi‑Stage</w:t>
+      </w:r>
+      <w:r>
+        <w:rPr>
+          <w:rtl/>
+        </w:rPr>
+        <w:t xml:space="preserve"> </w:t>
+      </w:r>
+      <w:r>
+        <w:rPr>
+          <w:noProof/>
+        </w:rPr>
+        <w:t>Build)</w:t>
+      </w:r>
+      <w:r>
+        <w:rPr>
           <w:rtl/>
         </w:rPr>
         <w:t xml:space="preserve"> مؤمنة ومحدثة دورياً مع ترحيلات قواعد بيانات آلية ومختبرة.</w:t>
@@ -10690,7 +12557,44 @@
         <w:rPr>
           <w:rtl/>
         </w:rPr>
-        <w:t>تسليم التطوير يشمل قاموس البيانات والقيود والفهارس ونسخ النطاق، توثيق (OpenAPI)، مصفوفة الأدوار، تدفقات واجهات (Flutter Android/Web)، عقد مزود الرسائل، خطة مفاتيح التشفير، اختبارات قبول وسجلاتها، دليل التشغيل والاستعادة، ومقاييس لوحة المراقبة. تُعتمد قبل الإطلاق وسيلة الدفع والتحقق منها، نمط المعرّف، سياسة النقاط، جهة اعتماد النطاق، فترات الاحتفاظ، وأهداف الخدمة النهائية. لا تعني هذه الوثيقة أن إجراءات التعاقد أو الدفع قد تم اعتمادها بالفعل.</w:t>
+        <w:lastRenderedPageBreak/>
+        <w:t xml:space="preserve">تسليم التطوير يشمل قاموس البيانات والقيود والفهارس ونسخ النطاق، توثيق </w:t>
+      </w:r>
+      <w:r>
+        <w:rPr>
+          <w:noProof/>
+        </w:rPr>
+        <w:t>(OpenAPI)</w:t>
+      </w:r>
+      <w:r>
+        <w:rPr>
+          <w:rtl/>
+        </w:rPr>
+        <w:t xml:space="preserve">، مصفوفة الأدوار، تدفقات واجهات </w:t>
+      </w:r>
+      <w:r>
+        <w:rPr>
+          <w:noProof/>
+        </w:rPr>
+        <w:t>(Flutter</w:t>
+      </w:r>
+      <w:r>
+        <w:rPr>
+          <w:rtl/>
+        </w:rPr>
+        <w:t xml:space="preserve"> </w:t>
+      </w:r>
+      <w:r>
+        <w:rPr>
+          <w:noProof/>
+        </w:rPr>
+        <w:t>Android/Web)</w:t>
+      </w:r>
+      <w:r>
+        <w:rPr>
+          <w:rtl/>
+        </w:rPr>
+        <w:t>، عقد مزود الرسائل، خطة مفاتيح التشفير، اختبارات قبول وسجلاتها، دليل التشغيل والاستعادة، ومقاييس لوحة المراقبة. تُعتمد قبل الإطلاق وسيلة الدفع والتحقق منها، نمط المعرّف، سياسة النقاط، جهة اعتماد النطاق، فترات الاحتفاظ، وأهداف الخدمة النهائية. لا تعني هذه الوثيقة أن إجراءات التعاقد أو الدفع قد تم اعتمادها بالفعل.</w:t>
       </w:r>
     </w:p>
     <w:p>
@@ -11492,55 +13396,86 @@
           <w:color w:val="203A43"/>
           <w:sz w:val="24"/>
         </w:rPr>
-        <w:t>(Service Request Finite State Machine)</w:t>
+        <w:t>(Service</w:t>
+      </w:r>
+      <w:r>
+        <w:rPr>
+          <w:b/>
+          <w:color w:val="203A43"/>
+          <w:sz w:val="24"/>
+          <w:rtl/>
+        </w:rPr>
+        <w:t> </w:t>
+      </w:r>
+      <w:r>
+        <w:rPr>
+          <w:b/>
+          <w:noProof/>
+          <w:color w:val="203A43"/>
+          <w:sz w:val="24"/>
+        </w:rPr>
+        <w:t>Request</w:t>
+      </w:r>
+      <w:r>
+        <w:rPr>
+          <w:b/>
+          <w:color w:val="203A43"/>
+          <w:sz w:val="24"/>
+          <w:rtl/>
+        </w:rPr>
+        <w:t> </w:t>
+      </w:r>
+      <w:r>
+        <w:rPr>
+          <w:b/>
+          <w:noProof/>
+          <w:color w:val="203A43"/>
+          <w:sz w:val="24"/>
+        </w:rPr>
+        <w:t>Finite</w:t>
+      </w:r>
+      <w:r>
+        <w:rPr>
+          <w:b/>
+          <w:color w:val="203A43"/>
+          <w:sz w:val="24"/>
+          <w:rtl/>
+        </w:rPr>
+        <w:t> </w:t>
+      </w:r>
+      <w:r>
+        <w:rPr>
+          <w:b/>
+          <w:noProof/>
+          <w:color w:val="203A43"/>
+          <w:sz w:val="24"/>
+        </w:rPr>
+        <w:t>State</w:t>
+      </w:r>
+      <w:r>
+        <w:rPr>
+          <w:b/>
+          <w:color w:val="203A43"/>
+          <w:sz w:val="24"/>
+          <w:rtl/>
+        </w:rPr>
+        <w:t> </w:t>
+      </w:r>
+      <w:r>
+        <w:rPr>
+          <w:b/>
+          <w:noProof/>
+          <w:color w:val="203A43"/>
+          <w:sz w:val="24"/>
+        </w:rPr>
+        <w:t>Machine)</w:t>
       </w:r>
     </w:p>
     <w:p>
       <w:pPr>
         <w:bidi/>
-        <w:jc w:val="center"/>
+        <w:jc w:val="right"/>
       </w:pPr>
-      <w:r>
-        <w:rPr>
-          <w:noProof/>
-          <w:rtl/>
-        </w:rPr>
-        <w:drawing>
-          <wp:inline distT="0" distB="0" distL="0" distR="0" wp14:anchorId="2A9351FB" wp14:editId="70BCE106">
-            <wp:extent cx="5943600" cy="2932176"/>
-            <wp:effectExtent l="0" t="0" r="0" b="0"/>
-            <wp:docPr id="16" name="Picture 16"/>
-            <wp:cNvGraphicFramePr>
-              <a:graphicFrameLocks xmlns:a="http://schemas.openxmlformats.org/drawingml/2006/main" noChangeAspect="1"/>
-            </wp:cNvGraphicFramePr>
-            <a:graphic xmlns:a="http://schemas.openxmlformats.org/drawingml/2006/main">
-              <a:graphicData uri="http://schemas.openxmlformats.org/drawingml/2006/picture">
-                <pic:pic xmlns:pic="http://schemas.openxmlformats.org/drawingml/2006/picture">
-                  <pic:nvPicPr>
-                    <pic:cNvPr id="0" name="image.png"/>
-                    <pic:cNvPicPr/>
-                  </pic:nvPicPr>
-                  <pic:blipFill>
-                    <a:blip r:embed="rId23"/>
-                    <a:stretch>
-                      <a:fillRect/>
-                    </a:stretch>
-                  </pic:blipFill>
-                  <pic:spPr>
-                    <a:xfrm>
-                      <a:off x="0" y="0"/>
-                      <a:ext cx="5943600" cy="2932176"/>
-                    </a:xfrm>
-                    <a:prstGeom prst="rect">
-                      <a:avLst/>
-                    </a:prstGeom>
-                  </pic:spPr>
-                </pic:pic>
-              </a:graphicData>
-            </a:graphic>
-          </wp:inline>
-        </w:drawing>
-      </w:r>
     </w:p>
     <w:p>
       <w:pPr>
@@ -11594,7 +13529,199 @@
         <w:rPr>
           <w:rtl/>
         </w:rPr>
-        <w:t>الأعمدة المطلوبة في (CSV UTF-8): (batch_reference)، (row_number)، (visit_reference)، (entity_code)، (worker_id)، (task_id)، (occurred_at_utc)، (organic_kg)، (dry_kg)، (rejected_kg)، (scale_reference)، (evidence_reference). التواريخ بمعيار (ISO 8601)، الأوزان بثلاث منازل عشرية وغير سالبة، والمراجع النصية لا تحتوي معلومات شخصية. يطابق الاستيراد المهمة والرمز ونسخة التعريفة والنطاق؛ تحفظ الأخطاء في (FieldBatchRowError)، وتعاد صفوف التصحيح في دفعة جديدة. ملف بنفس البصمة لا يستورد ثانية.</w:t>
+        <w:t xml:space="preserve">الأعمدة المطلوبة في </w:t>
+      </w:r>
+      <w:r>
+        <w:rPr>
+          <w:noProof/>
+        </w:rPr>
+        <w:t>(CSV</w:t>
+      </w:r>
+      <w:r>
+        <w:rPr>
+          <w:rtl/>
+        </w:rPr>
+        <w:t xml:space="preserve"> </w:t>
+      </w:r>
+      <w:r>
+        <w:rPr>
+          <w:noProof/>
+        </w:rPr>
+        <w:t>UTF‑8):</w:t>
+      </w:r>
+      <w:r>
+        <w:rPr>
+          <w:rtl/>
+        </w:rPr>
+        <w:t xml:space="preserve"> </w:t>
+      </w:r>
+      <w:r>
+        <w:rPr>
+          <w:noProof/>
+        </w:rPr>
+        <w:t>(batch_reference)</w:t>
+      </w:r>
+      <w:r>
+        <w:rPr>
+          <w:rtl/>
+        </w:rPr>
+        <w:t xml:space="preserve">، </w:t>
+      </w:r>
+      <w:r>
+        <w:rPr>
+          <w:noProof/>
+        </w:rPr>
+        <w:t>(row_number)</w:t>
+      </w:r>
+      <w:r>
+        <w:rPr>
+          <w:rtl/>
+        </w:rPr>
+        <w:t xml:space="preserve">، </w:t>
+      </w:r>
+      <w:r>
+        <w:rPr>
+          <w:noProof/>
+        </w:rPr>
+        <w:t>(visit_reference)</w:t>
+      </w:r>
+      <w:r>
+        <w:rPr>
+          <w:rtl/>
+        </w:rPr>
+        <w:t xml:space="preserve">، </w:t>
+      </w:r>
+      <w:r>
+        <w:rPr>
+          <w:noProof/>
+        </w:rPr>
+        <w:t>(entity_code)</w:t>
+      </w:r>
+      <w:r>
+        <w:rPr>
+          <w:rtl/>
+        </w:rPr>
+        <w:t xml:space="preserve">، </w:t>
+      </w:r>
+      <w:r>
+        <w:rPr>
+          <w:noProof/>
+        </w:rPr>
+        <w:t>(worker_id)</w:t>
+      </w:r>
+      <w:r>
+        <w:rPr>
+          <w:rtl/>
+        </w:rPr>
+        <w:t xml:space="preserve">، </w:t>
+      </w:r>
+      <w:r>
+        <w:rPr>
+          <w:noProof/>
+        </w:rPr>
+        <w:t>(task_id)</w:t>
+      </w:r>
+      <w:r>
+        <w:rPr>
+          <w:rtl/>
+        </w:rPr>
+        <w:t xml:space="preserve">، </w:t>
+      </w:r>
+      <w:r>
+        <w:rPr>
+          <w:noProof/>
+        </w:rPr>
+        <w:t>(occurred_at_utc)</w:t>
+      </w:r>
+      <w:r>
+        <w:rPr>
+          <w:rtl/>
+        </w:rPr>
+        <w:t xml:space="preserve">، </w:t>
+      </w:r>
+      <w:r>
+        <w:rPr>
+          <w:noProof/>
+        </w:rPr>
+        <w:t>(organic_kg)</w:t>
+      </w:r>
+      <w:r>
+        <w:rPr>
+          <w:rtl/>
+        </w:rPr>
+        <w:t xml:space="preserve">، </w:t>
+      </w:r>
+      <w:r>
+        <w:rPr>
+          <w:noProof/>
+        </w:rPr>
+        <w:t>(dry_kg)</w:t>
+      </w:r>
+      <w:r>
+        <w:rPr>
+          <w:rtl/>
+        </w:rPr>
+        <w:t xml:space="preserve">، </w:t>
+      </w:r>
+      <w:r>
+        <w:rPr>
+          <w:noProof/>
+        </w:rPr>
+        <w:t>(rejected_kg)</w:t>
+      </w:r>
+      <w:r>
+        <w:rPr>
+          <w:rtl/>
+        </w:rPr>
+        <w:t xml:space="preserve">، </w:t>
+      </w:r>
+      <w:r>
+        <w:rPr>
+          <w:noProof/>
+        </w:rPr>
+        <w:t>(scale_reference)</w:t>
+      </w:r>
+      <w:r>
+        <w:rPr>
+          <w:rtl/>
+        </w:rPr>
+        <w:t xml:space="preserve">، </w:t>
+      </w:r>
+      <w:r>
+        <w:rPr>
+          <w:noProof/>
+        </w:rPr>
+        <w:t>(evidence_reference).</w:t>
+      </w:r>
+      <w:r>
+        <w:rPr>
+          <w:rtl/>
+        </w:rPr>
+        <w:t xml:space="preserve"> التواريخ بمعيار </w:t>
+      </w:r>
+      <w:r>
+        <w:rPr>
+          <w:noProof/>
+        </w:rPr>
+        <w:t>(ISO</w:t>
+      </w:r>
+      <w:r>
+        <w:rPr>
+          <w:rtl/>
+        </w:rPr>
+        <w:t xml:space="preserve"> 8601)، الأوزان بثلاث منازل عشرية وغير سالبة، والمراجع النصية لا تحتوي معلومات شخصية. يطابق الاستيراد المهمة والرمز ونسخة التعريفة والنطاق؛ تحفظ الأخطاء في </w:t>
+      </w:r>
+      <w:r>
+        <w:rPr>
+          <w:noProof/>
+        </w:rPr>
+        <w:t>(FieldBatchRowError)</w:t>
+      </w:r>
+      <w:r>
+        <w:rPr>
+          <w:rtl/>
+        </w:rPr>
+        <w:t>، وتعاد صفوف التصحيح في دفعة جديدة. ملف بنفس البصمة لا يستورد ثانية.</w:t>
       </w:r>
     </w:p>
     <w:p>
@@ -12479,7 +14606,7 @@
       </w:r>
     </w:p>
     <w:sectPr>
-      <w:footerReference w:type="default" r:id="rId24"/>
+      <w:footerReference w:type="default" r:id="rId19"/>
       <w:pgSz w:w="11909" w:h="16834"/>
       <w:pgMar w:top="1080" w:right="1008" w:bottom="1440" w:left="1008" w:header="720" w:footer="504" w:gutter="0"/>
       <w:cols w:space="720"/>

</xml_diff>

<commit_message>
fix: apply precise final remediations to Word blueprint, sequence flows, data dictionary, security, and roadmap
</commit_message>
<xml_diff>
--- a/ATHAR_Master_Software_Operational_Blueprint_AR_Updated.docx
+++ b/ATHAR_Master_Software_Operational_Blueprint_AR_Updated.docx
@@ -2328,67 +2328,7 @@
         <w:rPr>
           <w:rtl/>
         </w:rPr>
-        <w:t xml:space="preserve">الفرز عند المصدر مساران: عضوي وجاف. المرفوض وزن مستبعد، لا مسار فرز ثالث منتج للنقاط. الاعتماد النهائي للأوزان وحده ينشئ نقاطاً، وتعتمد المنظومة نمط المحاسبة المالية المزدوجة </w:t>
-      </w:r>
-      <w:r>
-        <w:rPr>
-          <w:noProof/>
-        </w:rPr>
-        <w:t>(Double</w:t>
-      </w:r>
-      <w:r>
-        <w:rPr>
-          <w:rtl/>
-        </w:rPr>
-        <w:t>‑</w:t>
-      </w:r>
-      <w:r>
-        <w:rPr>
-          <w:noProof/>
-        </w:rPr>
-        <w:t>Entry</w:t>
-      </w:r>
-      <w:r>
-        <w:rPr>
-          <w:rtl/>
-        </w:rPr>
-        <w:t> </w:t>
-      </w:r>
-      <w:r>
-        <w:rPr>
-          <w:noProof/>
-        </w:rPr>
-        <w:t>Points</w:t>
-      </w:r>
-      <w:r>
-        <w:rPr>
-          <w:rtl/>
-        </w:rPr>
-        <w:t> </w:t>
-      </w:r>
-      <w:r>
-        <w:rPr>
-          <w:noProof/>
-        </w:rPr>
-        <w:t>Accounting)</w:t>
-      </w:r>
-      <w:r>
-        <w:rPr>
-          <w:rtl/>
-        </w:rPr>
-        <w:t xml:space="preserve"> عبر قيود متوازنة </w:t>
-      </w:r>
-      <w:r>
-        <w:rPr>
-          <w:noProof/>
-        </w:rPr>
-        <w:t>(Debit/Credit)</w:t>
-      </w:r>
-      <w:r>
-        <w:rPr>
-          <w:rtl/>
-        </w:rPr>
-        <w:t xml:space="preserve"> بين حساب الإصدار وحساب المستفيد ، والتصحيحات بقيود عكسية موثقة حصراً لمنع التضخم أو التزييف.</w:t>
+        <w:t>الفرز عند المصدر مساران: عضوي وجاف. المرفوض وزن مستبعد، لا مسار فرز ثالث منتج للنقاط. الاعتماد النهائي للأوزان وحده ينشئ نقاطاً، والتصحيحات بقيود عكسية.</w:t>
       </w:r>
     </w:p>
     <w:p>
@@ -2983,15 +2923,7 @@
                 <w:sz w:val="18"/>
                 <w:rtl/>
               </w:rPr>
-              <w:t xml:space="preserve">لوحة تحكم مكتبية شاملة للموظفين والإدارة: غرفة المراقبة والإسناد الحي، خدمة العملاء والشكاوى، إدارة المتجر والمستودعات، </w:t>
-            </w:r>
-            <w:r>
-              <w:rPr>
-                <w:sz w:val="18"/>
-                <w:rtl/>
-              </w:rPr>
-              <w:lastRenderedPageBreak/>
-              <w:t>التسويات المالية، ومحرر النطاقات والتدقيق.</w:t>
+              <w:t>لوحة تحكم مكتبية شاملة للموظفين والإدارة: غرفة المراقبة والإسناد الحي، خدمة العملاء والشكاوى، إدارة المتجر والمستودعات، التسويات المالية، ومحرر النطاقات والتدقيق.</w:t>
             </w:r>
           </w:p>
         </w:tc>
@@ -3024,7 +2956,6 @@
                 <w:sz w:val="18"/>
                 <w:rtl/>
               </w:rPr>
-              <w:lastRenderedPageBreak/>
               <w:t xml:space="preserve">بوابة الإدارة المركزية </w:t>
             </w:r>
             <w:r>
@@ -3103,6 +3034,7 @@
                 <w:sz w:val="18"/>
                 <w:rtl/>
               </w:rPr>
+              <w:lastRenderedPageBreak/>
               <w:t xml:space="preserve">معمارية نمطية موحدة </w:t>
             </w:r>
             <w:r>
@@ -4259,14 +4191,7 @@
         <w:rPr>
           <w:rtl/>
         </w:rPr>
-        <w:t xml:space="preserve"> والنسخة الجغرافية والسبب، دون </w:t>
-      </w:r>
-      <w:r>
-        <w:rPr>
-          <w:rtl/>
-        </w:rPr>
-        <w:lastRenderedPageBreak/>
-        <w:t xml:space="preserve">إسناد أو حجز؛ تعرض رسالة «الخدمة غير متوفرة بعد في هذا النطاق، ستتوفر قريباً»، ويمكن طلب الانضمام إلى </w:t>
+        <w:t xml:space="preserve"> والنسخة الجغرافية والسبب، دون إسناد أو حجز؛ تعرض رسالة «الخدمة غير متوفرة بعد في هذا النطاق، ستتوفر قريباً»، ويمكن طلب الانضمام إلى </w:t>
       </w:r>
       <w:r>
         <w:rPr>
@@ -4788,7 +4713,6 @@
         <w:rPr>
           <w:rtl/>
         </w:rPr>
-        <w:lastRenderedPageBreak/>
         <w:t xml:space="preserve">تتكامل بوابة الإدارة والعمليات المركزية </w:t>
       </w:r>
       <w:r>
@@ -6288,7 +6212,6 @@
         <w:rPr>
           <w:rtl/>
         </w:rPr>
-        <w:lastRenderedPageBreak/>
         <w:t>5 نموذج قواعد البيانات الموحد</w:t>
       </w:r>
     </w:p>
@@ -8675,7 +8598,6 @@
                 <w:sz w:val="18"/>
                 <w:rtl/>
               </w:rPr>
-              <w:lastRenderedPageBreak/>
               <w:t>خريطة حية للمهام وعمال الميدان المعلقين</w:t>
             </w:r>
           </w:p>
@@ -10321,7 +10243,7 @@
         <w:rPr>
           <w:rtl/>
         </w:rPr>
-        <w:t xml:space="preserve">المعرّف الحسابي المكون من 5 إلى 6 خانات مخصص للاستدلال المحاسبي وقابل للتخمين، ويحظر استخدامه قطيعاً كمفتاح مرور أو وصول؛ كما تقيّد استعلامات بطاقات </w:t>
+        <w:t xml:space="preserve">المعرّف الحسابي المكون من 5 إلى 6 خانات مخصص للاستدلال المحاسبي وقابل للتخمين، ويحظر استخدامه قطعياً كمفتاح مرور أو وصول؛ كما تقيّد استعلامات بطاقات </w:t>
       </w:r>
       <w:r>
         <w:rPr>
@@ -10472,84 +10394,6 @@
           <w:noProof/>
         </w:rPr>
         <w:t>(Correlation‑ID).</w:t>
-      </w:r>
-    </w:p>
-    <w:p>
-      <w:pPr>
-        <w:bidi/>
-        <w:jc w:val="right"/>
-      </w:pPr>
-      <w:r>
-        <w:rPr>
-          <w:b/>
-          <w:color w:val="203A43"/>
-          <w:sz w:val="24"/>
-          <w:rtl/>
-        </w:rPr>
-        <w:t xml:space="preserve">7 1 محرك كشف الشذوذ ومكافحة الاحتيال في الأوزان </w:t>
-      </w:r>
-      <w:r>
-        <w:rPr>
-          <w:b/>
-          <w:noProof/>
-          <w:color w:val="203A43"/>
-          <w:sz w:val="24"/>
-        </w:rPr>
-        <w:t>(Weight</w:t>
-      </w:r>
-      <w:r>
-        <w:rPr>
-          <w:b/>
-          <w:color w:val="203A43"/>
-          <w:sz w:val="24"/>
-          <w:rtl/>
-        </w:rPr>
-        <w:t> </w:t>
-      </w:r>
-      <w:r>
-        <w:rPr>
-          <w:b/>
-          <w:noProof/>
-          <w:color w:val="203A43"/>
-          <w:sz w:val="24"/>
-        </w:rPr>
-        <w:t>Anti</w:t>
-      </w:r>
-      <w:r>
-        <w:rPr>
-          <w:b/>
-          <w:color w:val="203A43"/>
-          <w:sz w:val="24"/>
-          <w:rtl/>
-        </w:rPr>
-        <w:t>‑</w:t>
-      </w:r>
-      <w:r>
-        <w:rPr>
-          <w:b/>
-          <w:noProof/>
-          <w:color w:val="203A43"/>
-          <w:sz w:val="24"/>
-        </w:rPr>
-        <w:t>Fraud</w:t>
-      </w:r>
-      <w:r>
-        <w:rPr>
-          <w:b/>
-          <w:color w:val="203A43"/>
-          <w:sz w:val="24"/>
-          <w:rtl/>
-        </w:rPr>
-        <w:t> </w:t>
-      </w:r>
-      <w:r>
-        <w:rPr>
-          <w:b/>
-          <w:noProof/>
-          <w:color w:val="203A43"/>
-          <w:sz w:val="24"/>
-        </w:rPr>
-        <w:t>Logic)</w:t>
       </w:r>
     </w:p>
     <w:p>
@@ -10565,12 +10409,9 @@
       </w:pPr>
       <w:r>
         <w:rPr>
-          <w:i/>
-          <w:color w:val="505A69"/>
-          <w:rtl/>
-        </w:rPr>
-        <w:lastRenderedPageBreak/>
-        <w:t>شكل (4): خوارزمية الفحص المزدوج للأوزان الميدانية — التحقق الصارم من السقف الأقصى للخامة، ومقارنة القفزات الإحصائية بمتوسط سجل الأسرة لتجميد النقاط المشبوهة وحماية الخزينة العامة.</w:t>
+          <w:rtl/>
+        </w:rPr>
+        <w:t>شكل (4): خوارزمية فحص الأوزان الميدانية — التحقق الصارم من السقف الأقصى المعتمد للخامة، وتجميد النقاط وإحالة الزيارة للمراجعة الإدارية الميدانية عند الاشتباه لحماية الخزينة العامة.</w:t>
       </w:r>
     </w:p>
     <w:p>
@@ -12557,7 +12398,6 @@
         <w:rPr>
           <w:rtl/>
         </w:rPr>
-        <w:lastRenderedPageBreak/>
         <w:t xml:space="preserve">تسليم التطوير يشمل قاموس البيانات والقيود والفهارس ونسخ النطاق، توثيق </w:t>
       </w:r>
       <w:r>

</xml_diff>

<commit_message>
fix: restore all 5 primary architecture and operational diagrams into Word blueprint
</commit_message>
<xml_diff>
--- a/ATHAR_Master_Software_Operational_Blueprint_AR_Updated.docx
+++ b/ATHAR_Master_Software_Operational_Blueprint_AR_Updated.docx
@@ -3928,8 +3928,48 @@
     <w:p>
       <w:pPr>
         <w:bidi/>
-        <w:jc w:val="right"/>
+        <w:jc w:val="center"/>
       </w:pPr>
+      <w:r>
+        <w:rPr>
+          <w:noProof/>
+        </w:rPr>
+        <w:drawing>
+          <wp:inline distT="0" distB="0" distL="0" distR="0" wp14:anchorId="7005618D" wp14:editId="197C4913">
+            <wp:extent cx="5943600" cy="10167518"/>
+            <wp:effectExtent l="0" t="0" r="0" b="0"/>
+            <wp:docPr id="1" name="Picture 1"/>
+            <wp:cNvGraphicFramePr>
+              <a:graphicFrameLocks xmlns:a="http://schemas.openxmlformats.org/drawingml/2006/main" noChangeAspect="1"/>
+            </wp:cNvGraphicFramePr>
+            <a:graphic xmlns:a="http://schemas.openxmlformats.org/drawingml/2006/main">
+              <a:graphicData uri="http://schemas.openxmlformats.org/drawingml/2006/picture">
+                <pic:pic xmlns:pic="http://schemas.openxmlformats.org/drawingml/2006/picture">
+                  <pic:nvPicPr>
+                    <pic:cNvPr id="0" name="image1.png"/>
+                    <pic:cNvPicPr/>
+                  </pic:nvPicPr>
+                  <pic:blipFill>
+                    <a:blip r:embed="rId19"/>
+                    <a:stretch>
+                      <a:fillRect/>
+                    </a:stretch>
+                  </pic:blipFill>
+                  <pic:spPr>
+                    <a:xfrm>
+                      <a:off x="0" y="0"/>
+                      <a:ext cx="5943600" cy="10167518"/>
+                    </a:xfrm>
+                    <a:prstGeom prst="rect">
+                      <a:avLst/>
+                    </a:prstGeom>
+                  </pic:spPr>
+                </pic:pic>
+              </a:graphicData>
+            </a:graphic>
+          </wp:inline>
+        </w:drawing>
+      </w:r>
     </w:p>
     <w:p>
       <w:pPr>
@@ -4507,8 +4547,48 @@
     <w:p>
       <w:pPr>
         <w:bidi/>
-        <w:jc w:val="right"/>
+        <w:jc w:val="center"/>
       </w:pPr>
+      <w:r>
+        <w:rPr>
+          <w:noProof/>
+        </w:rPr>
+        <w:drawing>
+          <wp:inline distT="0" distB="0" distL="0" distR="0" wp14:anchorId="500C1247" wp14:editId="7A26065B">
+            <wp:extent cx="5943600" cy="4223918"/>
+            <wp:effectExtent l="0" t="0" r="0" b="0"/>
+            <wp:docPr id="2" name="Picture 2"/>
+            <wp:cNvGraphicFramePr>
+              <a:graphicFrameLocks xmlns:a="http://schemas.openxmlformats.org/drawingml/2006/main" noChangeAspect="1"/>
+            </wp:cNvGraphicFramePr>
+            <a:graphic xmlns:a="http://schemas.openxmlformats.org/drawingml/2006/main">
+              <a:graphicData uri="http://schemas.openxmlformats.org/drawingml/2006/picture">
+                <pic:pic xmlns:pic="http://schemas.openxmlformats.org/drawingml/2006/picture">
+                  <pic:nvPicPr>
+                    <pic:cNvPr id="0" name="image2.png"/>
+                    <pic:cNvPicPr/>
+                  </pic:nvPicPr>
+                  <pic:blipFill>
+                    <a:blip r:embed="rId20"/>
+                    <a:stretch>
+                      <a:fillRect/>
+                    </a:stretch>
+                  </pic:blipFill>
+                  <pic:spPr>
+                    <a:xfrm>
+                      <a:off x="0" y="0"/>
+                      <a:ext cx="5943600" cy="4223918"/>
+                    </a:xfrm>
+                    <a:prstGeom prst="rect">
+                      <a:avLst/>
+                    </a:prstGeom>
+                  </pic:spPr>
+                </pic:pic>
+              </a:graphicData>
+            </a:graphic>
+          </wp:inline>
+        </w:drawing>
+      </w:r>
     </w:p>
     <w:p>
       <w:pPr>
@@ -6440,8 +6520,48 @@
     <w:p>
       <w:pPr>
         <w:bidi/>
-        <w:jc w:val="right"/>
+        <w:jc w:val="center"/>
       </w:pPr>
+      <w:r>
+        <w:rPr>
+          <w:noProof/>
+        </w:rPr>
+        <w:drawing>
+          <wp:inline distT="0" distB="0" distL="0" distR="0" wp14:anchorId="1FCEC5B9" wp14:editId="5A841D00">
+            <wp:extent cx="5943600" cy="2559710"/>
+            <wp:effectExtent l="0" t="0" r="0" b="0"/>
+            <wp:docPr id="3" name="Picture 3"/>
+            <wp:cNvGraphicFramePr>
+              <a:graphicFrameLocks xmlns:a="http://schemas.openxmlformats.org/drawingml/2006/main" noChangeAspect="1"/>
+            </wp:cNvGraphicFramePr>
+            <a:graphic xmlns:a="http://schemas.openxmlformats.org/drawingml/2006/main">
+              <a:graphicData uri="http://schemas.openxmlformats.org/drawingml/2006/picture">
+                <pic:pic xmlns:pic="http://schemas.openxmlformats.org/drawingml/2006/picture">
+                  <pic:nvPicPr>
+                    <pic:cNvPr id="0" name="image3.png"/>
+                    <pic:cNvPicPr/>
+                  </pic:nvPicPr>
+                  <pic:blipFill>
+                    <a:blip r:embed="rId21"/>
+                    <a:stretch>
+                      <a:fillRect/>
+                    </a:stretch>
+                  </pic:blipFill>
+                  <pic:spPr>
+                    <a:xfrm>
+                      <a:off x="0" y="0"/>
+                      <a:ext cx="5943600" cy="2559710"/>
+                    </a:xfrm>
+                    <a:prstGeom prst="rect">
+                      <a:avLst/>
+                    </a:prstGeom>
+                  </pic:spPr>
+                </pic:pic>
+              </a:graphicData>
+            </a:graphic>
+          </wp:inline>
+        </w:drawing>
+      </w:r>
     </w:p>
     <w:p>
       <w:pPr>
@@ -10399,8 +10519,48 @@
     <w:p>
       <w:pPr>
         <w:bidi/>
-        <w:jc w:val="right"/>
+        <w:jc w:val="center"/>
       </w:pPr>
+      <w:r>
+        <w:rPr>
+          <w:noProof/>
+        </w:rPr>
+        <w:drawing>
+          <wp:inline distT="0" distB="0" distL="0" distR="0" wp14:anchorId="19597E31" wp14:editId="194AD493">
+            <wp:extent cx="4389120" cy="6941384"/>
+            <wp:effectExtent l="0" t="0" r="0" b="0"/>
+            <wp:docPr id="4" name="Picture 4"/>
+            <wp:cNvGraphicFramePr>
+              <a:graphicFrameLocks xmlns:a="http://schemas.openxmlformats.org/drawingml/2006/main" noChangeAspect="1"/>
+            </wp:cNvGraphicFramePr>
+            <a:graphic xmlns:a="http://schemas.openxmlformats.org/drawingml/2006/main">
+              <a:graphicData uri="http://schemas.openxmlformats.org/drawingml/2006/picture">
+                <pic:pic xmlns:pic="http://schemas.openxmlformats.org/drawingml/2006/picture">
+                  <pic:nvPicPr>
+                    <pic:cNvPr id="0" name="image4.png"/>
+                    <pic:cNvPicPr/>
+                  </pic:nvPicPr>
+                  <pic:blipFill>
+                    <a:blip r:embed="rId22"/>
+                    <a:stretch>
+                      <a:fillRect/>
+                    </a:stretch>
+                  </pic:blipFill>
+                  <pic:spPr>
+                    <a:xfrm>
+                      <a:off x="0" y="0"/>
+                      <a:ext cx="4389120" cy="6941384"/>
+                    </a:xfrm>
+                    <a:prstGeom prst="rect">
+                      <a:avLst/>
+                    </a:prstGeom>
+                  </pic:spPr>
+                </pic:pic>
+              </a:graphicData>
+            </a:graphic>
+          </wp:inline>
+        </w:drawing>
+      </w:r>
     </w:p>
     <w:p>
       <w:pPr>
@@ -13314,8 +13474,48 @@
     <w:p>
       <w:pPr>
         <w:bidi/>
-        <w:jc w:val="right"/>
+        <w:jc w:val="center"/>
       </w:pPr>
+      <w:r>
+        <w:rPr>
+          <w:noProof/>
+        </w:rPr>
+        <w:drawing>
+          <wp:inline distT="0" distB="0" distL="0" distR="0" wp14:anchorId="66C9DCC6" wp14:editId="69277BCF">
+            <wp:extent cx="5943600" cy="2932176"/>
+            <wp:effectExtent l="0" t="0" r="0" b="0"/>
+            <wp:docPr id="5" name="Picture 5"/>
+            <wp:cNvGraphicFramePr>
+              <a:graphicFrameLocks xmlns:a="http://schemas.openxmlformats.org/drawingml/2006/main" noChangeAspect="1"/>
+            </wp:cNvGraphicFramePr>
+            <a:graphic xmlns:a="http://schemas.openxmlformats.org/drawingml/2006/main">
+              <a:graphicData uri="http://schemas.openxmlformats.org/drawingml/2006/picture">
+                <pic:pic xmlns:pic="http://schemas.openxmlformats.org/drawingml/2006/picture">
+                  <pic:nvPicPr>
+                    <pic:cNvPr id="0" name="image5.png"/>
+                    <pic:cNvPicPr/>
+                  </pic:nvPicPr>
+                  <pic:blipFill>
+                    <a:blip r:embed="rId23"/>
+                    <a:stretch>
+                      <a:fillRect/>
+                    </a:stretch>
+                  </pic:blipFill>
+                  <pic:spPr>
+                    <a:xfrm>
+                      <a:off x="0" y="0"/>
+                      <a:ext cx="5943600" cy="2932176"/>
+                    </a:xfrm>
+                    <a:prstGeom prst="rect">
+                      <a:avLst/>
+                    </a:prstGeom>
+                  </pic:spPr>
+                </pic:pic>
+              </a:graphicData>
+            </a:graphic>
+          </wp:inline>
+        </w:drawing>
+      </w:r>
     </w:p>
     <w:p>
       <w:pPr>
@@ -14446,7 +14646,7 @@
       </w:r>
     </w:p>
     <w:sectPr>
-      <w:footerReference w:type="default" r:id="rId19"/>
+      <w:footerReference w:type="default" r:id="rId24"/>
       <w:pgSz w:w="11909" w:h="16834"/>
       <w:pgMar w:top="1080" w:right="1008" w:bottom="1440" w:left="1008" w:header="720" w:footer="504" w:gutter="0"/>
       <w:cols w:space="720"/>

</xml_diff>

<commit_message>
docs: remove quick start guide, upgrade diagrams to ultra-HD, and finalize RTL document layout
</commit_message>
<xml_diff>
--- a/ATHAR_Master_Software_Operational_Blueprint_AR_Updated.docx
+++ b/ATHAR_Master_Software_Operational_Blueprint_AR_Updated.docx
@@ -77,51 +77,16 @@
         </w:rPr>
         <w:t xml:space="preserve">: </w:t>
       </w:r>
-      <w:r>
-        <w:rPr>
-          <w:b/>
-          <w:noProof/>
-          <w:color w:val="203A43"/>
-          <w:sz w:val="22"/>
-        </w:rPr>
-        <w:t>https://github.com/A</w:t>
-      </w:r>
-      <w:r>
-        <w:rPr>
-          <w:b/>
-          <w:color w:val="203A43"/>
-          <w:sz w:val="22"/>
-          <w:rtl/>
-        </w:rPr>
-        <w:t>‑</w:t>
-      </w:r>
-      <w:r>
-        <w:rPr>
-          <w:b/>
-          <w:noProof/>
-          <w:color w:val="203A43"/>
-          <w:sz w:val="22"/>
-        </w:rPr>
-        <w:t>S</w:t>
-      </w:r>
-      <w:r>
-        <w:rPr>
-          <w:b/>
-          <w:color w:val="203A43"/>
-          <w:sz w:val="22"/>
-          <w:rtl/>
-        </w:rPr>
-        <w:t>‑</w:t>
-      </w:r>
-      <w:r>
-        <w:rPr>
-          <w:b/>
-          <w:noProof/>
-          <w:color w:val="203A43"/>
-          <w:sz w:val="22"/>
-        </w:rPr>
-        <w:t>Y/Athar</w:t>
-      </w:r>
+      <w:hyperlink r:id="rId8" w:history="1">
+        <w:r>
+          <w:rPr>
+            <w:rStyle w:val="Hyperlink"/>
+            <w:b/>
+            <w:sz w:val="22"/>
+          </w:rPr>
+          <w:t>https://github.com/A-S-Y/Athar</w:t>
+        </w:r>
+      </w:hyperlink>
       <w:r>
         <w:rPr>
           <w:b/>
@@ -231,57 +196,18 @@
       </w:pPr>
       <w:r>
         <w:rPr>
+          <w:sz w:val="22"/>
+          <w:rtl/>
+        </w:rPr>
+        <w:t xml:space="preserve">دليل التوثيق الهندسي ومصفوفة الملفات على </w:t>
+      </w:r>
+      <w:r>
+        <w:rPr>
           <w:b/>
-          <w:color w:val="203A43"/>
-          <w:sz w:val="24"/>
-          <w:rtl/>
-        </w:rPr>
-        <w:t xml:space="preserve">دليل التوثيق الهندسي ومصفوفة الملفات على </w:t>
-      </w:r>
-      <w:r>
-        <w:rPr>
-          <w:b/>
-          <w:noProof/>
-          <w:color w:val="203A43"/>
-          <w:sz w:val="24"/>
-        </w:rPr>
-        <w:t>GitHub</w:t>
-      </w:r>
-      <w:r>
-        <w:rPr>
-          <w:b/>
-          <w:color w:val="203A43"/>
-          <w:sz w:val="24"/>
-          <w:rtl/>
-        </w:rPr>
-        <w:t xml:space="preserve"> </w:t>
-      </w:r>
-      <w:r>
-        <w:rPr>
-          <w:b/>
-          <w:noProof/>
-          <w:color w:val="203A43"/>
-          <w:sz w:val="24"/>
-        </w:rPr>
-        <w:t>(Documentation</w:t>
-      </w:r>
-      <w:r>
-        <w:rPr>
-          <w:b/>
-          <w:color w:val="203A43"/>
-          <w:sz w:val="24"/>
-          <w:rtl/>
-        </w:rPr>
-        <w:t> </w:t>
-      </w:r>
-      <w:r>
-        <w:rPr>
-          <w:b/>
-          <w:noProof/>
-          <w:color w:val="203A43"/>
-          <w:sz w:val="24"/>
-        </w:rPr>
-        <w:t>Index)</w:t>
+          <w:noProof/>
+          <w:sz w:val="22"/>
+        </w:rPr>
+        <w:t>GitHub (Documentation Index)</w:t>
       </w:r>
     </w:p>
     <w:tbl>
@@ -291,9 +217,9 @@
         <w:tblLook w:val="04A0" w:firstRow="1" w:lastRow="0" w:firstColumn="1" w:lastColumn="0" w:noHBand="0" w:noVBand="1"/>
       </w:tblPr>
       <w:tblGrid>
-        <w:gridCol w:w="2493"/>
-        <w:gridCol w:w="2242"/>
-        <w:gridCol w:w="5374"/>
+        <w:gridCol w:w="2669"/>
+        <w:gridCol w:w="2474"/>
+        <w:gridCol w:w="4966"/>
       </w:tblGrid>
       <w:tr>
         <w:tc>
@@ -482,19 +408,13 @@
           <w:p>
             <w:pPr>
               <w:bidi/>
-              <w:jc w:val="right"/>
-            </w:pPr>
-            <w:hyperlink r:id="rId8">
-              <w:r>
-                <w:rPr>
-                  <w:b/>
-                  <w:noProof/>
-                  <w:color w:val="0969DA"/>
-                  <w:u w:val="single"/>
-                </w:rPr>
-                <w:t>docs/01‑architecture/system‑overview.md</w:t>
-              </w:r>
-            </w:hyperlink>
+            </w:pPr>
+            <w:r>
+              <w:rPr>
+                <w:noProof/>
+              </w:rPr>
+              <w:t>docs/01‑architecture/system‑overview.md</w:t>
+            </w:r>
           </w:p>
         </w:tc>
       </w:tr>
@@ -581,19 +501,13 @@
           <w:p>
             <w:pPr>
               <w:bidi/>
-              <w:jc w:val="right"/>
-            </w:pPr>
-            <w:hyperlink r:id="rId9">
-              <w:r>
-                <w:rPr>
-                  <w:b/>
-                  <w:noProof/>
-                  <w:color w:val="0969DA"/>
-                  <w:u w:val="single"/>
-                </w:rPr>
-                <w:t>docs/01‑architecture/back‑office‑portal.md</w:t>
-              </w:r>
-            </w:hyperlink>
+            </w:pPr>
+            <w:r>
+              <w:rPr>
+                <w:noProof/>
+              </w:rPr>
+              <w:t>docs/01‑architecture/back‑office‑portal.md</w:t>
+            </w:r>
           </w:p>
         </w:tc>
       </w:tr>
@@ -680,19 +594,13 @@
           <w:p>
             <w:pPr>
               <w:bidi/>
-              <w:jc w:val="right"/>
-            </w:pPr>
-            <w:hyperlink r:id="rId10">
-              <w:r>
-                <w:rPr>
-                  <w:b/>
-                  <w:noProof/>
-                  <w:color w:val="0969DA"/>
-                  <w:u w:val="single"/>
-                </w:rPr>
-                <w:t>docs/02‑database/erd.md</w:t>
-              </w:r>
-            </w:hyperlink>
+            </w:pPr>
+            <w:r>
+              <w:rPr>
+                <w:noProof/>
+              </w:rPr>
+              <w:t>docs/02‑database/erd.md</w:t>
+            </w:r>
           </w:p>
         </w:tc>
       </w:tr>
@@ -763,19 +671,13 @@
           <w:p>
             <w:pPr>
               <w:bidi/>
-              <w:jc w:val="right"/>
-            </w:pPr>
-            <w:hyperlink r:id="rId11">
-              <w:r>
-                <w:rPr>
-                  <w:b/>
-                  <w:noProof/>
-                  <w:color w:val="0969DA"/>
-                  <w:u w:val="single"/>
-                </w:rPr>
-                <w:t>docs/02‑database/data‑dictionary.md</w:t>
-              </w:r>
-            </w:hyperlink>
+            </w:pPr>
+            <w:r>
+              <w:rPr>
+                <w:noProof/>
+              </w:rPr>
+              <w:t>docs/02‑database/data‑dictionary.md</w:t>
+            </w:r>
           </w:p>
         </w:tc>
       </w:tr>
@@ -868,19 +770,13 @@
           <w:p>
             <w:pPr>
               <w:bidi/>
-              <w:jc w:val="right"/>
-            </w:pPr>
-            <w:hyperlink r:id="rId12">
-              <w:r>
-                <w:rPr>
-                  <w:b/>
-                  <w:noProof/>
-                  <w:color w:val="0969DA"/>
-                  <w:u w:val="single"/>
-                </w:rPr>
-                <w:t>docs/03‑flows‑and‑logic/sequences.md</w:t>
-              </w:r>
-            </w:hyperlink>
+            </w:pPr>
+            <w:r>
+              <w:rPr>
+                <w:noProof/>
+              </w:rPr>
+              <w:t>docs/03‑flows‑and‑logic/sequences.md</w:t>
+            </w:r>
           </w:p>
         </w:tc>
       </w:tr>
@@ -959,19 +855,13 @@
           <w:p>
             <w:pPr>
               <w:bidi/>
-              <w:jc w:val="right"/>
-            </w:pPr>
-            <w:hyperlink r:id="rId13">
-              <w:r>
-                <w:rPr>
-                  <w:b/>
-                  <w:noProof/>
-                  <w:color w:val="0969DA"/>
-                  <w:u w:val="single"/>
-                </w:rPr>
-                <w:t>docs/03‑flows‑and‑logic/state‑machines.md</w:t>
-              </w:r>
-            </w:hyperlink>
+            </w:pPr>
+            <w:r>
+              <w:rPr>
+                <w:noProof/>
+              </w:rPr>
+              <w:t>docs/03‑flows‑and‑logic/state‑machines.md</w:t>
+            </w:r>
           </w:p>
         </w:tc>
       </w:tr>
@@ -1058,19 +948,13 @@
           <w:p>
             <w:pPr>
               <w:bidi/>
-              <w:jc w:val="right"/>
-            </w:pPr>
-            <w:hyperlink r:id="rId14">
-              <w:r>
-                <w:rPr>
-                  <w:b/>
-                  <w:noProof/>
-                  <w:color w:val="0969DA"/>
-                  <w:u w:val="single"/>
-                </w:rPr>
-                <w:t>docs/03‑flows‑and‑logic/business‑logic.md</w:t>
-              </w:r>
-            </w:hyperlink>
+            </w:pPr>
+            <w:r>
+              <w:rPr>
+                <w:noProof/>
+              </w:rPr>
+              <w:t>docs/03‑flows‑and‑logic/business‑logic.md</w:t>
+            </w:r>
           </w:p>
         </w:tc>
       </w:tr>
@@ -1189,19 +1073,13 @@
           <w:p>
             <w:pPr>
               <w:bidi/>
-              <w:jc w:val="right"/>
-            </w:pPr>
-            <w:hyperlink r:id="rId15">
-              <w:r>
-                <w:rPr>
-                  <w:b/>
-                  <w:noProof/>
-                  <w:color w:val="0969DA"/>
-                  <w:u w:val="single"/>
-                </w:rPr>
-                <w:t>docs/04‑specifications/api‑contracts.md</w:t>
-              </w:r>
-            </w:hyperlink>
+            </w:pPr>
+            <w:r>
+              <w:rPr>
+                <w:noProof/>
+              </w:rPr>
+              <w:t>docs/04‑specifications/api‑contracts.md</w:t>
+            </w:r>
           </w:p>
         </w:tc>
       </w:tr>
@@ -1312,19 +1190,13 @@
           <w:p>
             <w:pPr>
               <w:bidi/>
-              <w:jc w:val="right"/>
-            </w:pPr>
-            <w:hyperlink r:id="rId16">
-              <w:r>
-                <w:rPr>
-                  <w:b/>
-                  <w:noProof/>
-                  <w:color w:val="0969DA"/>
-                  <w:u w:val="single"/>
-                </w:rPr>
-                <w:t>docs/04‑specifications/security‑and‑compliance.md</w:t>
-              </w:r>
-            </w:hyperlink>
+            </w:pPr>
+            <w:r>
+              <w:rPr>
+                <w:noProof/>
+              </w:rPr>
+              <w:t>docs/04‑specifications/security‑and‑compliance.md</w:t>
+            </w:r>
           </w:p>
         </w:tc>
       </w:tr>
@@ -1411,19 +1283,13 @@
           <w:p>
             <w:pPr>
               <w:bidi/>
-              <w:jc w:val="right"/>
-            </w:pPr>
-            <w:hyperlink r:id="rId17">
-              <w:r>
-                <w:rPr>
-                  <w:b/>
-                  <w:noProof/>
-                  <w:color w:val="0969DA"/>
-                  <w:u w:val="single"/>
-                </w:rPr>
-                <w:t>docs/04‑specifications/roadmap.md</w:t>
-              </w:r>
-            </w:hyperlink>
+            </w:pPr>
+            <w:r>
+              <w:rPr>
+                <w:noProof/>
+              </w:rPr>
+              <w:t>docs/04‑specifications/roadmap.md</w:t>
+            </w:r>
           </w:p>
         </w:tc>
       </w:tr>
@@ -1534,19 +1400,13 @@
           <w:p>
             <w:pPr>
               <w:bidi/>
-              <w:jc w:val="right"/>
-            </w:pPr>
-            <w:hyperlink r:id="rId18">
-              <w:r>
-                <w:rPr>
-                  <w:b/>
-                  <w:noProof/>
-                  <w:color w:val="0969DA"/>
-                  <w:u w:val="single"/>
-                </w:rPr>
-                <w:t>docs/04‑specifications/deployment‑and‑ops.md</w:t>
-              </w:r>
-            </w:hyperlink>
+            </w:pPr>
+            <w:r>
+              <w:rPr>
+                <w:noProof/>
+              </w:rPr>
+              <w:t>docs/04‑specifications/deployment‑and‑ops.md</w:t>
+            </w:r>
           </w:p>
         </w:tc>
       </w:tr>
@@ -1584,110 +1444,110 @@
         <w:rPr>
           <w:rtl/>
         </w:rPr>
-        <w:t xml:space="preserve">، ومسارات المستخدمين (المواطن، العامل الميداني، المشرف، موظفو الإدارة وخدمة العملاء، الشريك، المتجر). يعتمد التنفيذ </w:t>
+        <w:t xml:space="preserve">، ومسارات المستخدمين (المواطن، العامل الميداني، المشرف، موظفو الإدارة وخدمة العملاء، الشريك، المتجر). يعتمد التنفيذ البرمجي مكدساً تقنياً حديثاً وموحداً قائماً على </w:t>
+      </w:r>
+      <w:r>
+        <w:rPr>
+          <w:noProof/>
+        </w:rPr>
+        <w:t>(Node.js)</w:t>
+      </w:r>
+      <w:r>
+        <w:rPr>
+          <w:rtl/>
+        </w:rPr>
+        <w:t xml:space="preserve"> مع </w:t>
+      </w:r>
+      <w:r>
+        <w:rPr>
+          <w:noProof/>
+        </w:rPr>
+        <w:t>(TypeScript)</w:t>
+      </w:r>
+      <w:r>
+        <w:rPr>
+          <w:rtl/>
+        </w:rPr>
+        <w:t xml:space="preserve"> للخادم الأساسي ومعالجات المهام الخلفية </w:t>
+      </w:r>
+      <w:r>
+        <w:rPr>
+          <w:noProof/>
+        </w:rPr>
+        <w:t>(Background</w:t>
+      </w:r>
+      <w:r>
+        <w:rPr>
+          <w:rtl/>
+        </w:rPr>
+        <w:t xml:space="preserve"> </w:t>
+      </w:r>
+      <w:r>
+        <w:rPr>
+          <w:noProof/>
+        </w:rPr>
+        <w:t>Workers)</w:t>
+      </w:r>
+      <w:r>
+        <w:rPr>
+          <w:rtl/>
+        </w:rPr>
+        <w:t xml:space="preserve"> بنمط المونوليث النمطي </w:t>
+      </w:r>
+      <w:r>
+        <w:rPr>
+          <w:noProof/>
+        </w:rPr>
+        <w:t>(Modular</w:t>
+      </w:r>
+      <w:r>
+        <w:rPr>
+          <w:rtl/>
+        </w:rPr>
+        <w:t xml:space="preserve"> </w:t>
+      </w:r>
+      <w:r>
+        <w:rPr>
+          <w:noProof/>
+        </w:rPr>
+        <w:t>Monolith)</w:t>
+      </w:r>
+      <w:r>
+        <w:rPr>
+          <w:rtl/>
+        </w:rPr>
+        <w:t xml:space="preserve"> وإطار عمل </w:t>
+      </w:r>
+      <w:r>
+        <w:rPr>
+          <w:noProof/>
+        </w:rPr>
+        <w:t>(Fastify)</w:t>
+      </w:r>
+      <w:r>
+        <w:rPr>
+          <w:rtl/>
+        </w:rPr>
+        <w:t xml:space="preserve">، مدعومة بقاعدة بيانات </w:t>
+      </w:r>
+      <w:r>
+        <w:rPr>
+          <w:noProof/>
+        </w:rPr>
+        <w:t>(PostgreSQL</w:t>
+      </w:r>
+      <w:r>
+        <w:rPr>
+          <w:rtl/>
+        </w:rPr>
+        <w:t xml:space="preserve"> 16+) مع </w:t>
       </w:r>
       <w:r>
         <w:rPr>
           <w:rtl/>
         </w:rPr>
         <w:lastRenderedPageBreak/>
-        <w:t xml:space="preserve">البرمجي مكدساً تقنياً حديثاً وموحداً قائماً على </w:t>
-      </w:r>
-      <w:r>
-        <w:rPr>
-          <w:noProof/>
-        </w:rPr>
-        <w:t>(Node.js)</w:t>
-      </w:r>
-      <w:r>
-        <w:rPr>
-          <w:rtl/>
-        </w:rPr>
-        <w:t xml:space="preserve"> مع </w:t>
-      </w:r>
-      <w:r>
-        <w:rPr>
-          <w:noProof/>
-        </w:rPr>
-        <w:t>(TypeScript)</w:t>
-      </w:r>
-      <w:r>
-        <w:rPr>
-          <w:rtl/>
-        </w:rPr>
-        <w:t xml:space="preserve"> للخادم الأساسي ومعالجات المهام الخلفية </w:t>
-      </w:r>
-      <w:r>
-        <w:rPr>
-          <w:noProof/>
-        </w:rPr>
-        <w:t>(Background</w:t>
-      </w:r>
-      <w:r>
-        <w:rPr>
-          <w:rtl/>
-        </w:rPr>
-        <w:t xml:space="preserve"> </w:t>
-      </w:r>
-      <w:r>
-        <w:rPr>
-          <w:noProof/>
-        </w:rPr>
-        <w:t>Workers)</w:t>
-      </w:r>
-      <w:r>
-        <w:rPr>
-          <w:rtl/>
-        </w:rPr>
-        <w:t xml:space="preserve"> بنمط المونوليث النمطي </w:t>
-      </w:r>
-      <w:r>
-        <w:rPr>
-          <w:noProof/>
-        </w:rPr>
-        <w:t>(Modular</w:t>
-      </w:r>
-      <w:r>
-        <w:rPr>
-          <w:rtl/>
-        </w:rPr>
-        <w:t xml:space="preserve"> </w:t>
-      </w:r>
-      <w:r>
-        <w:rPr>
-          <w:noProof/>
-        </w:rPr>
-        <w:t>Monolith)</w:t>
-      </w:r>
-      <w:r>
-        <w:rPr>
-          <w:rtl/>
-        </w:rPr>
-        <w:t xml:space="preserve"> وإطار عمل </w:t>
-      </w:r>
-      <w:r>
-        <w:rPr>
-          <w:noProof/>
-        </w:rPr>
-        <w:t>(Fastify)</w:t>
-      </w:r>
-      <w:r>
-        <w:rPr>
-          <w:rtl/>
-        </w:rPr>
-        <w:t xml:space="preserve">، مدعومة بقاعدة بيانات </w:t>
-      </w:r>
-      <w:r>
-        <w:rPr>
-          <w:noProof/>
-        </w:rPr>
-        <w:t>(PostgreSQL</w:t>
-      </w:r>
-      <w:r>
-        <w:rPr>
-          <w:rtl/>
-        </w:rPr>
-        <w:t xml:space="preserve"> 16+) مع امتداد </w:t>
+        <w:t xml:space="preserve">امتداد </w:t>
       </w:r>
       <w:r>
         <w:rPr>
@@ -3034,7 +2894,6 @@
                 <w:sz w:val="18"/>
                 <w:rtl/>
               </w:rPr>
-              <w:lastRenderedPageBreak/>
               <w:t xml:space="preserve">معمارية نمطية موحدة </w:t>
             </w:r>
             <w:r>
@@ -3063,7 +2922,15 @@
                 <w:sz w:val="18"/>
                 <w:rtl/>
               </w:rPr>
-              <w:t xml:space="preserve">؛ وحدات الهوية والجغرافيا والجمع والنقاط والمتجر؛ تدقيق صارم للمخططات عبر </w:t>
+              <w:t xml:space="preserve">؛ وحدات الهوية </w:t>
+            </w:r>
+            <w:r>
+              <w:rPr>
+                <w:sz w:val="18"/>
+                <w:rtl/>
+              </w:rPr>
+              <w:lastRenderedPageBreak/>
+              <w:t xml:space="preserve">والجغرافيا والجمع والنقاط والمتجر؛ تدقيق صارم للمخططات عبر </w:t>
             </w:r>
             <w:r>
               <w:rPr>
@@ -3124,6 +2991,7 @@
                 <w:sz w:val="18"/>
                 <w:rtl/>
               </w:rPr>
+              <w:lastRenderedPageBreak/>
               <w:t xml:space="preserve">خادم التطبيقات </w:t>
             </w:r>
             <w:r>
@@ -3873,56 +3741,18 @@
       <w:r>
         <w:rPr>
           <w:b/>
-          <w:color w:val="203A43"/>
           <w:sz w:val="24"/>
           <w:rtl/>
         </w:rPr>
-        <w:t xml:space="preserve">2 1 مخطط معمارية النظام العام وترابط الطبقات </w:t>
+        <w:t xml:space="preserve">2.1 مخطط معمارية النظام العام وترابط الطبقات </w:t>
       </w:r>
       <w:r>
         <w:rPr>
           <w:b/>
           <w:noProof/>
-          <w:color w:val="203A43"/>
           <w:sz w:val="24"/>
         </w:rPr>
-        <w:t>(System</w:t>
-      </w:r>
-      <w:r>
-        <w:rPr>
-          <w:b/>
-          <w:color w:val="203A43"/>
-          <w:sz w:val="24"/>
-          <w:rtl/>
-        </w:rPr>
-        <w:t> </w:t>
-      </w:r>
-      <w:r>
-        <w:rPr>
-          <w:b/>
-          <w:noProof/>
-          <w:color w:val="203A43"/>
-          <w:sz w:val="24"/>
-        </w:rPr>
-        <w:t>Architecture</w:t>
-      </w:r>
-      <w:r>
-        <w:rPr>
-          <w:b/>
-          <w:color w:val="203A43"/>
-          <w:sz w:val="24"/>
-          <w:rtl/>
-        </w:rPr>
-        <w:t> </w:t>
-      </w:r>
-      <w:r>
-        <w:rPr>
-          <w:b/>
-          <w:noProof/>
-          <w:color w:val="203A43"/>
-          <w:sz w:val="24"/>
-        </w:rPr>
-        <w:t>Diagram)</w:t>
+        <w:t>(System Architecture Diagram)</w:t>
       </w:r>
     </w:p>
     <w:p>
@@ -3935,10 +3765,10 @@
           <w:noProof/>
         </w:rPr>
         <w:drawing>
-          <wp:inline distT="0" distB="0" distL="0" distR="0" wp14:anchorId="7005618D" wp14:editId="197C4913">
-            <wp:extent cx="5943600" cy="10167518"/>
+          <wp:inline distT="0" distB="0" distL="0" distR="0" wp14:anchorId="42992BD5" wp14:editId="09337019">
+            <wp:extent cx="3931920" cy="6740434"/>
             <wp:effectExtent l="0" t="0" r="0" b="0"/>
-            <wp:docPr id="1" name="Picture 1"/>
+            <wp:docPr id="16" name="Picture 16"/>
             <wp:cNvGraphicFramePr>
               <a:graphicFrameLocks xmlns:a="http://schemas.openxmlformats.org/drawingml/2006/main" noChangeAspect="1"/>
             </wp:cNvGraphicFramePr>
@@ -3946,11 +3776,11 @@
               <a:graphicData uri="http://schemas.openxmlformats.org/drawingml/2006/picture">
                 <pic:pic xmlns:pic="http://schemas.openxmlformats.org/drawingml/2006/picture">
                   <pic:nvPicPr>
-                    <pic:cNvPr id="0" name="image1.png"/>
+                    <pic:cNvPr id="0" name="image.png"/>
                     <pic:cNvPicPr/>
                   </pic:nvPicPr>
                   <pic:blipFill>
-                    <a:blip r:embed="rId19"/>
+                    <a:blip r:embed="rId9"/>
                     <a:stretch>
                       <a:fillRect/>
                     </a:stretch>
@@ -3958,7 +3788,7 @@
                   <pic:spPr>
                     <a:xfrm>
                       <a:off x="0" y="0"/>
-                      <a:ext cx="5943600" cy="10167518"/>
+                      <a:ext cx="3931920" cy="6740434"/>
                     </a:xfrm>
                     <a:prstGeom prst="rect">
                       <a:avLst/>
@@ -4521,27 +4351,17 @@
       </w:pPr>
       <w:r>
         <w:rPr>
-          <w:rtl/>
-        </w:rPr>
-        <w:t xml:space="preserve">3 3 1 مخطط التتابع الزمني للجمع الميداني وتسجيل الأوزان وصرف النقاط </w:t>
-      </w:r>
-      <w:r>
-        <w:rPr>
-          <w:noProof/>
-        </w:rPr>
-        <w:t>(Sequence</w:t>
-      </w:r>
-      <w:r>
-        <w:rPr>
-          <w:rtl/>
-        </w:rPr>
-        <w:t xml:space="preserve"> </w:t>
-      </w:r>
-      <w:r>
-        <w:rPr>
-          <w:noProof/>
-        </w:rPr>
-        <w:t>Flow)</w:t>
+          <w:sz w:val="22"/>
+          <w:rtl/>
+        </w:rPr>
+        <w:t xml:space="preserve">3.3.1 مخطط التتابع الزمني للجمع الميداني وتسجيل الأوزان وصرف النقاط </w:t>
+      </w:r>
+      <w:r>
+        <w:rPr>
+          <w:noProof/>
+          <w:sz w:val="22"/>
+        </w:rPr>
+        <w:t>(Sequence Flow)</w:t>
       </w:r>
     </w:p>
     <w:p>
@@ -4554,10 +4374,10 @@
           <w:noProof/>
         </w:rPr>
         <w:drawing>
-          <wp:inline distT="0" distB="0" distL="0" distR="0" wp14:anchorId="500C1247" wp14:editId="7A26065B">
-            <wp:extent cx="5943600" cy="4223918"/>
+          <wp:inline distT="0" distB="0" distL="0" distR="0" wp14:anchorId="1560257C" wp14:editId="248AB494">
+            <wp:extent cx="5943600" cy="3394395"/>
             <wp:effectExtent l="0" t="0" r="0" b="0"/>
-            <wp:docPr id="2" name="Picture 2"/>
+            <wp:docPr id="17" name="Picture 17"/>
             <wp:cNvGraphicFramePr>
               <a:graphicFrameLocks xmlns:a="http://schemas.openxmlformats.org/drawingml/2006/main" noChangeAspect="1"/>
             </wp:cNvGraphicFramePr>
@@ -4565,11 +4385,11 @@
               <a:graphicData uri="http://schemas.openxmlformats.org/drawingml/2006/picture">
                 <pic:pic xmlns:pic="http://schemas.openxmlformats.org/drawingml/2006/picture">
                   <pic:nvPicPr>
-                    <pic:cNvPr id="0" name="image2.png"/>
+                    <pic:cNvPr id="0" name="image.png"/>
                     <pic:cNvPicPr/>
                   </pic:nvPicPr>
                   <pic:blipFill>
-                    <a:blip r:embed="rId20"/>
+                    <a:blip r:embed="rId10"/>
                     <a:stretch>
                       <a:fillRect/>
                     </a:stretch>
@@ -4577,7 +4397,7 @@
                   <pic:spPr>
                     <a:xfrm>
                       <a:off x="0" y="0"/>
-                      <a:ext cx="5943600" cy="4223918"/>
+                      <a:ext cx="5943600" cy="3394395"/>
                     </a:xfrm>
                     <a:prstGeom prst="rect">
                       <a:avLst/>
@@ -6447,74 +6267,18 @@
       <w:r>
         <w:rPr>
           <w:b/>
-          <w:color w:val="203A43"/>
           <w:sz w:val="24"/>
           <w:rtl/>
         </w:rPr>
-        <w:t xml:space="preserve">5 1 مخطط علاقات الكيانات وقاعدة البيانات الموحدة </w:t>
+        <w:t xml:space="preserve">5.1 مخطط علاقات الكيانات وقاعدة البيانات الموحدة </w:t>
       </w:r>
       <w:r>
         <w:rPr>
           <w:b/>
           <w:noProof/>
-          <w:color w:val="203A43"/>
           <w:sz w:val="24"/>
         </w:rPr>
-        <w:t>(Entity</w:t>
-      </w:r>
-      <w:r>
-        <w:rPr>
-          <w:b/>
-          <w:color w:val="203A43"/>
-          <w:sz w:val="24"/>
-          <w:rtl/>
-        </w:rPr>
-        <w:t> </w:t>
-      </w:r>
-      <w:r>
-        <w:rPr>
-          <w:b/>
-          <w:noProof/>
-          <w:color w:val="203A43"/>
-          <w:sz w:val="24"/>
-        </w:rPr>
-        <w:t>Relationship</w:t>
-      </w:r>
-      <w:r>
-        <w:rPr>
-          <w:b/>
-          <w:color w:val="203A43"/>
-          <w:sz w:val="24"/>
-          <w:rtl/>
-        </w:rPr>
-        <w:t> </w:t>
-      </w:r>
-      <w:r>
-        <w:rPr>
-          <w:b/>
-          <w:noProof/>
-          <w:color w:val="203A43"/>
-          <w:sz w:val="24"/>
-        </w:rPr>
-        <w:t>Diagram</w:t>
-      </w:r>
-      <w:r>
-        <w:rPr>
-          <w:b/>
-          <w:color w:val="203A43"/>
-          <w:sz w:val="24"/>
-          <w:rtl/>
-        </w:rPr>
-        <w:t> ‑ </w:t>
-      </w:r>
-      <w:r>
-        <w:rPr>
-          <w:b/>
-          <w:noProof/>
-          <w:color w:val="203A43"/>
-          <w:sz w:val="24"/>
-        </w:rPr>
-        <w:t>ERD)</w:t>
+        <w:t>(Entity Relationship Diagram ‑ ERD)</w:t>
       </w:r>
     </w:p>
     <w:p>
@@ -6527,10 +6291,10 @@
           <w:noProof/>
         </w:rPr>
         <w:drawing>
-          <wp:inline distT="0" distB="0" distL="0" distR="0" wp14:anchorId="1FCEC5B9" wp14:editId="5A841D00">
-            <wp:extent cx="5943600" cy="2559710"/>
+          <wp:inline distT="0" distB="0" distL="0" distR="0" wp14:anchorId="783E63E2" wp14:editId="0C8AD84E">
+            <wp:extent cx="5943600" cy="1238821"/>
             <wp:effectExtent l="0" t="0" r="0" b="0"/>
-            <wp:docPr id="3" name="Picture 3"/>
+            <wp:docPr id="18" name="Picture 18"/>
             <wp:cNvGraphicFramePr>
               <a:graphicFrameLocks xmlns:a="http://schemas.openxmlformats.org/drawingml/2006/main" noChangeAspect="1"/>
             </wp:cNvGraphicFramePr>
@@ -6538,11 +6302,11 @@
               <a:graphicData uri="http://schemas.openxmlformats.org/drawingml/2006/picture">
                 <pic:pic xmlns:pic="http://schemas.openxmlformats.org/drawingml/2006/picture">
                   <pic:nvPicPr>
-                    <pic:cNvPr id="0" name="image3.png"/>
+                    <pic:cNvPr id="0" name="hd-diagram3-erd.png"/>
                     <pic:cNvPicPr/>
                   </pic:nvPicPr>
                   <pic:blipFill>
-                    <a:blip r:embed="rId21"/>
+                    <a:blip r:embed="rId11"/>
                     <a:stretch>
                       <a:fillRect/>
                     </a:stretch>
@@ -6550,7 +6314,7 @@
                   <pic:spPr>
                     <a:xfrm>
                       <a:off x="0" y="0"/>
-                      <a:ext cx="5943600" cy="2559710"/>
+                      <a:ext cx="5943600" cy="1238821"/>
                     </a:xfrm>
                     <a:prstGeom prst="rect">
                       <a:avLst/>
@@ -7237,28 +7001,12 @@
             <w:pPr>
               <w:bidi/>
               <w:spacing w:after="0" w:line="252" w:lineRule="auto"/>
-              <w:jc w:val="right"/>
             </w:pPr>
             <w:r>
               <w:rPr>
                 <w:noProof/>
-                <w:sz w:val="18"/>
-              </w:rPr>
-              <w:t>POST</w:t>
-            </w:r>
-            <w:r>
-              <w:rPr>
-                <w:sz w:val="18"/>
-                <w:rtl/>
-              </w:rPr>
-              <w:t xml:space="preserve"> </w:t>
-            </w:r>
-            <w:r>
-              <w:rPr>
-                <w:noProof/>
-                <w:sz w:val="18"/>
-              </w:rPr>
-              <w:t>/v1/onboarding/request‑otp</w:t>
+              </w:rPr>
+              <w:t>POST /v1/onboarding/request‑otp</w:t>
             </w:r>
           </w:p>
         </w:tc>
@@ -7388,28 +7136,12 @@
             <w:pPr>
               <w:bidi/>
               <w:spacing w:after="0" w:line="252" w:lineRule="auto"/>
-              <w:jc w:val="right"/>
             </w:pPr>
             <w:r>
               <w:rPr>
                 <w:noProof/>
-                <w:sz w:val="18"/>
-              </w:rPr>
-              <w:t>POST</w:t>
-            </w:r>
-            <w:r>
-              <w:rPr>
-                <w:sz w:val="18"/>
-                <w:rtl/>
-              </w:rPr>
-              <w:t xml:space="preserve"> </w:t>
-            </w:r>
-            <w:r>
-              <w:rPr>
-                <w:noProof/>
-                <w:sz w:val="18"/>
-              </w:rPr>
-              <w:t>/v1/auth/verify‑otp</w:t>
+              </w:rPr>
+              <w:t>POST /v1/auth/verify‑otp</w:t>
             </w:r>
           </w:p>
         </w:tc>
@@ -7539,28 +7271,12 @@
             <w:pPr>
               <w:bidi/>
               <w:spacing w:after="0" w:line="252" w:lineRule="auto"/>
-              <w:jc w:val="right"/>
             </w:pPr>
             <w:r>
               <w:rPr>
                 <w:noProof/>
-                <w:sz w:val="18"/>
-              </w:rPr>
-              <w:t>POST</w:t>
-            </w:r>
-            <w:r>
-              <w:rPr>
-                <w:sz w:val="18"/>
-                <w:rtl/>
-              </w:rPr>
-              <w:t xml:space="preserve"> </w:t>
-            </w:r>
-            <w:r>
-              <w:rPr>
-                <w:noProof/>
-                <w:sz w:val="18"/>
-              </w:rPr>
-              <w:t>/v1/service‑requests</w:t>
+              </w:rPr>
+              <w:t>POST /v1/service‑requests</w:t>
             </w:r>
           </w:p>
         </w:tc>
@@ -7690,28 +7406,12 @@
             <w:pPr>
               <w:bidi/>
               <w:spacing w:after="0" w:line="252" w:lineRule="auto"/>
-              <w:jc w:val="right"/>
             </w:pPr>
             <w:r>
               <w:rPr>
                 <w:noProof/>
-                <w:sz w:val="18"/>
-              </w:rPr>
-              <w:t>POST</w:t>
-            </w:r>
-            <w:r>
-              <w:rPr>
-                <w:sz w:val="18"/>
-                <w:rtl/>
-              </w:rPr>
-              <w:t xml:space="preserve"> </w:t>
-            </w:r>
-            <w:r>
-              <w:rPr>
-                <w:noProof/>
-                <w:sz w:val="18"/>
-              </w:rPr>
-              <w:t>/v1/households/cards</w:t>
+              </w:rPr>
+              <w:t>POST /v1/households/cards</w:t>
             </w:r>
           </w:p>
         </w:tc>
@@ -7841,28 +7541,12 @@
             <w:pPr>
               <w:bidi/>
               <w:spacing w:after="0" w:line="252" w:lineRule="auto"/>
-              <w:jc w:val="right"/>
             </w:pPr>
             <w:r>
               <w:rPr>
                 <w:noProof/>
-                <w:sz w:val="18"/>
-              </w:rPr>
-              <w:t>POST</w:t>
-            </w:r>
-            <w:r>
-              <w:rPr>
-                <w:sz w:val="18"/>
-                <w:rtl/>
-              </w:rPr>
-              <w:t xml:space="preserve"> </w:t>
-            </w:r>
-            <w:r>
-              <w:rPr>
-                <w:noProof/>
-                <w:sz w:val="18"/>
-              </w:rPr>
-              <w:t>/v1/store/orders</w:t>
+              </w:rPr>
+              <w:t>POST /v1/store/orders</w:t>
             </w:r>
           </w:p>
         </w:tc>
@@ -7992,56 +7676,12 @@
             <w:pPr>
               <w:bidi/>
               <w:spacing w:after="0" w:line="252" w:lineRule="auto"/>
-              <w:jc w:val="right"/>
             </w:pPr>
             <w:r>
               <w:rPr>
                 <w:noProof/>
-                <w:sz w:val="18"/>
-              </w:rPr>
-              <w:t>POST</w:t>
-            </w:r>
-            <w:r>
-              <w:rPr>
-                <w:sz w:val="18"/>
-                <w:rtl/>
-              </w:rPr>
-              <w:t xml:space="preserve"> </w:t>
-            </w:r>
-            <w:r>
-              <w:rPr>
-                <w:noProof/>
-                <w:sz w:val="18"/>
-              </w:rPr>
-              <w:t>/v1/store/orders/</w:t>
-            </w:r>
-            <w:r>
-              <w:rPr>
-                <w:sz w:val="18"/>
-                <w:rtl/>
-              </w:rPr>
-              <w:t>{</w:t>
-            </w:r>
-            <w:r>
-              <w:rPr>
-                <w:noProof/>
-                <w:sz w:val="18"/>
-              </w:rPr>
-              <w:t>id</w:t>
-            </w:r>
-            <w:r>
-              <w:rPr>
-                <w:sz w:val="18"/>
-                <w:rtl/>
-              </w:rPr>
-              <w:t>}</w:t>
-            </w:r>
-            <w:r>
-              <w:rPr>
-                <w:noProof/>
-                <w:sz w:val="18"/>
-              </w:rPr>
-              <w:t>/upload‑receipt</w:t>
+              </w:rPr>
+              <w:t>POST /v1/store/orders/{id}/upload‑receipt</w:t>
             </w:r>
           </w:p>
         </w:tc>
@@ -8171,56 +7811,12 @@
             <w:pPr>
               <w:bidi/>
               <w:spacing w:after="0" w:line="252" w:lineRule="auto"/>
-              <w:jc w:val="right"/>
             </w:pPr>
             <w:r>
               <w:rPr>
                 <w:noProof/>
-                <w:sz w:val="18"/>
-              </w:rPr>
-              <w:t>POST</w:t>
-            </w:r>
-            <w:r>
-              <w:rPr>
-                <w:sz w:val="18"/>
-                <w:rtl/>
-              </w:rPr>
-              <w:t xml:space="preserve"> </w:t>
-            </w:r>
-            <w:r>
-              <w:rPr>
-                <w:noProof/>
-                <w:sz w:val="18"/>
-              </w:rPr>
-              <w:t>/v1/dispatch/</w:t>
-            </w:r>
-            <w:r>
-              <w:rPr>
-                <w:sz w:val="18"/>
-                <w:rtl/>
-              </w:rPr>
-              <w:t>{</w:t>
-            </w:r>
-            <w:r>
-              <w:rPr>
-                <w:noProof/>
-                <w:sz w:val="18"/>
-              </w:rPr>
-              <w:t>id</w:t>
-            </w:r>
-            <w:r>
-              <w:rPr>
-                <w:sz w:val="18"/>
-                <w:rtl/>
-              </w:rPr>
-              <w:t>}</w:t>
-            </w:r>
-            <w:r>
-              <w:rPr>
-                <w:noProof/>
-                <w:sz w:val="18"/>
-              </w:rPr>
-              <w:t>/ack</w:t>
+              </w:rPr>
+              <w:t>POST /v1/dispatch/{id}/ack</w:t>
             </w:r>
           </w:p>
         </w:tc>
@@ -8350,28 +7946,12 @@
             <w:pPr>
               <w:bidi/>
               <w:spacing w:after="0" w:line="252" w:lineRule="auto"/>
-              <w:jc w:val="right"/>
             </w:pPr>
             <w:r>
               <w:rPr>
                 <w:noProof/>
-                <w:sz w:val="18"/>
-              </w:rPr>
-              <w:t>POST</w:t>
-            </w:r>
-            <w:r>
-              <w:rPr>
-                <w:sz w:val="18"/>
-                <w:rtl/>
-              </w:rPr>
-              <w:t xml:space="preserve"> </w:t>
-            </w:r>
-            <w:r>
-              <w:rPr>
-                <w:noProof/>
-                <w:sz w:val="18"/>
-              </w:rPr>
-              <w:t>/v1/collections/visits</w:t>
+              </w:rPr>
+              <w:t>POST /v1/collections/visits</w:t>
             </w:r>
           </w:p>
         </w:tc>
@@ -8501,28 +8081,12 @@
             <w:pPr>
               <w:bidi/>
               <w:spacing w:after="0" w:line="252" w:lineRule="auto"/>
-              <w:jc w:val="right"/>
             </w:pPr>
             <w:r>
               <w:rPr>
                 <w:noProof/>
-                <w:sz w:val="18"/>
-              </w:rPr>
-              <w:t>POST</w:t>
-            </w:r>
-            <w:r>
-              <w:rPr>
-                <w:sz w:val="18"/>
-                <w:rtl/>
-              </w:rPr>
-              <w:t xml:space="preserve"> </w:t>
-            </w:r>
-            <w:r>
-              <w:rPr>
-                <w:noProof/>
-                <w:sz w:val="18"/>
-              </w:rPr>
-              <w:t>/v1/collections/batch‑import</w:t>
+              </w:rPr>
+              <w:t>POST /v1/collections/batch‑import</w:t>
             </w:r>
           </w:p>
         </w:tc>
@@ -8659,28 +8223,12 @@
             <w:pPr>
               <w:bidi/>
               <w:spacing w:after="0" w:line="252" w:lineRule="auto"/>
-              <w:jc w:val="right"/>
             </w:pPr>
             <w:r>
               <w:rPr>
                 <w:noProof/>
-                <w:sz w:val="18"/>
-              </w:rPr>
-              <w:t>POST</w:t>
-            </w:r>
-            <w:r>
-              <w:rPr>
-                <w:sz w:val="18"/>
-                <w:rtl/>
-              </w:rPr>
-              <w:t xml:space="preserve"> </w:t>
-            </w:r>
-            <w:r>
-              <w:rPr>
-                <w:noProof/>
-                <w:sz w:val="18"/>
-              </w:rPr>
-              <w:t>/v1/admin/auth/login</w:t>
+              </w:rPr>
+              <w:t>POST /v1/admin/auth/login</w:t>
             </w:r>
           </w:p>
         </w:tc>
@@ -8810,28 +8358,12 @@
             <w:pPr>
               <w:bidi/>
               <w:spacing w:after="0" w:line="252" w:lineRule="auto"/>
-              <w:jc w:val="right"/>
             </w:pPr>
             <w:r>
               <w:rPr>
                 <w:noProof/>
-                <w:sz w:val="18"/>
-              </w:rPr>
-              <w:t>GET</w:t>
-            </w:r>
-            <w:r>
-              <w:rPr>
-                <w:sz w:val="18"/>
-                <w:rtl/>
-              </w:rPr>
-              <w:t xml:space="preserve"> </w:t>
-            </w:r>
-            <w:r>
-              <w:rPr>
-                <w:noProof/>
-                <w:sz w:val="18"/>
-              </w:rPr>
-              <w:t>/v1/admin/dispatch/overview</w:t>
+              </w:rPr>
+              <w:t>GET /v1/admin/dispatch/overview</w:t>
             </w:r>
           </w:p>
         </w:tc>
@@ -8961,56 +8493,12 @@
             <w:pPr>
               <w:bidi/>
               <w:spacing w:after="0" w:line="252" w:lineRule="auto"/>
-              <w:jc w:val="right"/>
             </w:pPr>
             <w:r>
               <w:rPr>
                 <w:noProof/>
-                <w:sz w:val="18"/>
-              </w:rPr>
-              <w:t>POST</w:t>
-            </w:r>
-            <w:r>
-              <w:rPr>
-                <w:sz w:val="18"/>
-                <w:rtl/>
-              </w:rPr>
-              <w:t xml:space="preserve"> </w:t>
-            </w:r>
-            <w:r>
-              <w:rPr>
-                <w:noProof/>
-                <w:sz w:val="18"/>
-              </w:rPr>
-              <w:t>/v1/admin/dispatch/</w:t>
-            </w:r>
-            <w:r>
-              <w:rPr>
-                <w:sz w:val="18"/>
-                <w:rtl/>
-              </w:rPr>
-              <w:t>{</w:t>
-            </w:r>
-            <w:r>
-              <w:rPr>
-                <w:noProof/>
-                <w:sz w:val="18"/>
-              </w:rPr>
-              <w:t>id</w:t>
-            </w:r>
-            <w:r>
-              <w:rPr>
-                <w:sz w:val="18"/>
-                <w:rtl/>
-              </w:rPr>
-              <w:t>}</w:t>
-            </w:r>
-            <w:r>
-              <w:rPr>
-                <w:noProof/>
-                <w:sz w:val="18"/>
-              </w:rPr>
-              <w:t>/reassign</w:t>
+              </w:rPr>
+              <w:t>POST /v1/admin/dispatch/{id}/reassign</w:t>
             </w:r>
           </w:p>
         </w:tc>
@@ -9135,7 +8623,6 @@
           <w:p>
             <w:pPr>
               <w:bidi/>
-              <w:jc w:val="right"/>
             </w:pPr>
             <w:r>
               <w:rPr>
@@ -9268,7 +8755,6 @@
           <w:p>
             <w:pPr>
               <w:bidi/>
-              <w:jc w:val="right"/>
             </w:pPr>
             <w:r>
               <w:rPr>
@@ -9404,56 +8890,12 @@
             <w:pPr>
               <w:bidi/>
               <w:spacing w:after="0" w:line="252" w:lineRule="auto"/>
-              <w:jc w:val="right"/>
             </w:pPr>
             <w:r>
               <w:rPr>
                 <w:noProof/>
-                <w:sz w:val="18"/>
-              </w:rPr>
-              <w:t>POST</w:t>
-            </w:r>
-            <w:r>
-              <w:rPr>
-                <w:sz w:val="18"/>
-                <w:rtl/>
-              </w:rPr>
-              <w:t xml:space="preserve"> </w:t>
-            </w:r>
-            <w:r>
-              <w:rPr>
-                <w:noProof/>
-                <w:sz w:val="18"/>
-              </w:rPr>
-              <w:t>/v1/admin/cards/</w:t>
-            </w:r>
-            <w:r>
-              <w:rPr>
-                <w:sz w:val="18"/>
-                <w:rtl/>
-              </w:rPr>
-              <w:t>{</w:t>
-            </w:r>
-            <w:r>
-              <w:rPr>
-                <w:noProof/>
-                <w:sz w:val="18"/>
-              </w:rPr>
-              <w:t>code</w:t>
-            </w:r>
-            <w:r>
-              <w:rPr>
-                <w:sz w:val="18"/>
-                <w:rtl/>
-              </w:rPr>
-              <w:t>}</w:t>
-            </w:r>
-            <w:r>
-              <w:rPr>
-                <w:noProof/>
-                <w:sz w:val="18"/>
-              </w:rPr>
-              <w:t>/revoke</w:t>
+              </w:rPr>
+              <w:t>POST /v1/admin/cards/{code}/revoke</w:t>
             </w:r>
           </w:p>
         </w:tc>
@@ -9583,28 +9025,12 @@
             <w:pPr>
               <w:bidi/>
               <w:spacing w:after="0" w:line="252" w:lineRule="auto"/>
-              <w:jc w:val="right"/>
             </w:pPr>
             <w:r>
               <w:rPr>
                 <w:noProof/>
-                <w:sz w:val="18"/>
-              </w:rPr>
-              <w:t>GET</w:t>
-            </w:r>
-            <w:r>
-              <w:rPr>
-                <w:sz w:val="18"/>
-                <w:rtl/>
-              </w:rPr>
-              <w:t xml:space="preserve"> </w:t>
-            </w:r>
-            <w:r>
-              <w:rPr>
-                <w:noProof/>
-                <w:sz w:val="18"/>
-              </w:rPr>
-              <w:t>/v1/admin/store/orders</w:t>
+              </w:rPr>
+              <w:t>GET /v1/admin/store/orders</w:t>
             </w:r>
           </w:p>
         </w:tc>
@@ -9734,56 +9160,12 @@
             <w:pPr>
               <w:bidi/>
               <w:spacing w:after="0" w:line="252" w:lineRule="auto"/>
-              <w:jc w:val="right"/>
             </w:pPr>
             <w:r>
               <w:rPr>
                 <w:noProof/>
-                <w:sz w:val="18"/>
-              </w:rPr>
-              <w:t>POST</w:t>
-            </w:r>
-            <w:r>
-              <w:rPr>
-                <w:sz w:val="18"/>
-                <w:rtl/>
-              </w:rPr>
-              <w:t xml:space="preserve"> </w:t>
-            </w:r>
-            <w:r>
-              <w:rPr>
-                <w:noProof/>
-                <w:sz w:val="18"/>
-              </w:rPr>
-              <w:t>/v1/admin/store/orders/</w:t>
-            </w:r>
-            <w:r>
-              <w:rPr>
-                <w:sz w:val="18"/>
-                <w:rtl/>
-              </w:rPr>
-              <w:t>{</w:t>
-            </w:r>
-            <w:r>
-              <w:rPr>
-                <w:noProof/>
-                <w:sz w:val="18"/>
-              </w:rPr>
-              <w:t>id</w:t>
-            </w:r>
-            <w:r>
-              <w:rPr>
-                <w:sz w:val="18"/>
-                <w:rtl/>
-              </w:rPr>
-              <w:t>}</w:t>
-            </w:r>
-            <w:r>
-              <w:rPr>
-                <w:noProof/>
-                <w:sz w:val="18"/>
-              </w:rPr>
-              <w:t>/release</w:t>
+              </w:rPr>
+              <w:t>POST /v1/admin/store/orders/{id}/release</w:t>
             </w:r>
           </w:p>
         </w:tc>
@@ -9911,28 +9293,12 @@
             <w:pPr>
               <w:bidi/>
               <w:spacing w:after="0" w:line="252" w:lineRule="auto"/>
-              <w:jc w:val="right"/>
             </w:pPr>
             <w:r>
               <w:rPr>
                 <w:noProof/>
-                <w:sz w:val="18"/>
-              </w:rPr>
-              <w:t>GET</w:t>
-            </w:r>
-            <w:r>
-              <w:rPr>
-                <w:sz w:val="18"/>
-                <w:rtl/>
-              </w:rPr>
-              <w:t xml:space="preserve"> </w:t>
-            </w:r>
-            <w:r>
-              <w:rPr>
-                <w:noProof/>
-                <w:sz w:val="18"/>
-              </w:rPr>
-              <w:t>/v1/admin/finance/reconciliation</w:t>
+              </w:rPr>
+              <w:t>GET /v1/admin/finance/reconciliation</w:t>
             </w:r>
           </w:p>
         </w:tc>
@@ -10062,28 +9428,12 @@
             <w:pPr>
               <w:bidi/>
               <w:spacing w:after="0" w:line="252" w:lineRule="auto"/>
-              <w:jc w:val="right"/>
             </w:pPr>
             <w:r>
               <w:rPr>
                 <w:noProof/>
-                <w:sz w:val="18"/>
-              </w:rPr>
-              <w:t>GET</w:t>
-            </w:r>
-            <w:r>
-              <w:rPr>
-                <w:sz w:val="18"/>
-                <w:rtl/>
-              </w:rPr>
-              <w:t xml:space="preserve"> </w:t>
-            </w:r>
-            <w:r>
-              <w:rPr>
-                <w:noProof/>
-                <w:sz w:val="18"/>
-              </w:rPr>
-              <w:t>/v1/admin/audit/logs</w:t>
+              </w:rPr>
+              <w:t>GET /v1/admin/audit/logs</w:t>
             </w:r>
           </w:p>
         </w:tc>
@@ -10188,28 +9538,12 @@
           <w:p>
             <w:pPr>
               <w:bidi/>
-              <w:jc w:val="right"/>
             </w:pPr>
             <w:r>
               <w:rPr>
                 <w:noProof/>
-                <w:sz w:val="18"/>
-              </w:rPr>
-              <w:t>POST</w:t>
-            </w:r>
-            <w:r>
-              <w:rPr>
-                <w:sz w:val="18"/>
-                <w:rtl/>
-              </w:rPr>
-              <w:t xml:space="preserve"> </w:t>
-            </w:r>
-            <w:r>
-              <w:rPr>
-                <w:noProof/>
-                <w:sz w:val="18"/>
-              </w:rPr>
-              <w:t>/v1/admin/geofence/versions</w:t>
+              </w:rPr>
+              <w:t>POST /v1/admin/geofence/versions</w:t>
             </w:r>
           </w:p>
         </w:tc>
@@ -10526,10 +9860,10 @@
           <w:noProof/>
         </w:rPr>
         <w:drawing>
-          <wp:inline distT="0" distB="0" distL="0" distR="0" wp14:anchorId="19597E31" wp14:editId="194AD493">
-            <wp:extent cx="4389120" cy="6941384"/>
+          <wp:inline distT="0" distB="0" distL="0" distR="0" wp14:anchorId="4598DDE9" wp14:editId="1486089E">
+            <wp:extent cx="2514600" cy="7216686"/>
             <wp:effectExtent l="0" t="0" r="0" b="0"/>
-            <wp:docPr id="4" name="Picture 4"/>
+            <wp:docPr id="19" name="Picture 19"/>
             <wp:cNvGraphicFramePr>
               <a:graphicFrameLocks xmlns:a="http://schemas.openxmlformats.org/drawingml/2006/main" noChangeAspect="1"/>
             </wp:cNvGraphicFramePr>
@@ -10537,11 +9871,11 @@
               <a:graphicData uri="http://schemas.openxmlformats.org/drawingml/2006/picture">
                 <pic:pic xmlns:pic="http://schemas.openxmlformats.org/drawingml/2006/picture">
                   <pic:nvPicPr>
-                    <pic:cNvPr id="0" name="image4.png"/>
+                    <pic:cNvPr id="0" name="image.png"/>
                     <pic:cNvPicPr/>
                   </pic:nvPicPr>
                   <pic:blipFill>
-                    <a:blip r:embed="rId22"/>
+                    <a:blip r:embed="rId12"/>
                     <a:stretch>
                       <a:fillRect/>
                     </a:stretch>
@@ -10549,7 +9883,7 @@
                   <pic:spPr>
                     <a:xfrm>
                       <a:off x="0" y="0"/>
-                      <a:ext cx="4389120" cy="6941384"/>
+                      <a:ext cx="2514600" cy="7216686"/>
                     </a:xfrm>
                     <a:prstGeom prst="rect">
                       <a:avLst/>
@@ -12770,12 +12104,10 @@
             <w:pPr>
               <w:bidi/>
               <w:spacing w:after="0" w:line="252" w:lineRule="auto"/>
-              <w:jc w:val="right"/>
             </w:pPr>
             <w:r>
               <w:rPr>
                 <w:noProof/>
-                <w:sz w:val="16"/>
               </w:rPr>
               <w:t>ServiceRequest</w:t>
             </w:r>
@@ -12874,12 +12206,10 @@
             <w:pPr>
               <w:bidi/>
               <w:spacing w:after="0" w:line="252" w:lineRule="auto"/>
-              <w:jc w:val="right"/>
             </w:pPr>
             <w:r>
               <w:rPr>
                 <w:noProof/>
-                <w:sz w:val="16"/>
               </w:rPr>
               <w:t>WorkerTaskDispatch</w:t>
             </w:r>
@@ -12978,12 +12308,10 @@
             <w:pPr>
               <w:bidi/>
               <w:spacing w:after="0" w:line="252" w:lineRule="auto"/>
-              <w:jc w:val="right"/>
             </w:pPr>
             <w:r>
               <w:rPr>
                 <w:noProof/>
-                <w:sz w:val="16"/>
               </w:rPr>
               <w:t>CollectionVisit</w:t>
             </w:r>
@@ -13082,12 +12410,10 @@
             <w:pPr>
               <w:bidi/>
               <w:spacing w:after="0" w:line="252" w:lineRule="auto"/>
-              <w:jc w:val="right"/>
             </w:pPr>
             <w:r>
               <w:rPr>
                 <w:noProof/>
-                <w:sz w:val="16"/>
               </w:rPr>
               <w:t>StoreOrder</w:t>
             </w:r>
@@ -13186,12 +12512,10 @@
             <w:pPr>
               <w:bidi/>
               <w:spacing w:after="0" w:line="252" w:lineRule="auto"/>
-              <w:jc w:val="right"/>
             </w:pPr>
             <w:r>
               <w:rPr>
                 <w:noProof/>
-                <w:sz w:val="16"/>
               </w:rPr>
               <w:t>PartnerDelivery</w:t>
             </w:r>
@@ -13290,12 +12614,10 @@
             <w:pPr>
               <w:bidi/>
               <w:spacing w:after="0" w:line="252" w:lineRule="auto"/>
-              <w:jc w:val="right"/>
             </w:pPr>
             <w:r>
               <w:rPr>
                 <w:noProof/>
-                <w:sz w:val="16"/>
               </w:rPr>
               <w:t>IncidentReport</w:t>
             </w:r>
@@ -13383,92 +12705,18 @@
       <w:r>
         <w:rPr>
           <w:b/>
-          <w:color w:val="203A43"/>
-          <w:sz w:val="24"/>
-          <w:rtl/>
-        </w:rPr>
-        <w:t xml:space="preserve">10 1 1 مخطط آلة الحالة المحددة لطلبات الخدمة </w:t>
+          <w:sz w:val="22"/>
+          <w:rtl/>
+        </w:rPr>
+        <w:t xml:space="preserve">10.1.1 مخطط آلة الحالة المحددة لطلبات الخدمة </w:t>
       </w:r>
       <w:r>
         <w:rPr>
           <w:b/>
           <w:noProof/>
-          <w:color w:val="203A43"/>
-          <w:sz w:val="24"/>
-        </w:rPr>
-        <w:t>(Service</w:t>
-      </w:r>
-      <w:r>
-        <w:rPr>
-          <w:b/>
-          <w:color w:val="203A43"/>
-          <w:sz w:val="24"/>
-          <w:rtl/>
-        </w:rPr>
-        <w:t> </w:t>
-      </w:r>
-      <w:r>
-        <w:rPr>
-          <w:b/>
-          <w:noProof/>
-          <w:color w:val="203A43"/>
-          <w:sz w:val="24"/>
-        </w:rPr>
-        <w:t>Request</w:t>
-      </w:r>
-      <w:r>
-        <w:rPr>
-          <w:b/>
-          <w:color w:val="203A43"/>
-          <w:sz w:val="24"/>
-          <w:rtl/>
-        </w:rPr>
-        <w:t> </w:t>
-      </w:r>
-      <w:r>
-        <w:rPr>
-          <w:b/>
-          <w:noProof/>
-          <w:color w:val="203A43"/>
-          <w:sz w:val="24"/>
-        </w:rPr>
-        <w:t>Finite</w:t>
-      </w:r>
-      <w:r>
-        <w:rPr>
-          <w:b/>
-          <w:color w:val="203A43"/>
-          <w:sz w:val="24"/>
-          <w:rtl/>
-        </w:rPr>
-        <w:t> </w:t>
-      </w:r>
-      <w:r>
-        <w:rPr>
-          <w:b/>
-          <w:noProof/>
-          <w:color w:val="203A43"/>
-          <w:sz w:val="24"/>
-        </w:rPr>
-        <w:t>State</w:t>
-      </w:r>
-      <w:r>
-        <w:rPr>
-          <w:b/>
-          <w:color w:val="203A43"/>
-          <w:sz w:val="24"/>
-          <w:rtl/>
-        </w:rPr>
-        <w:t> </w:t>
-      </w:r>
-      <w:r>
-        <w:rPr>
-          <w:b/>
-          <w:noProof/>
-          <w:color w:val="203A43"/>
-          <w:sz w:val="24"/>
-        </w:rPr>
-        <w:t>Machine)</w:t>
+          <w:sz w:val="22"/>
+        </w:rPr>
+        <w:t>(Service Request Finite State Machine)</w:t>
       </w:r>
     </w:p>
     <w:p>
@@ -13481,10 +12729,10 @@
           <w:noProof/>
         </w:rPr>
         <w:drawing>
-          <wp:inline distT="0" distB="0" distL="0" distR="0" wp14:anchorId="66C9DCC6" wp14:editId="69277BCF">
-            <wp:extent cx="5943600" cy="2932176"/>
+          <wp:inline distT="0" distB="0" distL="0" distR="0" wp14:anchorId="7505481F" wp14:editId="66ACCC57">
+            <wp:extent cx="4206240" cy="6557776"/>
             <wp:effectExtent l="0" t="0" r="0" b="0"/>
-            <wp:docPr id="5" name="Picture 5"/>
+            <wp:docPr id="20" name="Picture 20"/>
             <wp:cNvGraphicFramePr>
               <a:graphicFrameLocks xmlns:a="http://schemas.openxmlformats.org/drawingml/2006/main" noChangeAspect="1"/>
             </wp:cNvGraphicFramePr>
@@ -13492,11 +12740,11 @@
               <a:graphicData uri="http://schemas.openxmlformats.org/drawingml/2006/picture">
                 <pic:pic xmlns:pic="http://schemas.openxmlformats.org/drawingml/2006/picture">
                   <pic:nvPicPr>
-                    <pic:cNvPr id="0" name="image5.png"/>
+                    <pic:cNvPr id="0" name="image.png"/>
                     <pic:cNvPicPr/>
                   </pic:nvPicPr>
                   <pic:blipFill>
-                    <a:blip r:embed="rId23"/>
+                    <a:blip r:embed="rId13"/>
                     <a:stretch>
                       <a:fillRect/>
                     </a:stretch>
@@ -13504,7 +12752,7 @@
                   <pic:spPr>
                     <a:xfrm>
                       <a:off x="0" y="0"/>
-                      <a:ext cx="5943600" cy="2932176"/>
+                      <a:ext cx="4206240" cy="6557776"/>
                     </a:xfrm>
                     <a:prstGeom prst="rect">
                       <a:avLst/>
@@ -14165,12 +13413,10 @@
             <w:pPr>
               <w:bidi/>
               <w:spacing w:after="0" w:line="252" w:lineRule="auto"/>
-              <w:jc w:val="right"/>
             </w:pPr>
             <w:r>
               <w:rPr>
                 <w:noProof/>
-                <w:sz w:val="16"/>
               </w:rPr>
               <w:t>task_id + visit_reference</w:t>
             </w:r>
@@ -14373,12 +13619,10 @@
             <w:pPr>
               <w:bidi/>
               <w:spacing w:after="0" w:line="252" w:lineRule="auto"/>
-              <w:jc w:val="right"/>
             </w:pPr>
             <w:r>
               <w:rPr>
                 <w:noProof/>
-                <w:sz w:val="16"/>
               </w:rPr>
               <w:t>buyer_id + idempotency_key</w:t>
             </w:r>
@@ -14477,12 +13721,10 @@
             <w:pPr>
               <w:bidi/>
               <w:spacing w:after="0" w:line="252" w:lineRule="auto"/>
-              <w:jc w:val="right"/>
             </w:pPr>
             <w:r>
               <w:rPr>
                 <w:noProof/>
-                <w:sz w:val="16"/>
               </w:rPr>
               <w:t>provider + transfer_ref + amount</w:t>
             </w:r>
@@ -14581,12 +13823,10 @@
             <w:pPr>
               <w:bidi/>
               <w:spacing w:after="0" w:line="252" w:lineRule="auto"/>
-              <w:jc w:val="right"/>
             </w:pPr>
             <w:r>
               <w:rPr>
                 <w:noProof/>
-                <w:sz w:val="16"/>
               </w:rPr>
               <w:t>order_id + release_revision</w:t>
             </w:r>
@@ -14646,7 +13886,7 @@
       </w:r>
     </w:p>
     <w:sectPr>
-      <w:footerReference w:type="default" r:id="rId24"/>
+      <w:footerReference w:type="default" r:id="rId14"/>
       <w:pgSz w:w="11909" w:h="16834"/>
       <w:pgMar w:top="1080" w:right="1008" w:bottom="1440" w:left="1008" w:header="720" w:footer="504" w:gutter="0"/>
       <w:cols w:space="720"/>
@@ -26314,6 +25554,29 @@
       </w:tcPr>
     </w:tblStylePr>
   </w:style>
+  <w:style w:type="character" w:styleId="Hyperlink">
+    <w:name w:val="Hyperlink"/>
+    <w:basedOn w:val="a2"/>
+    <w:uiPriority w:val="99"/>
+    <w:unhideWhenUsed/>
+    <w:rsid w:val="00BB07EC"/>
+    <w:rPr>
+      <w:color w:val="0000FF" w:themeColor="hyperlink"/>
+      <w:u w:val="single"/>
+    </w:rPr>
+  </w:style>
+  <w:style w:type="character" w:styleId="aff2">
+    <w:name w:val="Unresolved Mention"/>
+    <w:basedOn w:val="a2"/>
+    <w:uiPriority w:val="99"/>
+    <w:semiHidden/>
+    <w:unhideWhenUsed/>
+    <w:rsid w:val="00BB07EC"/>
+    <w:rPr>
+      <w:color w:val="605E5C"/>
+      <w:shd w:val="clear" w:color="auto" w:fill="E1DFDD"/>
+    </w:rPr>
+  </w:style>
 </w:styles>
 </file>
 

</xml_diff>